<commit_message>
docs: atualizacao de requisitos nao funcionais
</commit_message>
<xml_diff>
--- a/ApêndiceB-Requisitos/PID_RequisitosNãoFuncionais.docx
+++ b/ApêndiceB-Requisitos/PID_RequisitosNãoFuncionais.docx
@@ -1,6 +1,6 @@
 
 <file path=word/document.xml><?xml version="1.0" encoding="utf-8"?>
-<w:document xmlns:wpc="http://schemas.microsoft.com/office/word/2010/wordprocessingCanvas" xmlns:mc="http://schemas.openxmlformats.org/markup-compatibility/2006" xmlns:o="urn:schemas-microsoft-com:office:office" xmlns:r="http://schemas.openxmlformats.org/officeDocument/2006/relationships" xmlns:m="http://schemas.openxmlformats.org/officeDocument/2006/math" xmlns:v="urn:schemas-microsoft-com:vml" xmlns:wp14="http://schemas.microsoft.com/office/word/2010/wordprocessingDrawing" xmlns:wp="http://schemas.openxmlformats.org/drawingml/2006/wordprocessingDrawing" xmlns:w10="urn:schemas-microsoft-com:office:word" xmlns:w="http://schemas.openxmlformats.org/wordprocessingml/2006/main" xmlns:w14="http://schemas.microsoft.com/office/word/2010/wordml" xmlns:w15="http://schemas.microsoft.com/office/word/2012/wordml" xmlns:wpg="http://schemas.microsoft.com/office/word/2010/wordprocessingGroup" xmlns:wpi="http://schemas.microsoft.com/office/word/2010/wordprocessingInk" xmlns:wne="http://schemas.microsoft.com/office/word/2006/wordml" xmlns:wps="http://schemas.microsoft.com/office/word/2010/wordprocessingShape" mc:Ignorable="w14 w15 wp14">
+<w:document xmlns:wpc="http://schemas.microsoft.com/office/word/2010/wordprocessingCanvas" xmlns:mc="http://schemas.openxmlformats.org/markup-compatibility/2006" xmlns:o="urn:schemas-microsoft-com:office:office" xmlns:r="http://schemas.openxmlformats.org/officeDocument/2006/relationships" xmlns:m="http://schemas.openxmlformats.org/officeDocument/2006/math" xmlns:v="urn:schemas-microsoft-com:vml" xmlns:wp14="http://schemas.microsoft.com/office/word/2010/wordprocessingDrawing" xmlns:wp="http://schemas.openxmlformats.org/drawingml/2006/wordprocessingDrawing" xmlns:w10="urn:schemas-microsoft-com:office:word" xmlns:w="http://schemas.openxmlformats.org/wordprocessingml/2006/main" xmlns:w14="http://schemas.microsoft.com/office/word/2010/wordml" xmlns:wpg="http://schemas.microsoft.com/office/word/2010/wordprocessingGroup" xmlns:wpi="http://schemas.microsoft.com/office/word/2010/wordprocessingInk" xmlns:wne="http://schemas.microsoft.com/office/word/2006/wordml" xmlns:wps="http://schemas.microsoft.com/office/word/2010/wordprocessingShape" mc:Ignorable="w14 wp14">
   <w:body>
     <w:p>
       <w:pPr>
@@ -422,6 +422,7 @@
     </w:p>
     <w:p>
       <w:pPr>
+        <w:jc w:val="both"/>
         <w:rPr>
           <w:rFonts w:ascii="Times New Roman" w:hAnsi="Times New Roman" w:cs="Times New Roman"/>
           <w:sz w:val="24"/>
@@ -442,7 +443,18 @@
           <w:sz w:val="24"/>
           <w:szCs w:val="24"/>
         </w:rPr>
-        <w:t>A interface deve ser simples e intuitiva.</w:t>
+        <w:t xml:space="preserve">O sistema deve possuir interface simples e intuitiva, permitindo que usuários realizem tarefas principais </w:t>
+      </w:r>
+      <w:r>
+        <w:rPr>
+          <w:rFonts w:ascii="Times New Roman" w:hAnsi="Times New Roman" w:cs="Times New Roman"/>
+          <w:sz w:val="24"/>
+          <w:szCs w:val="24"/>
+        </w:rPr>
+        <w:t>com facilidade</w:t>
+      </w:r>
+      <w:r>
+        <w:t>.</w:t>
       </w:r>
     </w:p>
     <w:p>
@@ -457,6 +469,38 @@
     </w:p>
     <w:p>
       <w:pPr>
+        <w:pStyle w:val="Ttulo3"/>
+        <w:rPr>
+          <w:rFonts w:ascii="Times New Roman" w:hAnsi="Times New Roman" w:cs="Times New Roman"/>
+          <w:color w:val="auto"/>
+        </w:rPr>
+      </w:pPr>
+      <w:r>
+        <w:rPr>
+          <w:rFonts w:ascii="Times New Roman" w:hAnsi="Times New Roman" w:cs="Times New Roman"/>
+          <w:color w:val="auto"/>
+        </w:rPr>
+        <w:t>1.2 Acessi</w:t>
+      </w:r>
+      <w:r>
+        <w:rPr>
+          <w:rFonts w:ascii="Times New Roman" w:hAnsi="Times New Roman" w:cs="Times New Roman"/>
+          <w:color w:val="auto"/>
+        </w:rPr>
+        <w:t>bilidade</w:t>
+      </w:r>
+    </w:p>
+    <w:p>
+      <w:pPr>
+        <w:rPr>
+          <w:rFonts w:ascii="Times New Roman" w:hAnsi="Times New Roman" w:cs="Times New Roman"/>
+          <w:sz w:val="24"/>
+          <w:szCs w:val="24"/>
+        </w:rPr>
+      </w:pPr>
+    </w:p>
+    <w:p>
+      <w:pPr>
         <w:rPr>
           <w:rFonts w:ascii="Times New Roman" w:hAnsi="Times New Roman" w:cs="Times New Roman"/>
           <w:sz w:val="24"/>
@@ -502,23 +546,7 @@
           <w:sz w:val="24"/>
           <w:szCs w:val="24"/>
         </w:rPr>
-        <w:t xml:space="preserve"> </w:t>
-      </w:r>
-      <w:r>
-        <w:rPr>
-          <w:rFonts w:ascii="Times New Roman" w:hAnsi="Times New Roman" w:cs="Times New Roman"/>
-          <w:sz w:val="24"/>
-          <w:szCs w:val="24"/>
-        </w:rPr>
-        <w:t>O sistema deve possuir boa legibilidade, com fontes adequadas e navegação simples</w:t>
-      </w:r>
-      <w:r>
-        <w:rPr>
-          <w:rFonts w:ascii="Times New Roman" w:hAnsi="Times New Roman" w:cs="Times New Roman"/>
-          <w:sz w:val="24"/>
-          <w:szCs w:val="24"/>
-        </w:rPr>
-        <w:t>.</w:t>
+        <w:t xml:space="preserve"> O sistema deve possuir boa legibilidade, com fontes adequadas e navegação simples.</w:t>
       </w:r>
     </w:p>
     <w:p>
@@ -544,7 +572,14 @@
           <w:rFonts w:ascii="Times New Roman" w:hAnsi="Times New Roman" w:cs="Times New Roman"/>
           <w:color w:val="auto"/>
         </w:rPr>
-        <w:t>1.2 Eficiência</w:t>
+        <w:t>1.3</w:t>
+      </w:r>
+      <w:r>
+        <w:rPr>
+          <w:rFonts w:ascii="Times New Roman" w:hAnsi="Times New Roman" w:cs="Times New Roman"/>
+          <w:color w:val="auto"/>
+        </w:rPr>
+        <w:t xml:space="preserve"> Eficiência</w:t>
       </w:r>
       <w:bookmarkEnd w:id="2"/>
     </w:p>
@@ -610,31 +645,7 @@
           <w:sz w:val="24"/>
           <w:szCs w:val="24"/>
         </w:rPr>
-        <w:t xml:space="preserve"> sistema deve r</w:t>
-      </w:r>
-      <w:r>
-        <w:rPr>
-          <w:rFonts w:ascii="Times New Roman" w:hAnsi="Times New Roman" w:cs="Times New Roman"/>
-          <w:sz w:val="24"/>
-          <w:szCs w:val="24"/>
-        </w:rPr>
-        <w:t>esponder às requisições em até 5</w:t>
-      </w:r>
-      <w:r>
-        <w:rPr>
-          <w:rFonts w:ascii="Times New Roman" w:hAnsi="Times New Roman" w:cs="Times New Roman"/>
-          <w:sz w:val="24"/>
-          <w:szCs w:val="24"/>
-        </w:rPr>
-        <w:t xml:space="preserve"> segundos</w:t>
-      </w:r>
-      <w:r>
-        <w:rPr>
-          <w:rFonts w:ascii="Times New Roman" w:hAnsi="Times New Roman" w:cs="Times New Roman"/>
-          <w:sz w:val="24"/>
-          <w:szCs w:val="24"/>
-        </w:rPr>
-        <w:t>.</w:t>
+        <w:t xml:space="preserve"> sistema deve responder às requisições em até 5 segundos.</w:t>
       </w:r>
     </w:p>
     <w:p>
@@ -662,7 +673,14 @@
           <w:rFonts w:ascii="Times New Roman" w:hAnsi="Times New Roman" w:cs="Times New Roman"/>
           <w:color w:val="auto"/>
         </w:rPr>
-        <w:t>1.3 Confiabilidade</w:t>
+        <w:t>1.4</w:t>
+      </w:r>
+      <w:r>
+        <w:rPr>
+          <w:rFonts w:ascii="Times New Roman" w:hAnsi="Times New Roman" w:cs="Times New Roman"/>
+          <w:color w:val="auto"/>
+        </w:rPr>
+        <w:t xml:space="preserve"> Confiabilidade</w:t>
       </w:r>
       <w:bookmarkEnd w:id="3"/>
     </w:p>
@@ -698,29 +716,7 @@
         <w:t xml:space="preserve"> – </w:t>
       </w:r>
       <w:r>
-        <w:rPr>
-          <w:rFonts w:ascii="Times New Roman" w:hAnsi="Times New Roman" w:cs="Times New Roman"/>
-          <w:sz w:val="24"/>
-          <w:szCs w:val="24"/>
-        </w:rPr>
-        <w:t>Acessibilidade</w:t>
-      </w:r>
-    </w:p>
-    <w:p>
-      <w:pPr>
-        <w:rPr>
-          <w:rFonts w:ascii="Times New Roman" w:hAnsi="Times New Roman" w:cs="Times New Roman"/>
-          <w:sz w:val="24"/>
-          <w:szCs w:val="24"/>
-        </w:rPr>
-      </w:pPr>
-      <w:r>
-        <w:rPr>
-          <w:rFonts w:ascii="Times New Roman" w:hAnsi="Times New Roman" w:cs="Times New Roman"/>
-          <w:sz w:val="24"/>
-          <w:szCs w:val="24"/>
-        </w:rPr>
-        <w:t>Descrição: O sistema deve garantir que as operações sejam realizadas corretamente, sem perda de dados.</w:t>
+        <w:t>Confiabilidade</w:t>
       </w:r>
     </w:p>
     <w:p>
@@ -732,6 +728,14 @@
           <w:lang w:eastAsia="pt-BR"/>
         </w:rPr>
       </w:pPr>
+      <w:r>
+        <w:rPr>
+          <w:rFonts w:ascii="Times New Roman" w:hAnsi="Times New Roman" w:cs="Times New Roman"/>
+          <w:sz w:val="24"/>
+          <w:szCs w:val="24"/>
+        </w:rPr>
+        <w:t>O sistema deve garantir que as operações sejam realizadas corretamente, sem perda de dados.</w:t>
+      </w:r>
     </w:p>
     <w:p>
       <w:pPr>
@@ -747,6 +751,7 @@
           <w:rFonts w:ascii="Times New Roman" w:hAnsi="Times New Roman" w:cs="Times New Roman"/>
           <w:color w:val="auto"/>
         </w:rPr>
+        <w:lastRenderedPageBreak/>
         <w:t>1.4 Portabilidade</w:t>
       </w:r>
       <w:bookmarkEnd w:id="4"/>
@@ -772,11 +777,8 @@
           <w:sz w:val="24"/>
           <w:szCs w:val="24"/>
         </w:rPr>
-        <w:lastRenderedPageBreak/>
         <w:t>RNF 5</w:t>
       </w:r>
-      <w:bookmarkStart w:id="5" w:name="_GoBack"/>
-      <w:bookmarkEnd w:id="5"/>
       <w:r>
         <w:rPr>
           <w:rFonts w:ascii="Times New Roman" w:hAnsi="Times New Roman" w:cs="Times New Roman"/>
@@ -858,7 +860,8 @@
           <w:szCs w:val="24"/>
         </w:rPr>
       </w:pPr>
-      <w:bookmarkStart w:id="6" w:name="_Toc98916005"/>
+      <w:bookmarkStart w:id="5" w:name="_Toc98916005"/>
+      <w:bookmarkStart w:id="6" w:name="_GoBack"/>
       <w:r>
         <w:rPr>
           <w:rFonts w:ascii="Times New Roman" w:hAnsi="Times New Roman" w:cs="Times New Roman"/>
@@ -879,7 +882,7 @@
         </w:rPr>
         <w:t>Organizacional</w:t>
       </w:r>
-      <w:bookmarkEnd w:id="6"/>
+      <w:bookmarkEnd w:id="5"/>
     </w:p>
     <w:p>
       <w:pPr>
@@ -1102,6 +1105,7 @@
       </w:r>
       <w:bookmarkEnd w:id="13"/>
     </w:p>
+    <w:bookmarkEnd w:id="6"/>
     <w:p>
       <w:pPr>
         <w:rPr>
@@ -1195,12 +1199,12 @@
       </w:pPr>
     </w:p>
     <w:sectPr>
-      <w:headerReference w:type="even" r:id="rId6"/>
-      <w:headerReference w:type="default" r:id="rId7"/>
-      <w:footerReference w:type="even" r:id="rId8"/>
-      <w:footerReference w:type="default" r:id="rId9"/>
-      <w:headerReference w:type="first" r:id="rId10"/>
-      <w:footerReference w:type="first" r:id="rId11"/>
+      <w:headerReference w:type="even" r:id="rId7"/>
+      <w:headerReference w:type="default" r:id="rId8"/>
+      <w:footerReference w:type="even" r:id="rId9"/>
+      <w:footerReference w:type="default" r:id="rId10"/>
+      <w:headerReference w:type="first" r:id="rId11"/>
+      <w:footerReference w:type="first" r:id="rId12"/>
       <w:pgSz w:w="11906" w:h="16838"/>
       <w:pgMar w:top="1417" w:right="1701" w:bottom="1417" w:left="1701" w:header="708" w:footer="708" w:gutter="0"/>
       <w:cols w:space="708"/>
@@ -1211,7 +1215,7 @@
 </file>
 
 <file path=word/endnotes.xml><?xml version="1.0" encoding="utf-8"?>
-<w:endnotes xmlns:wpc="http://schemas.microsoft.com/office/word/2010/wordprocessingCanvas" xmlns:mc="http://schemas.openxmlformats.org/markup-compatibility/2006" xmlns:o="urn:schemas-microsoft-com:office:office" xmlns:r="http://schemas.openxmlformats.org/officeDocument/2006/relationships" xmlns:m="http://schemas.openxmlformats.org/officeDocument/2006/math" xmlns:v="urn:schemas-microsoft-com:vml" xmlns:wp14="http://schemas.microsoft.com/office/word/2010/wordprocessingDrawing" xmlns:wp="http://schemas.openxmlformats.org/drawingml/2006/wordprocessingDrawing" xmlns:w10="urn:schemas-microsoft-com:office:word" xmlns:w="http://schemas.openxmlformats.org/wordprocessingml/2006/main" xmlns:w14="http://schemas.microsoft.com/office/word/2010/wordml" xmlns:w15="http://schemas.microsoft.com/office/word/2012/wordml" xmlns:wpg="http://schemas.microsoft.com/office/word/2010/wordprocessingGroup" xmlns:wpi="http://schemas.microsoft.com/office/word/2010/wordprocessingInk" xmlns:wne="http://schemas.microsoft.com/office/word/2006/wordml" xmlns:wps="http://schemas.microsoft.com/office/word/2010/wordprocessingShape" mc:Ignorable="w14 w15 wp14">
+<w:endnotes xmlns:wpc="http://schemas.microsoft.com/office/word/2010/wordprocessingCanvas" xmlns:mc="http://schemas.openxmlformats.org/markup-compatibility/2006" xmlns:o="urn:schemas-microsoft-com:office:office" xmlns:r="http://schemas.openxmlformats.org/officeDocument/2006/relationships" xmlns:m="http://schemas.openxmlformats.org/officeDocument/2006/math" xmlns:v="urn:schemas-microsoft-com:vml" xmlns:wp14="http://schemas.microsoft.com/office/word/2010/wordprocessingDrawing" xmlns:wp="http://schemas.openxmlformats.org/drawingml/2006/wordprocessingDrawing" xmlns:w10="urn:schemas-microsoft-com:office:word" xmlns:w="http://schemas.openxmlformats.org/wordprocessingml/2006/main" xmlns:w14="http://schemas.microsoft.com/office/word/2010/wordml" xmlns:wpg="http://schemas.microsoft.com/office/word/2010/wordprocessingGroup" xmlns:wpi="http://schemas.microsoft.com/office/word/2010/wordprocessingInk" xmlns:wne="http://schemas.microsoft.com/office/word/2006/wordml" xmlns:wps="http://schemas.microsoft.com/office/word/2010/wordprocessingShape" mc:Ignorable="w14 wp14">
   <w:endnote w:type="separator" w:id="-1">
     <w:p>
       <w:pPr>
@@ -1236,7 +1240,7 @@
 </file>
 
 <file path=word/footer1.xml><?xml version="1.0" encoding="utf-8"?>
-<w:ftr xmlns:wpc="http://schemas.microsoft.com/office/word/2010/wordprocessingCanvas" xmlns:mc="http://schemas.openxmlformats.org/markup-compatibility/2006" xmlns:o="urn:schemas-microsoft-com:office:office" xmlns:r="http://schemas.openxmlformats.org/officeDocument/2006/relationships" xmlns:m="http://schemas.openxmlformats.org/officeDocument/2006/math" xmlns:v="urn:schemas-microsoft-com:vml" xmlns:wp14="http://schemas.microsoft.com/office/word/2010/wordprocessingDrawing" xmlns:wp="http://schemas.openxmlformats.org/drawingml/2006/wordprocessingDrawing" xmlns:w10="urn:schemas-microsoft-com:office:word" xmlns:w="http://schemas.openxmlformats.org/wordprocessingml/2006/main" xmlns:w14="http://schemas.microsoft.com/office/word/2010/wordml" xmlns:w15="http://schemas.microsoft.com/office/word/2012/wordml" xmlns:wpg="http://schemas.microsoft.com/office/word/2010/wordprocessingGroup" xmlns:wpi="http://schemas.microsoft.com/office/word/2010/wordprocessingInk" xmlns:wne="http://schemas.microsoft.com/office/word/2006/wordml" xmlns:wps="http://schemas.microsoft.com/office/word/2010/wordprocessingShape" mc:Ignorable="w14 w15 wp14">
+<w:ftr xmlns:wpc="http://schemas.microsoft.com/office/word/2010/wordprocessingCanvas" xmlns:mc="http://schemas.openxmlformats.org/markup-compatibility/2006" xmlns:o="urn:schemas-microsoft-com:office:office" xmlns:r="http://schemas.openxmlformats.org/officeDocument/2006/relationships" xmlns:m="http://schemas.openxmlformats.org/officeDocument/2006/math" xmlns:v="urn:schemas-microsoft-com:vml" xmlns:wp14="http://schemas.microsoft.com/office/word/2010/wordprocessingDrawing" xmlns:wp="http://schemas.openxmlformats.org/drawingml/2006/wordprocessingDrawing" xmlns:w10="urn:schemas-microsoft-com:office:word" xmlns:w="http://schemas.openxmlformats.org/wordprocessingml/2006/main" xmlns:w14="http://schemas.microsoft.com/office/word/2010/wordml" xmlns:wpg="http://schemas.microsoft.com/office/word/2010/wordprocessingGroup" xmlns:wpi="http://schemas.microsoft.com/office/word/2010/wordprocessingInk" xmlns:wne="http://schemas.microsoft.com/office/word/2006/wordml" xmlns:wps="http://schemas.microsoft.com/office/word/2010/wordprocessingShape" mc:Ignorable="w14 wp14">
   <w:p>
     <w:pPr>
       <w:pStyle w:val="Rodap"/>
@@ -1246,7 +1250,7 @@
 </file>
 
 <file path=word/footer2.xml><?xml version="1.0" encoding="utf-8"?>
-<w:ftr xmlns:wpc="http://schemas.microsoft.com/office/word/2010/wordprocessingCanvas" xmlns:mc="http://schemas.openxmlformats.org/markup-compatibility/2006" xmlns:o="urn:schemas-microsoft-com:office:office" xmlns:r="http://schemas.openxmlformats.org/officeDocument/2006/relationships" xmlns:m="http://schemas.openxmlformats.org/officeDocument/2006/math" xmlns:v="urn:schemas-microsoft-com:vml" xmlns:wp14="http://schemas.microsoft.com/office/word/2010/wordprocessingDrawing" xmlns:wp="http://schemas.openxmlformats.org/drawingml/2006/wordprocessingDrawing" xmlns:w10="urn:schemas-microsoft-com:office:word" xmlns:w="http://schemas.openxmlformats.org/wordprocessingml/2006/main" xmlns:w14="http://schemas.microsoft.com/office/word/2010/wordml" xmlns:w15="http://schemas.microsoft.com/office/word/2012/wordml" xmlns:wpg="http://schemas.microsoft.com/office/word/2010/wordprocessingGroup" xmlns:wpi="http://schemas.microsoft.com/office/word/2010/wordprocessingInk" xmlns:wne="http://schemas.microsoft.com/office/word/2006/wordml" xmlns:wps="http://schemas.microsoft.com/office/word/2010/wordprocessingShape" mc:Ignorable="w14 w15 wp14">
+<w:ftr xmlns:wpc="http://schemas.microsoft.com/office/word/2010/wordprocessingCanvas" xmlns:mc="http://schemas.openxmlformats.org/markup-compatibility/2006" xmlns:o="urn:schemas-microsoft-com:office:office" xmlns:r="http://schemas.openxmlformats.org/officeDocument/2006/relationships" xmlns:m="http://schemas.openxmlformats.org/officeDocument/2006/math" xmlns:v="urn:schemas-microsoft-com:vml" xmlns:wp14="http://schemas.microsoft.com/office/word/2010/wordprocessingDrawing" xmlns:wp="http://schemas.openxmlformats.org/drawingml/2006/wordprocessingDrawing" xmlns:w10="urn:schemas-microsoft-com:office:word" xmlns:w="http://schemas.openxmlformats.org/wordprocessingml/2006/main" xmlns:w14="http://schemas.microsoft.com/office/word/2010/wordml" xmlns:wpg="http://schemas.microsoft.com/office/word/2010/wordprocessingGroup" xmlns:wpi="http://schemas.microsoft.com/office/word/2010/wordprocessingInk" xmlns:wne="http://schemas.microsoft.com/office/word/2006/wordml" xmlns:wps="http://schemas.microsoft.com/office/word/2010/wordprocessingShape" mc:Ignorable="w14 wp14">
   <w:p>
     <w:pPr>
       <w:pStyle w:val="Rodap"/>
@@ -1296,7 +1300,7 @@
         <w:sz w:val="20"/>
         <w:szCs w:val="20"/>
       </w:rPr>
-      <w:t>3</w:t>
+      <w:t>2</w:t>
     </w:r>
     <w:r>
       <w:rPr>
@@ -1360,7 +1364,7 @@
 </file>
 
 <file path=word/footer3.xml><?xml version="1.0" encoding="utf-8"?>
-<w:ftr xmlns:wpc="http://schemas.microsoft.com/office/word/2010/wordprocessingCanvas" xmlns:mc="http://schemas.openxmlformats.org/markup-compatibility/2006" xmlns:o="urn:schemas-microsoft-com:office:office" xmlns:r="http://schemas.openxmlformats.org/officeDocument/2006/relationships" xmlns:m="http://schemas.openxmlformats.org/officeDocument/2006/math" xmlns:v="urn:schemas-microsoft-com:vml" xmlns:wp14="http://schemas.microsoft.com/office/word/2010/wordprocessingDrawing" xmlns:wp="http://schemas.openxmlformats.org/drawingml/2006/wordprocessingDrawing" xmlns:w10="urn:schemas-microsoft-com:office:word" xmlns:w="http://schemas.openxmlformats.org/wordprocessingml/2006/main" xmlns:w14="http://schemas.microsoft.com/office/word/2010/wordml" xmlns:w15="http://schemas.microsoft.com/office/word/2012/wordml" xmlns:wpg="http://schemas.microsoft.com/office/word/2010/wordprocessingGroup" xmlns:wpi="http://schemas.microsoft.com/office/word/2010/wordprocessingInk" xmlns:wne="http://schemas.microsoft.com/office/word/2006/wordml" xmlns:wps="http://schemas.microsoft.com/office/word/2010/wordprocessingShape" mc:Ignorable="w14 w15 wp14">
+<w:ftr xmlns:wpc="http://schemas.microsoft.com/office/word/2010/wordprocessingCanvas" xmlns:mc="http://schemas.openxmlformats.org/markup-compatibility/2006" xmlns:o="urn:schemas-microsoft-com:office:office" xmlns:r="http://schemas.openxmlformats.org/officeDocument/2006/relationships" xmlns:m="http://schemas.openxmlformats.org/officeDocument/2006/math" xmlns:v="urn:schemas-microsoft-com:vml" xmlns:wp14="http://schemas.microsoft.com/office/word/2010/wordprocessingDrawing" xmlns:wp="http://schemas.openxmlformats.org/drawingml/2006/wordprocessingDrawing" xmlns:w10="urn:schemas-microsoft-com:office:word" xmlns:w="http://schemas.openxmlformats.org/wordprocessingml/2006/main" xmlns:w14="http://schemas.microsoft.com/office/word/2010/wordml" xmlns:wpg="http://schemas.microsoft.com/office/word/2010/wordprocessingGroup" xmlns:wpi="http://schemas.microsoft.com/office/word/2010/wordprocessingInk" xmlns:wne="http://schemas.microsoft.com/office/word/2006/wordml" xmlns:wps="http://schemas.microsoft.com/office/word/2010/wordprocessingShape" mc:Ignorable="w14 wp14">
   <w:p>
     <w:pPr>
       <w:pStyle w:val="Rodap"/>
@@ -1370,7 +1374,7 @@
 </file>
 
 <file path=word/footnotes.xml><?xml version="1.0" encoding="utf-8"?>
-<w:footnotes xmlns:wpc="http://schemas.microsoft.com/office/word/2010/wordprocessingCanvas" xmlns:mc="http://schemas.openxmlformats.org/markup-compatibility/2006" xmlns:o="urn:schemas-microsoft-com:office:office" xmlns:r="http://schemas.openxmlformats.org/officeDocument/2006/relationships" xmlns:m="http://schemas.openxmlformats.org/officeDocument/2006/math" xmlns:v="urn:schemas-microsoft-com:vml" xmlns:wp14="http://schemas.microsoft.com/office/word/2010/wordprocessingDrawing" xmlns:wp="http://schemas.openxmlformats.org/drawingml/2006/wordprocessingDrawing" xmlns:w10="urn:schemas-microsoft-com:office:word" xmlns:w="http://schemas.openxmlformats.org/wordprocessingml/2006/main" xmlns:w14="http://schemas.microsoft.com/office/word/2010/wordml" xmlns:w15="http://schemas.microsoft.com/office/word/2012/wordml" xmlns:wpg="http://schemas.microsoft.com/office/word/2010/wordprocessingGroup" xmlns:wpi="http://schemas.microsoft.com/office/word/2010/wordprocessingInk" xmlns:wne="http://schemas.microsoft.com/office/word/2006/wordml" xmlns:wps="http://schemas.microsoft.com/office/word/2010/wordprocessingShape" mc:Ignorable="w14 w15 wp14">
+<w:footnotes xmlns:wpc="http://schemas.microsoft.com/office/word/2010/wordprocessingCanvas" xmlns:mc="http://schemas.openxmlformats.org/markup-compatibility/2006" xmlns:o="urn:schemas-microsoft-com:office:office" xmlns:r="http://schemas.openxmlformats.org/officeDocument/2006/relationships" xmlns:m="http://schemas.openxmlformats.org/officeDocument/2006/math" xmlns:v="urn:schemas-microsoft-com:vml" xmlns:wp14="http://schemas.microsoft.com/office/word/2010/wordprocessingDrawing" xmlns:wp="http://schemas.openxmlformats.org/drawingml/2006/wordprocessingDrawing" xmlns:w10="urn:schemas-microsoft-com:office:word" xmlns:w="http://schemas.openxmlformats.org/wordprocessingml/2006/main" xmlns:w14="http://schemas.microsoft.com/office/word/2010/wordml" xmlns:wpg="http://schemas.microsoft.com/office/word/2010/wordprocessingGroup" xmlns:wpi="http://schemas.microsoft.com/office/word/2010/wordprocessingInk" xmlns:wne="http://schemas.microsoft.com/office/word/2006/wordml" xmlns:wps="http://schemas.microsoft.com/office/word/2010/wordprocessingShape" mc:Ignorable="w14 wp14">
   <w:footnote w:type="separator" w:id="-1">
     <w:p>
       <w:pPr>
@@ -1395,7 +1399,7 @@
 </file>
 
 <file path=word/header1.xml><?xml version="1.0" encoding="utf-8"?>
-<w:hdr xmlns:wpc="http://schemas.microsoft.com/office/word/2010/wordprocessingCanvas" xmlns:mc="http://schemas.openxmlformats.org/markup-compatibility/2006" xmlns:o="urn:schemas-microsoft-com:office:office" xmlns:r="http://schemas.openxmlformats.org/officeDocument/2006/relationships" xmlns:m="http://schemas.openxmlformats.org/officeDocument/2006/math" xmlns:v="urn:schemas-microsoft-com:vml" xmlns:wp14="http://schemas.microsoft.com/office/word/2010/wordprocessingDrawing" xmlns:wp="http://schemas.openxmlformats.org/drawingml/2006/wordprocessingDrawing" xmlns:w10="urn:schemas-microsoft-com:office:word" xmlns:w="http://schemas.openxmlformats.org/wordprocessingml/2006/main" xmlns:w14="http://schemas.microsoft.com/office/word/2010/wordml" xmlns:w15="http://schemas.microsoft.com/office/word/2012/wordml" xmlns:wpg="http://schemas.microsoft.com/office/word/2010/wordprocessingGroup" xmlns:wpi="http://schemas.microsoft.com/office/word/2010/wordprocessingInk" xmlns:wne="http://schemas.microsoft.com/office/word/2006/wordml" xmlns:wps="http://schemas.microsoft.com/office/word/2010/wordprocessingShape" mc:Ignorable="w14 w15 wp14">
+<w:hdr xmlns:wpc="http://schemas.microsoft.com/office/word/2010/wordprocessingCanvas" xmlns:mc="http://schemas.openxmlformats.org/markup-compatibility/2006" xmlns:o="urn:schemas-microsoft-com:office:office" xmlns:r="http://schemas.openxmlformats.org/officeDocument/2006/relationships" xmlns:m="http://schemas.openxmlformats.org/officeDocument/2006/math" xmlns:v="urn:schemas-microsoft-com:vml" xmlns:wp14="http://schemas.microsoft.com/office/word/2010/wordprocessingDrawing" xmlns:wp="http://schemas.openxmlformats.org/drawingml/2006/wordprocessingDrawing" xmlns:w10="urn:schemas-microsoft-com:office:word" xmlns:w="http://schemas.openxmlformats.org/wordprocessingml/2006/main" xmlns:w14="http://schemas.microsoft.com/office/word/2010/wordml" xmlns:wpg="http://schemas.microsoft.com/office/word/2010/wordprocessingGroup" xmlns:wpi="http://schemas.microsoft.com/office/word/2010/wordprocessingInk" xmlns:wne="http://schemas.microsoft.com/office/word/2006/wordml" xmlns:wps="http://schemas.microsoft.com/office/word/2010/wordprocessingShape" mc:Ignorable="w14 wp14">
   <w:p>
     <w:pPr>
       <w:pStyle w:val="Cabealho"/>
@@ -1405,7 +1409,7 @@
 </file>
 
 <file path=word/header2.xml><?xml version="1.0" encoding="utf-8"?>
-<w:hdr xmlns:wpc="http://schemas.microsoft.com/office/word/2010/wordprocessingCanvas" xmlns:mc="http://schemas.openxmlformats.org/markup-compatibility/2006" xmlns:o="urn:schemas-microsoft-com:office:office" xmlns:r="http://schemas.openxmlformats.org/officeDocument/2006/relationships" xmlns:m="http://schemas.openxmlformats.org/officeDocument/2006/math" xmlns:v="urn:schemas-microsoft-com:vml" xmlns:wp14="http://schemas.microsoft.com/office/word/2010/wordprocessingDrawing" xmlns:wp="http://schemas.openxmlformats.org/drawingml/2006/wordprocessingDrawing" xmlns:w10="urn:schemas-microsoft-com:office:word" xmlns:w="http://schemas.openxmlformats.org/wordprocessingml/2006/main" xmlns:w14="http://schemas.microsoft.com/office/word/2010/wordml" xmlns:w15="http://schemas.microsoft.com/office/word/2012/wordml" xmlns:wpg="http://schemas.microsoft.com/office/word/2010/wordprocessingGroup" xmlns:wpi="http://schemas.microsoft.com/office/word/2010/wordprocessingInk" xmlns:wne="http://schemas.microsoft.com/office/word/2006/wordml" xmlns:wps="http://schemas.microsoft.com/office/word/2010/wordprocessingShape" mc:Ignorable="w14 w15 wp14">
+<w:hdr xmlns:wpc="http://schemas.microsoft.com/office/word/2010/wordprocessingCanvas" xmlns:mc="http://schemas.openxmlformats.org/markup-compatibility/2006" xmlns:o="urn:schemas-microsoft-com:office:office" xmlns:r="http://schemas.openxmlformats.org/officeDocument/2006/relationships" xmlns:m="http://schemas.openxmlformats.org/officeDocument/2006/math" xmlns:v="urn:schemas-microsoft-com:vml" xmlns:wp14="http://schemas.microsoft.com/office/word/2010/wordprocessingDrawing" xmlns:wp="http://schemas.openxmlformats.org/drawingml/2006/wordprocessingDrawing" xmlns:w10="urn:schemas-microsoft-com:office:word" xmlns:w="http://schemas.openxmlformats.org/wordprocessingml/2006/main" xmlns:w14="http://schemas.microsoft.com/office/word/2010/wordml" xmlns:wpg="http://schemas.microsoft.com/office/word/2010/wordprocessingGroup" xmlns:wpi="http://schemas.microsoft.com/office/word/2010/wordprocessingInk" xmlns:wne="http://schemas.microsoft.com/office/word/2006/wordml" xmlns:wps="http://schemas.microsoft.com/office/word/2010/wordprocessingShape" mc:Ignorable="w14 wp14">
   <w:p>
     <w:pPr>
       <w:pStyle w:val="Cabealho"/>
@@ -1421,7 +1425,7 @@
 </file>
 
 <file path=word/header3.xml><?xml version="1.0" encoding="utf-8"?>
-<w:hdr xmlns:wpc="http://schemas.microsoft.com/office/word/2010/wordprocessingCanvas" xmlns:mc="http://schemas.openxmlformats.org/markup-compatibility/2006" xmlns:o="urn:schemas-microsoft-com:office:office" xmlns:r="http://schemas.openxmlformats.org/officeDocument/2006/relationships" xmlns:m="http://schemas.openxmlformats.org/officeDocument/2006/math" xmlns:v="urn:schemas-microsoft-com:vml" xmlns:wp14="http://schemas.microsoft.com/office/word/2010/wordprocessingDrawing" xmlns:wp="http://schemas.openxmlformats.org/drawingml/2006/wordprocessingDrawing" xmlns:w10="urn:schemas-microsoft-com:office:word" xmlns:w="http://schemas.openxmlformats.org/wordprocessingml/2006/main" xmlns:w14="http://schemas.microsoft.com/office/word/2010/wordml" xmlns:w15="http://schemas.microsoft.com/office/word/2012/wordml" xmlns:wpg="http://schemas.microsoft.com/office/word/2010/wordprocessingGroup" xmlns:wpi="http://schemas.microsoft.com/office/word/2010/wordprocessingInk" xmlns:wne="http://schemas.microsoft.com/office/word/2006/wordml" xmlns:wps="http://schemas.microsoft.com/office/word/2010/wordprocessingShape" mc:Ignorable="w14 w15 wp14">
+<w:hdr xmlns:wpc="http://schemas.microsoft.com/office/word/2010/wordprocessingCanvas" xmlns:mc="http://schemas.openxmlformats.org/markup-compatibility/2006" xmlns:o="urn:schemas-microsoft-com:office:office" xmlns:r="http://schemas.openxmlformats.org/officeDocument/2006/relationships" xmlns:m="http://schemas.openxmlformats.org/officeDocument/2006/math" xmlns:v="urn:schemas-microsoft-com:vml" xmlns:wp14="http://schemas.microsoft.com/office/word/2010/wordprocessingDrawing" xmlns:wp="http://schemas.openxmlformats.org/drawingml/2006/wordprocessingDrawing" xmlns:w10="urn:schemas-microsoft-com:office:word" xmlns:w="http://schemas.openxmlformats.org/wordprocessingml/2006/main" xmlns:w14="http://schemas.microsoft.com/office/word/2010/wordml" xmlns:wpg="http://schemas.microsoft.com/office/word/2010/wordprocessingGroup" xmlns:wpi="http://schemas.microsoft.com/office/word/2010/wordprocessingInk" xmlns:wne="http://schemas.microsoft.com/office/word/2006/wordml" xmlns:wps="http://schemas.microsoft.com/office/word/2010/wordprocessingShape" mc:Ignorable="w14 wp14">
   <w:p>
     <w:pPr>
       <w:pStyle w:val="Cabealho"/>
@@ -1431,7 +1435,7 @@
 </file>
 
 <file path=word/styles.xml><?xml version="1.0" encoding="utf-8"?>
-<w:styles xmlns:mc="http://schemas.openxmlformats.org/markup-compatibility/2006" xmlns:r="http://schemas.openxmlformats.org/officeDocument/2006/relationships" xmlns:w="http://schemas.openxmlformats.org/wordprocessingml/2006/main" xmlns:w14="http://schemas.microsoft.com/office/word/2010/wordml" xmlns:w15="http://schemas.microsoft.com/office/word/2012/wordml" mc:Ignorable="w14 w15">
+<w:styles xmlns:mc="http://schemas.openxmlformats.org/markup-compatibility/2006" xmlns:r="http://schemas.openxmlformats.org/officeDocument/2006/relationships" xmlns:w="http://schemas.openxmlformats.org/wordprocessingml/2006/main" xmlns:w14="http://schemas.microsoft.com/office/word/2010/wordml" mc:Ignorable="w14">
   <w:docDefaults>
     <w:rPrDefault>
       <w:rPr>
@@ -1447,378 +1451,566 @@
       </w:pPr>
     </w:pPrDefault>
   </w:docDefaults>
-  <w:latentStyles w:defLockedState="0" w:defUIPriority="99" w:defSemiHidden="0" w:defUnhideWhenUsed="0" w:defQFormat="0" w:count="371">
-    <w:lsdException w:name="Normal" w:uiPriority="0" w:qFormat="1"/>
-    <w:lsdException w:name="heading 1" w:uiPriority="9" w:qFormat="1"/>
-    <w:lsdException w:name="heading 2" w:semiHidden="1" w:uiPriority="9" w:unhideWhenUsed="1" w:qFormat="1"/>
-    <w:lsdException w:name="heading 3" w:semiHidden="1" w:uiPriority="9" w:unhideWhenUsed="1" w:qFormat="1"/>
-    <w:lsdException w:name="heading 4" w:semiHidden="1" w:uiPriority="9" w:unhideWhenUsed="1" w:qFormat="1"/>
-    <w:lsdException w:name="heading 5" w:semiHidden="1" w:uiPriority="9" w:unhideWhenUsed="1" w:qFormat="1"/>
-    <w:lsdException w:name="heading 6" w:semiHidden="1" w:uiPriority="9" w:unhideWhenUsed="1" w:qFormat="1"/>
-    <w:lsdException w:name="heading 7" w:semiHidden="1" w:uiPriority="9" w:unhideWhenUsed="1" w:qFormat="1"/>
-    <w:lsdException w:name="heading 8" w:semiHidden="1" w:uiPriority="9" w:unhideWhenUsed="1" w:qFormat="1"/>
-    <w:lsdException w:name="heading 9" w:semiHidden="1" w:uiPriority="9" w:unhideWhenUsed="1" w:qFormat="1"/>
-    <w:lsdException w:name="index 1" w:semiHidden="1" w:unhideWhenUsed="1"/>
-    <w:lsdException w:name="index 2" w:semiHidden="1" w:unhideWhenUsed="1"/>
-    <w:lsdException w:name="index 3" w:semiHidden="1" w:unhideWhenUsed="1"/>
-    <w:lsdException w:name="index 4" w:semiHidden="1" w:unhideWhenUsed="1"/>
-    <w:lsdException w:name="index 5" w:semiHidden="1" w:unhideWhenUsed="1"/>
-    <w:lsdException w:name="index 6" w:semiHidden="1" w:unhideWhenUsed="1"/>
-    <w:lsdException w:name="index 7" w:semiHidden="1" w:unhideWhenUsed="1"/>
-    <w:lsdException w:name="index 8" w:semiHidden="1" w:unhideWhenUsed="1"/>
-    <w:lsdException w:name="index 9" w:semiHidden="1" w:unhideWhenUsed="1"/>
-    <w:lsdException w:name="toc 1" w:semiHidden="1" w:uiPriority="39" w:unhideWhenUsed="1"/>
-    <w:lsdException w:name="toc 2" w:semiHidden="1" w:uiPriority="39" w:unhideWhenUsed="1"/>
-    <w:lsdException w:name="toc 3" w:semiHidden="1" w:uiPriority="39" w:unhideWhenUsed="1"/>
-    <w:lsdException w:name="toc 4" w:semiHidden="1" w:uiPriority="39" w:unhideWhenUsed="1"/>
-    <w:lsdException w:name="toc 5" w:semiHidden="1" w:uiPriority="39" w:unhideWhenUsed="1"/>
-    <w:lsdException w:name="toc 6" w:semiHidden="1" w:uiPriority="39" w:unhideWhenUsed="1"/>
-    <w:lsdException w:name="toc 7" w:semiHidden="1" w:uiPriority="39" w:unhideWhenUsed="1"/>
-    <w:lsdException w:name="toc 8" w:semiHidden="1" w:uiPriority="39" w:unhideWhenUsed="1"/>
-    <w:lsdException w:name="toc 9" w:semiHidden="1" w:uiPriority="39" w:unhideWhenUsed="1"/>
-    <w:lsdException w:name="Normal Indent" w:semiHidden="1" w:unhideWhenUsed="1"/>
-    <w:lsdException w:name="footnote text" w:semiHidden="1" w:unhideWhenUsed="1"/>
-    <w:lsdException w:name="annotation text" w:semiHidden="1" w:unhideWhenUsed="1"/>
-    <w:lsdException w:name="header" w:semiHidden="1" w:unhideWhenUsed="1"/>
-    <w:lsdException w:name="footer" w:semiHidden="1" w:unhideWhenUsed="1"/>
-    <w:lsdException w:name="index heading" w:semiHidden="1" w:unhideWhenUsed="1"/>
-    <w:lsdException w:name="caption" w:semiHidden="1" w:uiPriority="35" w:unhideWhenUsed="1" w:qFormat="1"/>
-    <w:lsdException w:name="table of figures" w:semiHidden="1" w:unhideWhenUsed="1"/>
-    <w:lsdException w:name="envelope address" w:semiHidden="1" w:unhideWhenUsed="1"/>
-    <w:lsdException w:name="envelope return" w:semiHidden="1" w:unhideWhenUsed="1"/>
-    <w:lsdException w:name="footnote reference" w:semiHidden="1" w:unhideWhenUsed="1"/>
-    <w:lsdException w:name="annotation reference" w:semiHidden="1" w:unhideWhenUsed="1"/>
-    <w:lsdException w:name="line number" w:semiHidden="1" w:unhideWhenUsed="1"/>
-    <w:lsdException w:name="page number" w:semiHidden="1" w:unhideWhenUsed="1"/>
-    <w:lsdException w:name="endnote reference" w:semiHidden="1" w:unhideWhenUsed="1"/>
-    <w:lsdException w:name="endnote text" w:semiHidden="1" w:unhideWhenUsed="1"/>
-    <w:lsdException w:name="table of authorities" w:semiHidden="1" w:unhideWhenUsed="1"/>
-    <w:lsdException w:name="macro" w:semiHidden="1" w:unhideWhenUsed="1"/>
-    <w:lsdException w:name="toa heading" w:semiHidden="1" w:unhideWhenUsed="1"/>
-    <w:lsdException w:name="List" w:semiHidden="1" w:unhideWhenUsed="1"/>
-    <w:lsdException w:name="List Bullet" w:semiHidden="1" w:unhideWhenUsed="1"/>
-    <w:lsdException w:name="List Number" w:semiHidden="1" w:unhideWhenUsed="1"/>
-    <w:lsdException w:name="List 2" w:semiHidden="1" w:unhideWhenUsed="1"/>
-    <w:lsdException w:name="List 3" w:semiHidden="1" w:unhideWhenUsed="1"/>
-    <w:lsdException w:name="List 4" w:semiHidden="1" w:unhideWhenUsed="1"/>
-    <w:lsdException w:name="List 5" w:semiHidden="1" w:unhideWhenUsed="1"/>
-    <w:lsdException w:name="List Bullet 2" w:semiHidden="1" w:unhideWhenUsed="1"/>
-    <w:lsdException w:name="List Bullet 3" w:semiHidden="1" w:unhideWhenUsed="1"/>
-    <w:lsdException w:name="List Bullet 4" w:semiHidden="1" w:unhideWhenUsed="1"/>
-    <w:lsdException w:name="List Bullet 5" w:semiHidden="1" w:unhideWhenUsed="1"/>
-    <w:lsdException w:name="List Number 2" w:semiHidden="1" w:unhideWhenUsed="1"/>
-    <w:lsdException w:name="List Number 3" w:semiHidden="1" w:unhideWhenUsed="1"/>
-    <w:lsdException w:name="List Number 4" w:semiHidden="1" w:unhideWhenUsed="1"/>
-    <w:lsdException w:name="List Number 5" w:semiHidden="1" w:unhideWhenUsed="1"/>
-    <w:lsdException w:name="Title" w:uiPriority="10" w:qFormat="1"/>
-    <w:lsdException w:name="Closing" w:semiHidden="1" w:unhideWhenUsed="1"/>
-    <w:lsdException w:name="Signature" w:semiHidden="1" w:unhideWhenUsed="1"/>
-    <w:lsdException w:name="Default Paragraph Font" w:semiHidden="1" w:uiPriority="1" w:unhideWhenUsed="1"/>
-    <w:lsdException w:name="Body Text" w:semiHidden="1" w:unhideWhenUsed="1"/>
-    <w:lsdException w:name="Body Text Indent" w:semiHidden="1" w:unhideWhenUsed="1"/>
-    <w:lsdException w:name="List Continue" w:semiHidden="1" w:unhideWhenUsed="1"/>
-    <w:lsdException w:name="List Continue 2" w:semiHidden="1" w:unhideWhenUsed="1"/>
-    <w:lsdException w:name="List Continue 3" w:semiHidden="1" w:unhideWhenUsed="1"/>
-    <w:lsdException w:name="List Continue 4" w:semiHidden="1" w:unhideWhenUsed="1"/>
-    <w:lsdException w:name="List Continue 5" w:semiHidden="1" w:unhideWhenUsed="1"/>
-    <w:lsdException w:name="Message Header" w:semiHidden="1" w:unhideWhenUsed="1"/>
-    <w:lsdException w:name="Subtitle" w:uiPriority="11" w:qFormat="1"/>
-    <w:lsdException w:name="Salutation" w:semiHidden="1" w:unhideWhenUsed="1"/>
-    <w:lsdException w:name="Date" w:semiHidden="1" w:unhideWhenUsed="1"/>
-    <w:lsdException w:name="Body Text First Indent" w:semiHidden="1" w:unhideWhenUsed="1"/>
-    <w:lsdException w:name="Body Text First Indent 2" w:semiHidden="1" w:unhideWhenUsed="1"/>
-    <w:lsdException w:name="Note Heading" w:semiHidden="1" w:unhideWhenUsed="1"/>
-    <w:lsdException w:name="Body Text 2" w:semiHidden="1" w:unhideWhenUsed="1"/>
-    <w:lsdException w:name="Body Text 3" w:semiHidden="1" w:unhideWhenUsed="1"/>
-    <w:lsdException w:name="Body Text Indent 2" w:semiHidden="1" w:unhideWhenUsed="1"/>
-    <w:lsdException w:name="Body Text Indent 3" w:semiHidden="1" w:unhideWhenUsed="1"/>
-    <w:lsdException w:name="Block Text" w:semiHidden="1" w:unhideWhenUsed="1"/>
-    <w:lsdException w:name="Hyperlink" w:semiHidden="1" w:unhideWhenUsed="1"/>
-    <w:lsdException w:name="FollowedHyperlink" w:semiHidden="1" w:unhideWhenUsed="1"/>
-    <w:lsdException w:name="Strong" w:uiPriority="22" w:qFormat="1"/>
-    <w:lsdException w:name="Emphasis" w:uiPriority="20" w:qFormat="1"/>
-    <w:lsdException w:name="Document Map" w:semiHidden="1" w:unhideWhenUsed="1"/>
-    <w:lsdException w:name="Plain Text" w:semiHidden="1" w:unhideWhenUsed="1"/>
-    <w:lsdException w:name="E-mail Signature" w:semiHidden="1" w:unhideWhenUsed="1"/>
-    <w:lsdException w:name="HTML Top of Form" w:semiHidden="1" w:unhideWhenUsed="1"/>
-    <w:lsdException w:name="HTML Bottom of Form" w:semiHidden="1" w:unhideWhenUsed="1"/>
-    <w:lsdException w:name="Normal (Web)" w:semiHidden="1" w:unhideWhenUsed="1"/>
-    <w:lsdException w:name="HTML Acronym" w:semiHidden="1" w:unhideWhenUsed="1"/>
-    <w:lsdException w:name="HTML Address" w:semiHidden="1" w:unhideWhenUsed="1"/>
-    <w:lsdException w:name="HTML Cite" w:semiHidden="1" w:unhideWhenUsed="1"/>
-    <w:lsdException w:name="HTML Code" w:semiHidden="1" w:unhideWhenUsed="1"/>
-    <w:lsdException w:name="HTML Definition" w:semiHidden="1" w:unhideWhenUsed="1"/>
-    <w:lsdException w:name="HTML Keyboard" w:semiHidden="1" w:unhideWhenUsed="1"/>
-    <w:lsdException w:name="HTML Preformatted" w:semiHidden="1" w:unhideWhenUsed="1"/>
-    <w:lsdException w:name="HTML Sample" w:semiHidden="1" w:unhideWhenUsed="1"/>
-    <w:lsdException w:name="HTML Typewriter" w:semiHidden="1" w:unhideWhenUsed="1"/>
-    <w:lsdException w:name="HTML Variable" w:semiHidden="1" w:unhideWhenUsed="1"/>
-    <w:lsdException w:name="Normal Table" w:semiHidden="1" w:unhideWhenUsed="1"/>
-    <w:lsdException w:name="annotation subject" w:semiHidden="1" w:unhideWhenUsed="1"/>
-    <w:lsdException w:name="No List" w:semiHidden="1" w:unhideWhenUsed="1"/>
-    <w:lsdException w:name="Outline List 1" w:semiHidden="1" w:unhideWhenUsed="1"/>
-    <w:lsdException w:name="Outline List 2" w:semiHidden="1" w:unhideWhenUsed="1"/>
-    <w:lsdException w:name="Outline List 3" w:semiHidden="1" w:unhideWhenUsed="1"/>
-    <w:lsdException w:name="Table Simple 1" w:semiHidden="1" w:unhideWhenUsed="1"/>
-    <w:lsdException w:name="Table Simple 2" w:semiHidden="1" w:unhideWhenUsed="1"/>
-    <w:lsdException w:name="Table Simple 3" w:semiHidden="1" w:unhideWhenUsed="1"/>
-    <w:lsdException w:name="Table Classic 1" w:semiHidden="1" w:unhideWhenUsed="1"/>
-    <w:lsdException w:name="Table Classic 2" w:semiHidden="1" w:unhideWhenUsed="1"/>
-    <w:lsdException w:name="Table Classic 3" w:semiHidden="1" w:unhideWhenUsed="1"/>
-    <w:lsdException w:name="Table Classic 4" w:semiHidden="1" w:unhideWhenUsed="1"/>
-    <w:lsdException w:name="Table Colorful 1" w:semiHidden="1" w:unhideWhenUsed="1"/>
-    <w:lsdException w:name="Table Colorful 2" w:semiHidden="1" w:unhideWhenUsed="1"/>
-    <w:lsdException w:name="Table Colorful 3" w:semiHidden="1" w:unhideWhenUsed="1"/>
-    <w:lsdException w:name="Table Columns 1" w:semiHidden="1" w:unhideWhenUsed="1"/>
-    <w:lsdException w:name="Table Columns 2" w:semiHidden="1" w:unhideWhenUsed="1"/>
-    <w:lsdException w:name="Table Columns 3" w:semiHidden="1" w:unhideWhenUsed="1"/>
-    <w:lsdException w:name="Table Columns 4" w:semiHidden="1" w:unhideWhenUsed="1"/>
-    <w:lsdException w:name="Table Columns 5" w:semiHidden="1" w:unhideWhenUsed="1"/>
-    <w:lsdException w:name="Table Grid 1" w:semiHidden="1" w:unhideWhenUsed="1"/>
-    <w:lsdException w:name="Table Grid 2" w:semiHidden="1" w:unhideWhenUsed="1"/>
-    <w:lsdException w:name="Table Grid 3" w:semiHidden="1" w:unhideWhenUsed="1"/>
-    <w:lsdException w:name="Table Grid 4" w:semiHidden="1" w:unhideWhenUsed="1"/>
-    <w:lsdException w:name="Table Grid 5" w:semiHidden="1" w:unhideWhenUsed="1"/>
-    <w:lsdException w:name="Table Grid 6" w:semiHidden="1" w:unhideWhenUsed="1"/>
-    <w:lsdException w:name="Table Grid 7" w:semiHidden="1" w:unhideWhenUsed="1"/>
-    <w:lsdException w:name="Table Grid 8" w:semiHidden="1" w:unhideWhenUsed="1"/>
-    <w:lsdException w:name="Table List 1" w:semiHidden="1" w:unhideWhenUsed="1"/>
-    <w:lsdException w:name="Table List 2" w:semiHidden="1" w:unhideWhenUsed="1"/>
-    <w:lsdException w:name="Table List 3" w:semiHidden="1" w:unhideWhenUsed="1"/>
-    <w:lsdException w:name="Table List 4" w:semiHidden="1" w:unhideWhenUsed="1"/>
-    <w:lsdException w:name="Table List 5" w:semiHidden="1" w:unhideWhenUsed="1"/>
-    <w:lsdException w:name="Table List 6" w:semiHidden="1" w:unhideWhenUsed="1"/>
-    <w:lsdException w:name="Table List 7" w:semiHidden="1" w:unhideWhenUsed="1"/>
-    <w:lsdException w:name="Table List 8" w:semiHidden="1" w:unhideWhenUsed="1"/>
-    <w:lsdException w:name="Table 3D effects 1" w:semiHidden="1" w:unhideWhenUsed="1"/>
-    <w:lsdException w:name="Table 3D effects 2" w:semiHidden="1" w:unhideWhenUsed="1"/>
-    <w:lsdException w:name="Table 3D effects 3" w:semiHidden="1" w:unhideWhenUsed="1"/>
-    <w:lsdException w:name="Table Contemporary" w:semiHidden="1" w:unhideWhenUsed="1"/>
-    <w:lsdException w:name="Table Elegant" w:semiHidden="1" w:unhideWhenUsed="1"/>
-    <w:lsdException w:name="Table Professional" w:semiHidden="1" w:unhideWhenUsed="1"/>
-    <w:lsdException w:name="Table Subtle 1" w:semiHidden="1" w:unhideWhenUsed="1"/>
-    <w:lsdException w:name="Table Subtle 2" w:semiHidden="1" w:unhideWhenUsed="1"/>
-    <w:lsdException w:name="Table Web 1" w:semiHidden="1" w:unhideWhenUsed="1"/>
-    <w:lsdException w:name="Table Web 2" w:semiHidden="1" w:unhideWhenUsed="1"/>
-    <w:lsdException w:name="Table Web 3" w:semiHidden="1" w:unhideWhenUsed="1"/>
-    <w:lsdException w:name="Balloon Text" w:semiHidden="1" w:unhideWhenUsed="1"/>
-    <w:lsdException w:name="Table Grid" w:uiPriority="39"/>
-    <w:lsdException w:name="Table Theme" w:semiHidden="1" w:unhideWhenUsed="1"/>
-    <w:lsdException w:name="Placeholder Text" w:semiHidden="1"/>
-    <w:lsdException w:name="No Spacing" w:uiPriority="1" w:qFormat="1"/>
-    <w:lsdException w:name="Light Shading" w:uiPriority="60"/>
-    <w:lsdException w:name="Light List" w:uiPriority="61"/>
-    <w:lsdException w:name="Light Grid" w:uiPriority="62"/>
-    <w:lsdException w:name="Medium Shading 1" w:uiPriority="63"/>
-    <w:lsdException w:name="Medium Shading 2" w:uiPriority="64"/>
-    <w:lsdException w:name="Medium List 1" w:uiPriority="65"/>
-    <w:lsdException w:name="Medium List 2" w:uiPriority="66"/>
-    <w:lsdException w:name="Medium Grid 1" w:uiPriority="67"/>
-    <w:lsdException w:name="Medium Grid 2" w:uiPriority="68"/>
-    <w:lsdException w:name="Medium Grid 3" w:uiPriority="69"/>
-    <w:lsdException w:name="Dark List" w:uiPriority="70"/>
-    <w:lsdException w:name="Colorful Shading" w:uiPriority="71"/>
-    <w:lsdException w:name="Colorful List" w:uiPriority="72"/>
-    <w:lsdException w:name="Colorful Grid" w:uiPriority="73"/>
-    <w:lsdException w:name="Light Shading Accent 1" w:uiPriority="60"/>
-    <w:lsdException w:name="Light List Accent 1" w:uiPriority="61"/>
-    <w:lsdException w:name="Light Grid Accent 1" w:uiPriority="62"/>
-    <w:lsdException w:name="Medium Shading 1 Accent 1" w:uiPriority="63"/>
-    <w:lsdException w:name="Medium Shading 2 Accent 1" w:uiPriority="64"/>
-    <w:lsdException w:name="Medium List 1 Accent 1" w:uiPriority="65"/>
-    <w:lsdException w:name="Revision" w:semiHidden="1"/>
-    <w:lsdException w:name="List Paragraph" w:uiPriority="34" w:qFormat="1"/>
-    <w:lsdException w:name="Quote" w:uiPriority="29" w:qFormat="1"/>
-    <w:lsdException w:name="Intense Quote" w:uiPriority="30" w:qFormat="1"/>
-    <w:lsdException w:name="Medium List 2 Accent 1" w:uiPriority="66"/>
-    <w:lsdException w:name="Medium Grid 1 Accent 1" w:uiPriority="67"/>
-    <w:lsdException w:name="Medium Grid 2 Accent 1" w:uiPriority="68"/>
-    <w:lsdException w:name="Medium Grid 3 Accent 1" w:uiPriority="69"/>
-    <w:lsdException w:name="Dark List Accent 1" w:uiPriority="70"/>
-    <w:lsdException w:name="Colorful Shading Accent 1" w:uiPriority="71"/>
-    <w:lsdException w:name="Colorful List Accent 1" w:uiPriority="72"/>
-    <w:lsdException w:name="Colorful Grid Accent 1" w:uiPriority="73"/>
-    <w:lsdException w:name="Light Shading Accent 2" w:uiPriority="60"/>
-    <w:lsdException w:name="Light List Accent 2" w:uiPriority="61"/>
-    <w:lsdException w:name="Light Grid Accent 2" w:uiPriority="62"/>
-    <w:lsdException w:name="Medium Shading 1 Accent 2" w:uiPriority="63"/>
-    <w:lsdException w:name="Medium Shading 2 Accent 2" w:uiPriority="64"/>
-    <w:lsdException w:name="Medium List 1 Accent 2" w:uiPriority="65"/>
-    <w:lsdException w:name="Medium List 2 Accent 2" w:uiPriority="66"/>
-    <w:lsdException w:name="Medium Grid 1 Accent 2" w:uiPriority="67"/>
-    <w:lsdException w:name="Medium Grid 2 Accent 2" w:uiPriority="68"/>
-    <w:lsdException w:name="Medium Grid 3 Accent 2" w:uiPriority="69"/>
-    <w:lsdException w:name="Dark List Accent 2" w:uiPriority="70"/>
-    <w:lsdException w:name="Colorful Shading Accent 2" w:uiPriority="71"/>
-    <w:lsdException w:name="Colorful List Accent 2" w:uiPriority="72"/>
-    <w:lsdException w:name="Colorful Grid Accent 2" w:uiPriority="73"/>
-    <w:lsdException w:name="Light Shading Accent 3" w:uiPriority="60"/>
-    <w:lsdException w:name="Light List Accent 3" w:uiPriority="61"/>
-    <w:lsdException w:name="Light Grid Accent 3" w:uiPriority="62"/>
-    <w:lsdException w:name="Medium Shading 1 Accent 3" w:uiPriority="63"/>
-    <w:lsdException w:name="Medium Shading 2 Accent 3" w:uiPriority="64"/>
-    <w:lsdException w:name="Medium List 1 Accent 3" w:uiPriority="65"/>
-    <w:lsdException w:name="Medium List 2 Accent 3" w:uiPriority="66"/>
-    <w:lsdException w:name="Medium Grid 1 Accent 3" w:uiPriority="67"/>
-    <w:lsdException w:name="Medium Grid 2 Accent 3" w:uiPriority="68"/>
-    <w:lsdException w:name="Medium Grid 3 Accent 3" w:uiPriority="69"/>
-    <w:lsdException w:name="Dark List Accent 3" w:uiPriority="70"/>
-    <w:lsdException w:name="Colorful Shading Accent 3" w:uiPriority="71"/>
-    <w:lsdException w:name="Colorful List Accent 3" w:uiPriority="72"/>
-    <w:lsdException w:name="Colorful Grid Accent 3" w:uiPriority="73"/>
-    <w:lsdException w:name="Light Shading Accent 4" w:uiPriority="60"/>
-    <w:lsdException w:name="Light List Accent 4" w:uiPriority="61"/>
-    <w:lsdException w:name="Light Grid Accent 4" w:uiPriority="62"/>
-    <w:lsdException w:name="Medium Shading 1 Accent 4" w:uiPriority="63"/>
-    <w:lsdException w:name="Medium Shading 2 Accent 4" w:uiPriority="64"/>
-    <w:lsdException w:name="Medium List 1 Accent 4" w:uiPriority="65"/>
-    <w:lsdException w:name="Medium List 2 Accent 4" w:uiPriority="66"/>
-    <w:lsdException w:name="Medium Grid 1 Accent 4" w:uiPriority="67"/>
-    <w:lsdException w:name="Medium Grid 2 Accent 4" w:uiPriority="68"/>
-    <w:lsdException w:name="Medium Grid 3 Accent 4" w:uiPriority="69"/>
-    <w:lsdException w:name="Dark List Accent 4" w:uiPriority="70"/>
-    <w:lsdException w:name="Colorful Shading Accent 4" w:uiPriority="71"/>
-    <w:lsdException w:name="Colorful List Accent 4" w:uiPriority="72"/>
-    <w:lsdException w:name="Colorful Grid Accent 4" w:uiPriority="73"/>
-    <w:lsdException w:name="Light Shading Accent 5" w:uiPriority="60"/>
-    <w:lsdException w:name="Light List Accent 5" w:uiPriority="61"/>
-    <w:lsdException w:name="Light Grid Accent 5" w:uiPriority="62"/>
-    <w:lsdException w:name="Medium Shading 1 Accent 5" w:uiPriority="63"/>
-    <w:lsdException w:name="Medium Shading 2 Accent 5" w:uiPriority="64"/>
-    <w:lsdException w:name="Medium List 1 Accent 5" w:uiPriority="65"/>
-    <w:lsdException w:name="Medium List 2 Accent 5" w:uiPriority="66"/>
-    <w:lsdException w:name="Medium Grid 1 Accent 5" w:uiPriority="67"/>
-    <w:lsdException w:name="Medium Grid 2 Accent 5" w:uiPriority="68"/>
-    <w:lsdException w:name="Medium Grid 3 Accent 5" w:uiPriority="69"/>
-    <w:lsdException w:name="Dark List Accent 5" w:uiPriority="70"/>
-    <w:lsdException w:name="Colorful Shading Accent 5" w:uiPriority="71"/>
-    <w:lsdException w:name="Colorful List Accent 5" w:uiPriority="72"/>
-    <w:lsdException w:name="Colorful Grid Accent 5" w:uiPriority="73"/>
-    <w:lsdException w:name="Light Shading Accent 6" w:uiPriority="60"/>
-    <w:lsdException w:name="Light List Accent 6" w:uiPriority="61"/>
-    <w:lsdException w:name="Light Grid Accent 6" w:uiPriority="62"/>
-    <w:lsdException w:name="Medium Shading 1 Accent 6" w:uiPriority="63"/>
-    <w:lsdException w:name="Medium Shading 2 Accent 6" w:uiPriority="64"/>
-    <w:lsdException w:name="Medium List 1 Accent 6" w:uiPriority="65"/>
-    <w:lsdException w:name="Medium List 2 Accent 6" w:uiPriority="66"/>
-    <w:lsdException w:name="Medium Grid 1 Accent 6" w:uiPriority="67"/>
-    <w:lsdException w:name="Medium Grid 2 Accent 6" w:uiPriority="68"/>
-    <w:lsdException w:name="Medium Grid 3 Accent 6" w:uiPriority="69"/>
-    <w:lsdException w:name="Dark List Accent 6" w:uiPriority="70"/>
-    <w:lsdException w:name="Colorful Shading Accent 6" w:uiPriority="71"/>
-    <w:lsdException w:name="Colorful List Accent 6" w:uiPriority="72"/>
-    <w:lsdException w:name="Colorful Grid Accent 6" w:uiPriority="73"/>
-    <w:lsdException w:name="Subtle Emphasis" w:uiPriority="19" w:qFormat="1"/>
-    <w:lsdException w:name="Intense Emphasis" w:uiPriority="21" w:qFormat="1"/>
-    <w:lsdException w:name="Subtle Reference" w:uiPriority="31" w:qFormat="1"/>
-    <w:lsdException w:name="Intense Reference" w:uiPriority="32" w:qFormat="1"/>
-    <w:lsdException w:name="Book Title" w:uiPriority="33" w:qFormat="1"/>
-    <w:lsdException w:name="Bibliography" w:semiHidden="1" w:uiPriority="37" w:unhideWhenUsed="1"/>
-    <w:lsdException w:name="TOC Heading" w:semiHidden="1" w:uiPriority="39" w:unhideWhenUsed="1" w:qFormat="1"/>
-    <w:lsdException w:name="Plain Table 1" w:uiPriority="41"/>
-    <w:lsdException w:name="Plain Table 2" w:uiPriority="42"/>
-    <w:lsdException w:name="Plain Table 3" w:uiPriority="43"/>
-    <w:lsdException w:name="Plain Table 4" w:uiPriority="44"/>
-    <w:lsdException w:name="Plain Table 5" w:uiPriority="45"/>
-    <w:lsdException w:name="Grid Table Light" w:uiPriority="40"/>
-    <w:lsdException w:name="Grid Table 1 Light" w:uiPriority="46"/>
-    <w:lsdException w:name="Grid Table 2" w:uiPriority="47"/>
-    <w:lsdException w:name="Grid Table 3" w:uiPriority="48"/>
-    <w:lsdException w:name="Grid Table 4" w:uiPriority="49"/>
-    <w:lsdException w:name="Grid Table 5 Dark" w:uiPriority="50"/>
-    <w:lsdException w:name="Grid Table 6 Colorful" w:uiPriority="51"/>
-    <w:lsdException w:name="Grid Table 7 Colorful" w:uiPriority="52"/>
-    <w:lsdException w:name="Grid Table 1 Light Accent 1" w:uiPriority="46"/>
-    <w:lsdException w:name="Grid Table 2 Accent 1" w:uiPriority="47"/>
-    <w:lsdException w:name="Grid Table 3 Accent 1" w:uiPriority="48"/>
-    <w:lsdException w:name="Grid Table 4 Accent 1" w:uiPriority="49"/>
-    <w:lsdException w:name="Grid Table 5 Dark Accent 1" w:uiPriority="50"/>
-    <w:lsdException w:name="Grid Table 6 Colorful Accent 1" w:uiPriority="51"/>
-    <w:lsdException w:name="Grid Table 7 Colorful Accent 1" w:uiPriority="52"/>
-    <w:lsdException w:name="Grid Table 1 Light Accent 2" w:uiPriority="46"/>
-    <w:lsdException w:name="Grid Table 2 Accent 2" w:uiPriority="47"/>
-    <w:lsdException w:name="Grid Table 3 Accent 2" w:uiPriority="48"/>
-    <w:lsdException w:name="Grid Table 4 Accent 2" w:uiPriority="49"/>
-    <w:lsdException w:name="Grid Table 5 Dark Accent 2" w:uiPriority="50"/>
-    <w:lsdException w:name="Grid Table 6 Colorful Accent 2" w:uiPriority="51"/>
-    <w:lsdException w:name="Grid Table 7 Colorful Accent 2" w:uiPriority="52"/>
-    <w:lsdException w:name="Grid Table 1 Light Accent 3" w:uiPriority="46"/>
-    <w:lsdException w:name="Grid Table 2 Accent 3" w:uiPriority="47"/>
-    <w:lsdException w:name="Grid Table 3 Accent 3" w:uiPriority="48"/>
-    <w:lsdException w:name="Grid Table 4 Accent 3" w:uiPriority="49"/>
-    <w:lsdException w:name="Grid Table 5 Dark Accent 3" w:uiPriority="50"/>
-    <w:lsdException w:name="Grid Table 6 Colorful Accent 3" w:uiPriority="51"/>
-    <w:lsdException w:name="Grid Table 7 Colorful Accent 3" w:uiPriority="52"/>
-    <w:lsdException w:name="Grid Table 1 Light Accent 4" w:uiPriority="46"/>
-    <w:lsdException w:name="Grid Table 2 Accent 4" w:uiPriority="47"/>
-    <w:lsdException w:name="Grid Table 3 Accent 4" w:uiPriority="48"/>
-    <w:lsdException w:name="Grid Table 4 Accent 4" w:uiPriority="49"/>
-    <w:lsdException w:name="Grid Table 5 Dark Accent 4" w:uiPriority="50"/>
-    <w:lsdException w:name="Grid Table 6 Colorful Accent 4" w:uiPriority="51"/>
-    <w:lsdException w:name="Grid Table 7 Colorful Accent 4" w:uiPriority="52"/>
-    <w:lsdException w:name="Grid Table 1 Light Accent 5" w:uiPriority="46"/>
-    <w:lsdException w:name="Grid Table 2 Accent 5" w:uiPriority="47"/>
-    <w:lsdException w:name="Grid Table 3 Accent 5" w:uiPriority="48"/>
-    <w:lsdException w:name="Grid Table 4 Accent 5" w:uiPriority="49"/>
-    <w:lsdException w:name="Grid Table 5 Dark Accent 5" w:uiPriority="50"/>
-    <w:lsdException w:name="Grid Table 6 Colorful Accent 5" w:uiPriority="51"/>
-    <w:lsdException w:name="Grid Table 7 Colorful Accent 5" w:uiPriority="52"/>
-    <w:lsdException w:name="Grid Table 1 Light Accent 6" w:uiPriority="46"/>
-    <w:lsdException w:name="Grid Table 2 Accent 6" w:uiPriority="47"/>
-    <w:lsdException w:name="Grid Table 3 Accent 6" w:uiPriority="48"/>
-    <w:lsdException w:name="Grid Table 4 Accent 6" w:uiPriority="49"/>
-    <w:lsdException w:name="Grid Table 5 Dark Accent 6" w:uiPriority="50"/>
-    <w:lsdException w:name="Grid Table 6 Colorful Accent 6" w:uiPriority="51"/>
-    <w:lsdException w:name="Grid Table 7 Colorful Accent 6" w:uiPriority="52"/>
-    <w:lsdException w:name="List Table 1 Light" w:uiPriority="46"/>
-    <w:lsdException w:name="List Table 2" w:uiPriority="47"/>
-    <w:lsdException w:name="List Table 3" w:uiPriority="48"/>
-    <w:lsdException w:name="List Table 4" w:uiPriority="49"/>
-    <w:lsdException w:name="List Table 5 Dark" w:uiPriority="50"/>
-    <w:lsdException w:name="List Table 6 Colorful" w:uiPriority="51"/>
-    <w:lsdException w:name="List Table 7 Colorful" w:uiPriority="52"/>
-    <w:lsdException w:name="List Table 1 Light Accent 1" w:uiPriority="46"/>
-    <w:lsdException w:name="List Table 2 Accent 1" w:uiPriority="47"/>
-    <w:lsdException w:name="List Table 3 Accent 1" w:uiPriority="48"/>
-    <w:lsdException w:name="List Table 4 Accent 1" w:uiPriority="49"/>
-    <w:lsdException w:name="List Table 5 Dark Accent 1" w:uiPriority="50"/>
-    <w:lsdException w:name="List Table 6 Colorful Accent 1" w:uiPriority="51"/>
-    <w:lsdException w:name="List Table 7 Colorful Accent 1" w:uiPriority="52"/>
-    <w:lsdException w:name="List Table 1 Light Accent 2" w:uiPriority="46"/>
-    <w:lsdException w:name="List Table 2 Accent 2" w:uiPriority="47"/>
-    <w:lsdException w:name="List Table 3 Accent 2" w:uiPriority="48"/>
-    <w:lsdException w:name="List Table 4 Accent 2" w:uiPriority="49"/>
-    <w:lsdException w:name="List Table 5 Dark Accent 2" w:uiPriority="50"/>
-    <w:lsdException w:name="List Table 6 Colorful Accent 2" w:uiPriority="51"/>
-    <w:lsdException w:name="List Table 7 Colorful Accent 2" w:uiPriority="52"/>
-    <w:lsdException w:name="List Table 1 Light Accent 3" w:uiPriority="46"/>
-    <w:lsdException w:name="List Table 2 Accent 3" w:uiPriority="47"/>
-    <w:lsdException w:name="List Table 3 Accent 3" w:uiPriority="48"/>
-    <w:lsdException w:name="List Table 4 Accent 3" w:uiPriority="49"/>
-    <w:lsdException w:name="List Table 5 Dark Accent 3" w:uiPriority="50"/>
-    <w:lsdException w:name="List Table 6 Colorful Accent 3" w:uiPriority="51"/>
-    <w:lsdException w:name="List Table 7 Colorful Accent 3" w:uiPriority="52"/>
-    <w:lsdException w:name="List Table 1 Light Accent 4" w:uiPriority="46"/>
-    <w:lsdException w:name="List Table 2 Accent 4" w:uiPriority="47"/>
-    <w:lsdException w:name="List Table 3 Accent 4" w:uiPriority="48"/>
-    <w:lsdException w:name="List Table 4 Accent 4" w:uiPriority="49"/>
-    <w:lsdException w:name="List Table 5 Dark Accent 4" w:uiPriority="50"/>
-    <w:lsdException w:name="List Table 6 Colorful Accent 4" w:uiPriority="51"/>
-    <w:lsdException w:name="List Table 7 Colorful Accent 4" w:uiPriority="52"/>
-    <w:lsdException w:name="List Table 1 Light Accent 5" w:uiPriority="46"/>
-    <w:lsdException w:name="List Table 2 Accent 5" w:uiPriority="47"/>
-    <w:lsdException w:name="List Table 3 Accent 5" w:uiPriority="48"/>
-    <w:lsdException w:name="List Table 4 Accent 5" w:uiPriority="49"/>
-    <w:lsdException w:name="List Table 5 Dark Accent 5" w:uiPriority="50"/>
-    <w:lsdException w:name="List Table 6 Colorful Accent 5" w:uiPriority="51"/>
-    <w:lsdException w:name="List Table 7 Colorful Accent 5" w:uiPriority="52"/>
-    <w:lsdException w:name="List Table 1 Light Accent 6" w:uiPriority="46"/>
-    <w:lsdException w:name="List Table 2 Accent 6" w:uiPriority="47"/>
-    <w:lsdException w:name="List Table 3 Accent 6" w:uiPriority="48"/>
-    <w:lsdException w:name="List Table 4 Accent 6" w:uiPriority="49"/>
-    <w:lsdException w:name="List Table 5 Dark Accent 6" w:uiPriority="50"/>
-    <w:lsdException w:name="List Table 6 Colorful Accent 6" w:uiPriority="51"/>
-    <w:lsdException w:name="List Table 7 Colorful Accent 6" w:uiPriority="52"/>
+  <w:latentStyles w:defLockedState="0" w:defUIPriority="99" w:defSemiHidden="1" w:defUnhideWhenUsed="1" w:defQFormat="0" w:count="267">
+    <w:lsdException w:name="Normal" w:semiHidden="0" w:uiPriority="0" w:unhideWhenUsed="0" w:qFormat="1"/>
+    <w:lsdException w:name="heading 1" w:semiHidden="0" w:uiPriority="9" w:unhideWhenUsed="0" w:qFormat="1"/>
+    <w:lsdException w:name="heading 2" w:uiPriority="9" w:qFormat="1"/>
+    <w:lsdException w:name="heading 3" w:uiPriority="9" w:qFormat="1"/>
+    <w:lsdException w:name="heading 4" w:uiPriority="9" w:qFormat="1"/>
+    <w:lsdException w:name="heading 5" w:uiPriority="9" w:qFormat="1"/>
+    <w:lsdException w:name="heading 6" w:uiPriority="9" w:qFormat="1"/>
+    <w:lsdException w:name="heading 7" w:uiPriority="9" w:qFormat="1"/>
+    <w:lsdException w:name="heading 8" w:uiPriority="9" w:qFormat="1"/>
+    <w:lsdException w:name="heading 9" w:uiPriority="9" w:qFormat="1"/>
+    <w:lsdException w:name="toc 1" w:uiPriority="39"/>
+    <w:lsdException w:name="toc 2" w:uiPriority="39"/>
+    <w:lsdException w:name="toc 3" w:uiPriority="39"/>
+    <w:lsdException w:name="toc 4" w:uiPriority="39"/>
+    <w:lsdException w:name="toc 5" w:uiPriority="39"/>
+    <w:lsdException w:name="toc 6" w:uiPriority="39"/>
+    <w:lsdException w:name="toc 7" w:uiPriority="39"/>
+    <w:lsdException w:name="toc 8" w:uiPriority="39"/>
+    <w:lsdException w:name="toc 9" w:uiPriority="39"/>
+    <w:lsdException w:name="caption" w:uiPriority="35" w:qFormat="1"/>
+    <w:lsdException w:name="Title" w:semiHidden="0" w:uiPriority="10" w:unhideWhenUsed="0" w:qFormat="1"/>
+    <w:lsdException w:name="Default Paragraph Font" w:uiPriority="1"/>
+    <w:lsdException w:name="Subtitle" w:semiHidden="0" w:uiPriority="11" w:unhideWhenUsed="0" w:qFormat="1"/>
+    <w:lsdException w:name="Strong" w:semiHidden="0" w:uiPriority="22" w:unhideWhenUsed="0" w:qFormat="1"/>
+    <w:lsdException w:name="Emphasis" w:semiHidden="0" w:uiPriority="20" w:unhideWhenUsed="0" w:qFormat="1"/>
+    <w:lsdException w:name="Table Grid" w:semiHidden="0" w:uiPriority="39" w:unhideWhenUsed="0"/>
+    <w:lsdException w:name="Placeholder Text" w:unhideWhenUsed="0"/>
+    <w:lsdException w:name="No Spacing" w:semiHidden="0" w:uiPriority="1" w:unhideWhenUsed="0" w:qFormat="1"/>
+    <w:lsdException w:name="Light Shading" w:semiHidden="0" w:uiPriority="60" w:unhideWhenUsed="0"/>
+    <w:lsdException w:name="Light List" w:semiHidden="0" w:uiPriority="61" w:unhideWhenUsed="0"/>
+    <w:lsdException w:name="Light Grid" w:semiHidden="0" w:uiPriority="62" w:unhideWhenUsed="0"/>
+    <w:lsdException w:name="Medium Shading 1" w:semiHidden="0" w:uiPriority="63" w:unhideWhenUsed="0"/>
+    <w:lsdException w:name="Medium Shading 2" w:semiHidden="0" w:uiPriority="64" w:unhideWhenUsed="0"/>
+    <w:lsdException w:name="Medium List 1" w:semiHidden="0" w:uiPriority="65" w:unhideWhenUsed="0"/>
+    <w:lsdException w:name="Medium List 2" w:semiHidden="0" w:uiPriority="66" w:unhideWhenUsed="0"/>
+    <w:lsdException w:name="Medium Grid 1" w:semiHidden="0" w:uiPriority="67" w:unhideWhenUsed="0"/>
+    <w:lsdException w:name="Medium Grid 2" w:semiHidden="0" w:uiPriority="68" w:unhideWhenUsed="0"/>
+    <w:lsdException w:name="Medium Grid 3" w:semiHidden="0" w:uiPriority="69" w:unhideWhenUsed="0"/>
+    <w:lsdException w:name="Dark List" w:semiHidden="0" w:uiPriority="70" w:unhideWhenUsed="0"/>
+    <w:lsdException w:name="Colorful Shading" w:semiHidden="0" w:uiPriority="71" w:unhideWhenUsed="0"/>
+    <w:lsdException w:name="Colorful List" w:semiHidden="0" w:uiPriority="72" w:unhideWhenUsed="0"/>
+    <w:lsdException w:name="Colorful Grid" w:semiHidden="0" w:uiPriority="73" w:unhideWhenUsed="0"/>
+    <w:lsdException w:name="Light Shading Accent 1" w:semiHidden="0" w:uiPriority="60" w:unhideWhenUsed="0"/>
+    <w:lsdException w:name="Light List Accent 1" w:semiHidden="0" w:uiPriority="61" w:unhideWhenUsed="0"/>
+    <w:lsdException w:name="Light Grid Accent 1" w:semiHidden="0" w:uiPriority="62" w:unhideWhenUsed="0"/>
+    <w:lsdException w:name="Medium Shading 1 Accent 1" w:semiHidden="0" w:uiPriority="63" w:unhideWhenUsed="0"/>
+    <w:lsdException w:name="Medium Shading 2 Accent 1" w:semiHidden="0" w:uiPriority="64" w:unhideWhenUsed="0"/>
+    <w:lsdException w:name="Medium List 1 Accent 1" w:semiHidden="0" w:uiPriority="65" w:unhideWhenUsed="0"/>
+    <w:lsdException w:name="Revision" w:unhideWhenUsed="0"/>
+    <w:lsdException w:name="List Paragraph" w:semiHidden="0" w:uiPriority="34" w:unhideWhenUsed="0" w:qFormat="1"/>
+    <w:lsdException w:name="Quote" w:semiHidden="0" w:uiPriority="29" w:unhideWhenUsed="0" w:qFormat="1"/>
+    <w:lsdException w:name="Intense Quote" w:semiHidden="0" w:uiPriority="30" w:unhideWhenUsed="0" w:qFormat="1"/>
+    <w:lsdException w:name="Medium List 2 Accent 1" w:semiHidden="0" w:uiPriority="66" w:unhideWhenUsed="0"/>
+    <w:lsdException w:name="Medium Grid 1 Accent 1" w:semiHidden="0" w:uiPriority="67" w:unhideWhenUsed="0"/>
+    <w:lsdException w:name="Medium Grid 2 Accent 1" w:semiHidden="0" w:uiPriority="68" w:unhideWhenUsed="0"/>
+    <w:lsdException w:name="Medium Grid 3 Accent 1" w:semiHidden="0" w:uiPriority="69" w:unhideWhenUsed="0"/>
+    <w:lsdException w:name="Dark List Accent 1" w:semiHidden="0" w:uiPriority="70" w:unhideWhenUsed="0"/>
+    <w:lsdException w:name="Colorful Shading Accent 1" w:semiHidden="0" w:uiPriority="71" w:unhideWhenUsed="0"/>
+    <w:lsdException w:name="Colorful List Accent 1" w:semiHidden="0" w:uiPriority="72" w:unhideWhenUsed="0"/>
+    <w:lsdException w:name="Colorful Grid Accent 1" w:semiHidden="0" w:uiPriority="73" w:unhideWhenUsed="0"/>
+    <w:lsdException w:name="Light Shading Accent 2" w:semiHidden="0" w:uiPriority="60" w:unhideWhenUsed="0"/>
+    <w:lsdException w:name="Light List Accent 2" w:semiHidden="0" w:uiPriority="61" w:unhideWhenUsed="0"/>
+    <w:lsdException w:name="Light Grid Accent 2" w:semiHidden="0" w:uiPriority="62" w:unhideWhenUsed="0"/>
+    <w:lsdException w:name="Medium Shading 1 Accent 2" w:semiHidden="0" w:uiPriority="63" w:unhideWhenUsed="0"/>
+    <w:lsdException w:name="Medium Shading 2 Accent 2" w:semiHidden="0" w:uiPriority="64" w:unhideWhenUsed="0"/>
+    <w:lsdException w:name="Medium List 1 Accent 2" w:semiHidden="0" w:uiPriority="65" w:unhideWhenUsed="0"/>
+    <w:lsdException w:name="Medium List 2 Accent 2" w:semiHidden="0" w:uiPriority="66" w:unhideWhenUsed="0"/>
+    <w:lsdException w:name="Medium Grid 1 Accent 2" w:semiHidden="0" w:uiPriority="67" w:unhideWhenUsed="0"/>
+    <w:lsdException w:name="Medium Grid 2 Accent 2" w:semiHidden="0" w:uiPriority="68" w:unhideWhenUsed="0"/>
+    <w:lsdException w:name="Medium Grid 3 Accent 2" w:semiHidden="0" w:uiPriority="69" w:unhideWhenUsed="0"/>
+    <w:lsdException w:name="Dark List Accent 2" w:semiHidden="0" w:uiPriority="70" w:unhideWhenUsed="0"/>
+    <w:lsdException w:name="Colorful Shading Accent 2" w:semiHidden="0" w:uiPriority="71" w:unhideWhenUsed="0"/>
+    <w:lsdException w:name="Colorful List Accent 2" w:semiHidden="0" w:uiPriority="72" w:unhideWhenUsed="0"/>
+    <w:lsdException w:name="Colorful Grid Accent 2" w:semiHidden="0" w:uiPriority="73" w:unhideWhenUsed="0"/>
+    <w:lsdException w:name="Light Shading Accent 3" w:semiHidden="0" w:uiPriority="60" w:unhideWhenUsed="0"/>
+    <w:lsdException w:name="Light List Accent 3" w:semiHidden="0" w:uiPriority="61" w:unhideWhenUsed="0"/>
+    <w:lsdException w:name="Light Grid Accent 3" w:semiHidden="0" w:uiPriority="62" w:unhideWhenUsed="0"/>
+    <w:lsdException w:name="Medium Shading 1 Accent 3" w:semiHidden="0" w:uiPriority="63" w:unhideWhenUsed="0"/>
+    <w:lsdException w:name="Medium Shading 2 Accent 3" w:semiHidden="0" w:uiPriority="64" w:unhideWhenUsed="0"/>
+    <w:lsdException w:name="Medium List 1 Accent 3" w:semiHidden="0" w:uiPriority="65" w:unhideWhenUsed="0"/>
+    <w:lsdException w:name="Medium List 2 Accent 3" w:semiHidden="0" w:uiPriority="66" w:unhideWhenUsed="0"/>
+    <w:lsdException w:name="Medium Grid 1 Accent 3" w:semiHidden="0" w:uiPriority="67" w:unhideWhenUsed="0"/>
+    <w:lsdException w:name="Medium Grid 2 Accent 3" w:semiHidden="0" w:uiPriority="68" w:unhideWhenUsed="0"/>
+    <w:lsdException w:name="Medium Grid 3 Accent 3" w:semiHidden="0" w:uiPriority="69" w:unhideWhenUsed="0"/>
+    <w:lsdException w:name="Dark List Accent 3" w:semiHidden="0" w:uiPriority="70" w:unhideWhenUsed="0"/>
+    <w:lsdException w:name="Colorful Shading Accent 3" w:semiHidden="0" w:uiPriority="71" w:unhideWhenUsed="0"/>
+    <w:lsdException w:name="Colorful List Accent 3" w:semiHidden="0" w:uiPriority="72" w:unhideWhenUsed="0"/>
+    <w:lsdException w:name="Colorful Grid Accent 3" w:semiHidden="0" w:uiPriority="73" w:unhideWhenUsed="0"/>
+    <w:lsdException w:name="Light Shading Accent 4" w:semiHidden="0" w:uiPriority="60" w:unhideWhenUsed="0"/>
+    <w:lsdException w:name="Light List Accent 4" w:semiHidden="0" w:uiPriority="61" w:unhideWhenUsed="0"/>
+    <w:lsdException w:name="Light Grid Accent 4" w:semiHidden="0" w:uiPriority="62" w:unhideWhenUsed="0"/>
+    <w:lsdException w:name="Medium Shading 1 Accent 4" w:semiHidden="0" w:uiPriority="63" w:unhideWhenUsed="0"/>
+    <w:lsdException w:name="Medium Shading 2 Accent 4" w:semiHidden="0" w:uiPriority="64" w:unhideWhenUsed="0"/>
+    <w:lsdException w:name="Medium List 1 Accent 4" w:semiHidden="0" w:uiPriority="65" w:unhideWhenUsed="0"/>
+    <w:lsdException w:name="Medium List 2 Accent 4" w:semiHidden="0" w:uiPriority="66" w:unhideWhenUsed="0"/>
+    <w:lsdException w:name="Medium Grid 1 Accent 4" w:semiHidden="0" w:uiPriority="67" w:unhideWhenUsed="0"/>
+    <w:lsdException w:name="Medium Grid 2 Accent 4" w:semiHidden="0" w:uiPriority="68" w:unhideWhenUsed="0"/>
+    <w:lsdException w:name="Medium Grid 3 Accent 4" w:semiHidden="0" w:uiPriority="69" w:unhideWhenUsed="0"/>
+    <w:lsdException w:name="Dark List Accent 4" w:semiHidden="0" w:uiPriority="70" w:unhideWhenUsed="0"/>
+    <w:lsdException w:name="Colorful Shading Accent 4" w:semiHidden="0" w:uiPriority="71" w:unhideWhenUsed="0"/>
+    <w:lsdException w:name="Colorful List Accent 4" w:semiHidden="0" w:uiPriority="72" w:unhideWhenUsed="0"/>
+    <w:lsdException w:name="Colorful Grid Accent 4" w:semiHidden="0" w:uiPriority="73" w:unhideWhenUsed="0"/>
+    <w:lsdException w:name="Light Shading Accent 5" w:semiHidden="0" w:uiPriority="60" w:unhideWhenUsed="0"/>
+    <w:lsdException w:name="Light List Accent 5" w:semiHidden="0" w:uiPriority="61" w:unhideWhenUsed="0"/>
+    <w:lsdException w:name="Light Grid Accent 5" w:semiHidden="0" w:uiPriority="62" w:unhideWhenUsed="0"/>
+    <w:lsdException w:name="Medium Shading 1 Accent 5" w:semiHidden="0" w:uiPriority="63" w:unhideWhenUsed="0"/>
+    <w:lsdException w:name="Medium Shading 2 Accent 5" w:semiHidden="0" w:uiPriority="64" w:unhideWhenUsed="0"/>
+    <w:lsdException w:name="Medium List 1 Accent 5" w:semiHidden="0" w:uiPriority="65" w:unhideWhenUsed="0"/>
+    <w:lsdException w:name="Medium List 2 Accent 5" w:semiHidden="0" w:uiPriority="66" w:unhideWhenUsed="0"/>
+    <w:lsdException w:name="Medium Grid 1 Accent 5" w:semiHidden="0" w:uiPriority="67" w:unhideWhenUsed="0"/>
+    <w:lsdException w:name="Medium Grid 2 Accent 5" w:semiHidden="0" w:uiPriority="68" w:unhideWhenUsed="0"/>
+    <w:lsdException w:name="Medium Grid 3 Accent 5" w:semiHidden="0" w:uiPriority="69" w:unhideWhenUsed="0"/>
+    <w:lsdException w:name="Dark List Accent 5" w:semiHidden="0" w:uiPriority="70" w:unhideWhenUsed="0"/>
+    <w:lsdException w:name="Colorful Shading Accent 5" w:semiHidden="0" w:uiPriority="71" w:unhideWhenUsed="0"/>
+    <w:lsdException w:name="Colorful List Accent 5" w:semiHidden="0" w:uiPriority="72" w:unhideWhenUsed="0"/>
+    <w:lsdException w:name="Colorful Grid Accent 5" w:semiHidden="0" w:uiPriority="73" w:unhideWhenUsed="0"/>
+    <w:lsdException w:name="Light Shading Accent 6" w:semiHidden="0" w:uiPriority="60" w:unhideWhenUsed="0"/>
+    <w:lsdException w:name="Light List Accent 6" w:semiHidden="0" w:uiPriority="61" w:unhideWhenUsed="0"/>
+    <w:lsdException w:name="Light Grid Accent 6" w:semiHidden="0" w:uiPriority="62" w:unhideWhenUsed="0"/>
+    <w:lsdException w:name="Medium Shading 1 Accent 6" w:semiHidden="0" w:uiPriority="63" w:unhideWhenUsed="0"/>
+    <w:lsdException w:name="Medium Shading 2 Accent 6" w:semiHidden="0" w:uiPriority="64" w:unhideWhenUsed="0"/>
+    <w:lsdException w:name="Medium List 1 Accent 6" w:semiHidden="0" w:uiPriority="65" w:unhideWhenUsed="0"/>
+    <w:lsdException w:name="Medium List 2 Accent 6" w:semiHidden="0" w:uiPriority="66" w:unhideWhenUsed="0"/>
+    <w:lsdException w:name="Medium Grid 1 Accent 6" w:semiHidden="0" w:uiPriority="67" w:unhideWhenUsed="0"/>
+    <w:lsdException w:name="Medium Grid 2 Accent 6" w:semiHidden="0" w:uiPriority="68" w:unhideWhenUsed="0"/>
+    <w:lsdException w:name="Medium Grid 3 Accent 6" w:semiHidden="0" w:uiPriority="69" w:unhideWhenUsed="0"/>
+    <w:lsdException w:name="Dark List Accent 6" w:semiHidden="0" w:uiPriority="70" w:unhideWhenUsed="0"/>
+    <w:lsdException w:name="Colorful Shading Accent 6" w:semiHidden="0" w:uiPriority="71" w:unhideWhenUsed="0"/>
+    <w:lsdException w:name="Colorful List Accent 6" w:semiHidden="0" w:uiPriority="72" w:unhideWhenUsed="0"/>
+    <w:lsdException w:name="Colorful Grid Accent 6" w:semiHidden="0" w:uiPriority="73" w:unhideWhenUsed="0"/>
+    <w:lsdException w:name="Subtle Emphasis" w:semiHidden="0" w:uiPriority="19" w:unhideWhenUsed="0" w:qFormat="1"/>
+    <w:lsdException w:name="Intense Emphasis" w:semiHidden="0" w:uiPriority="21" w:unhideWhenUsed="0" w:qFormat="1"/>
+    <w:lsdException w:name="Subtle Reference" w:semiHidden="0" w:uiPriority="31" w:unhideWhenUsed="0" w:qFormat="1"/>
+    <w:lsdException w:name="Intense Reference" w:semiHidden="0" w:uiPriority="32" w:unhideWhenUsed="0" w:qFormat="1"/>
+    <w:lsdException w:name="Book Title" w:semiHidden="0" w:uiPriority="33" w:unhideWhenUsed="0" w:qFormat="1"/>
+    <w:lsdException w:name="Bibliography" w:uiPriority="37"/>
+    <w:lsdException w:name="TOC Heading" w:uiPriority="39" w:qFormat="1"/>
+  </w:latentStyles>
+  <w:style w:type="paragraph" w:default="1" w:styleId="Normal">
+    <w:name w:val="Normal"/>
+    <w:qFormat/>
+    <w:rsid w:val="004B70AF"/>
+    <w:pPr>
+      <w:spacing w:after="200" w:line="276" w:lineRule="auto"/>
+    </w:pPr>
+    <w:rPr>
+      <w:rFonts w:ascii="Calibri" w:eastAsia="Calibri" w:hAnsi="Calibri" w:cs="Calibri"/>
+    </w:rPr>
+  </w:style>
+  <w:style w:type="paragraph" w:styleId="Ttulo1">
+    <w:name w:val="heading 1"/>
+    <w:basedOn w:val="Normal"/>
+    <w:next w:val="Normal"/>
+    <w:link w:val="Ttulo1Char"/>
+    <w:uiPriority w:val="9"/>
+    <w:qFormat/>
+    <w:rsid w:val="004B70AF"/>
+    <w:pPr>
+      <w:keepNext/>
+      <w:keepLines/>
+      <w:spacing w:before="120" w:after="0" w:line="240" w:lineRule="auto"/>
+      <w:outlineLvl w:val="0"/>
+    </w:pPr>
+    <w:rPr>
+      <w:rFonts w:asciiTheme="majorHAnsi" w:eastAsiaTheme="majorEastAsia" w:hAnsiTheme="majorHAnsi" w:cstheme="majorBidi"/>
+      <w:b/>
+      <w:bCs/>
+      <w:color w:val="2E74B5" w:themeColor="accent1" w:themeShade="BF"/>
+      <w:sz w:val="28"/>
+      <w:szCs w:val="28"/>
+    </w:rPr>
+  </w:style>
+  <w:style w:type="paragraph" w:styleId="Ttulo2">
+    <w:name w:val="heading 2"/>
+    <w:basedOn w:val="Normal"/>
+    <w:next w:val="Normal"/>
+    <w:link w:val="Ttulo2Char"/>
+    <w:uiPriority w:val="9"/>
+    <w:semiHidden/>
+    <w:unhideWhenUsed/>
+    <w:qFormat/>
+    <w:rsid w:val="00B06E0F"/>
+    <w:pPr>
+      <w:keepNext/>
+      <w:keepLines/>
+      <w:spacing w:before="40" w:after="0"/>
+      <w:outlineLvl w:val="1"/>
+    </w:pPr>
+    <w:rPr>
+      <w:rFonts w:asciiTheme="majorHAnsi" w:eastAsiaTheme="majorEastAsia" w:hAnsiTheme="majorHAnsi" w:cstheme="majorBidi"/>
+      <w:color w:val="2E74B5" w:themeColor="accent1" w:themeShade="BF"/>
+      <w:sz w:val="26"/>
+      <w:szCs w:val="26"/>
+    </w:rPr>
+  </w:style>
+  <w:style w:type="paragraph" w:styleId="Ttulo3">
+    <w:name w:val="heading 3"/>
+    <w:basedOn w:val="Normal"/>
+    <w:next w:val="Normal"/>
+    <w:link w:val="Ttulo3Char"/>
+    <w:uiPriority w:val="9"/>
+    <w:unhideWhenUsed/>
+    <w:qFormat/>
+    <w:rsid w:val="00B06E0F"/>
+    <w:pPr>
+      <w:keepNext/>
+      <w:keepLines/>
+      <w:spacing w:before="40" w:after="0" w:line="288" w:lineRule="auto"/>
+      <w:outlineLvl w:val="2"/>
+    </w:pPr>
+    <w:rPr>
+      <w:rFonts w:asciiTheme="majorHAnsi" w:eastAsiaTheme="majorEastAsia" w:hAnsiTheme="majorHAnsi" w:cstheme="majorBidi"/>
+      <w:color w:val="1F4D78" w:themeColor="accent1" w:themeShade="7F"/>
+      <w:sz w:val="24"/>
+      <w:szCs w:val="24"/>
+      <w:lang w:eastAsia="pt-BR"/>
+    </w:rPr>
+  </w:style>
+  <w:style w:type="paragraph" w:styleId="Ttulo4">
+    <w:name w:val="heading 4"/>
+    <w:basedOn w:val="Normal"/>
+    <w:next w:val="Normal"/>
+    <w:link w:val="Ttulo4Char"/>
+    <w:uiPriority w:val="9"/>
+    <w:unhideWhenUsed/>
+    <w:qFormat/>
+    <w:rsid w:val="00B06E0F"/>
+    <w:pPr>
+      <w:keepNext/>
+      <w:keepLines/>
+      <w:spacing w:before="40" w:after="0" w:line="288" w:lineRule="auto"/>
+      <w:outlineLvl w:val="3"/>
+    </w:pPr>
+    <w:rPr>
+      <w:rFonts w:asciiTheme="majorHAnsi" w:eastAsiaTheme="majorEastAsia" w:hAnsiTheme="majorHAnsi" w:cstheme="majorBidi"/>
+      <w:i/>
+      <w:iCs/>
+      <w:color w:val="2E74B5" w:themeColor="accent1" w:themeShade="BF"/>
+      <w:sz w:val="18"/>
+      <w:szCs w:val="20"/>
+      <w:lang w:eastAsia="pt-BR"/>
+    </w:rPr>
+  </w:style>
+  <w:style w:type="character" w:default="1" w:styleId="Fontepargpadro">
+    <w:name w:val="Default Paragraph Font"/>
+    <w:uiPriority w:val="1"/>
+    <w:semiHidden/>
+    <w:unhideWhenUsed/>
+  </w:style>
+  <w:style w:type="table" w:default="1" w:styleId="Tabelanormal">
+    <w:name w:val="Normal Table"/>
+    <w:uiPriority w:val="99"/>
+    <w:semiHidden/>
+    <w:unhideWhenUsed/>
+    <w:tblPr>
+      <w:tblInd w:w="0" w:type="dxa"/>
+      <w:tblCellMar>
+        <w:top w:w="0" w:type="dxa"/>
+        <w:left w:w="108" w:type="dxa"/>
+        <w:bottom w:w="0" w:type="dxa"/>
+        <w:right w:w="108" w:type="dxa"/>
+      </w:tblCellMar>
+    </w:tblPr>
+  </w:style>
+  <w:style w:type="numbering" w:default="1" w:styleId="Semlista">
+    <w:name w:val="No List"/>
+    <w:uiPriority w:val="99"/>
+    <w:semiHidden/>
+    <w:unhideWhenUsed/>
+  </w:style>
+  <w:style w:type="character" w:customStyle="1" w:styleId="Ttulo1Char">
+    <w:name w:val="Título 1 Char"/>
+    <w:basedOn w:val="Fontepargpadro"/>
+    <w:link w:val="Ttulo1"/>
+    <w:uiPriority w:val="9"/>
+    <w:rsid w:val="004B70AF"/>
+    <w:rPr>
+      <w:rFonts w:asciiTheme="majorHAnsi" w:eastAsiaTheme="majorEastAsia" w:hAnsiTheme="majorHAnsi" w:cstheme="majorBidi"/>
+      <w:b/>
+      <w:bCs/>
+      <w:color w:val="2E74B5" w:themeColor="accent1" w:themeShade="BF"/>
+      <w:sz w:val="28"/>
+      <w:szCs w:val="28"/>
+    </w:rPr>
+  </w:style>
+  <w:style w:type="paragraph" w:styleId="Cabealho">
+    <w:name w:val="header"/>
+    <w:basedOn w:val="Normal"/>
+    <w:link w:val="CabealhoChar"/>
+    <w:uiPriority w:val="99"/>
+    <w:unhideWhenUsed/>
+    <w:rsid w:val="008B21D8"/>
+    <w:pPr>
+      <w:tabs>
+        <w:tab w:val="center" w:pos="4252"/>
+        <w:tab w:val="right" w:pos="8504"/>
+      </w:tabs>
+      <w:spacing w:after="0" w:line="240" w:lineRule="auto"/>
+    </w:pPr>
+  </w:style>
+  <w:style w:type="character" w:customStyle="1" w:styleId="CabealhoChar">
+    <w:name w:val="Cabeçalho Char"/>
+    <w:basedOn w:val="Fontepargpadro"/>
+    <w:link w:val="Cabealho"/>
+    <w:uiPriority w:val="99"/>
+    <w:rsid w:val="008B21D8"/>
+    <w:rPr>
+      <w:rFonts w:ascii="Calibri" w:eastAsia="Calibri" w:hAnsi="Calibri" w:cs="Calibri"/>
+    </w:rPr>
+  </w:style>
+  <w:style w:type="paragraph" w:styleId="Rodap">
+    <w:name w:val="footer"/>
+    <w:basedOn w:val="Normal"/>
+    <w:link w:val="RodapChar"/>
+    <w:uiPriority w:val="99"/>
+    <w:unhideWhenUsed/>
+    <w:rsid w:val="008B21D8"/>
+    <w:pPr>
+      <w:tabs>
+        <w:tab w:val="center" w:pos="4252"/>
+        <w:tab w:val="right" w:pos="8504"/>
+      </w:tabs>
+      <w:spacing w:after="0" w:line="240" w:lineRule="auto"/>
+    </w:pPr>
+  </w:style>
+  <w:style w:type="character" w:customStyle="1" w:styleId="RodapChar">
+    <w:name w:val="Rodapé Char"/>
+    <w:basedOn w:val="Fontepargpadro"/>
+    <w:link w:val="Rodap"/>
+    <w:uiPriority w:val="99"/>
+    <w:rsid w:val="008B21D8"/>
+    <w:rPr>
+      <w:rFonts w:ascii="Calibri" w:eastAsia="Calibri" w:hAnsi="Calibri" w:cs="Calibri"/>
+    </w:rPr>
+  </w:style>
+  <w:style w:type="paragraph" w:styleId="PargrafodaLista">
+    <w:name w:val="List Paragraph"/>
+    <w:basedOn w:val="Normal"/>
+    <w:uiPriority w:val="34"/>
+    <w:qFormat/>
+    <w:rsid w:val="001657AE"/>
+    <w:pPr>
+      <w:ind w:left="720"/>
+      <w:contextualSpacing/>
+    </w:pPr>
+  </w:style>
+  <w:style w:type="character" w:customStyle="1" w:styleId="Ttulo2Char">
+    <w:name w:val="Título 2 Char"/>
+    <w:basedOn w:val="Fontepargpadro"/>
+    <w:link w:val="Ttulo2"/>
+    <w:uiPriority w:val="9"/>
+    <w:semiHidden/>
+    <w:rsid w:val="00B06E0F"/>
+    <w:rPr>
+      <w:rFonts w:asciiTheme="majorHAnsi" w:eastAsiaTheme="majorEastAsia" w:hAnsiTheme="majorHAnsi" w:cstheme="majorBidi"/>
+      <w:color w:val="2E74B5" w:themeColor="accent1" w:themeShade="BF"/>
+      <w:sz w:val="26"/>
+      <w:szCs w:val="26"/>
+    </w:rPr>
+  </w:style>
+  <w:style w:type="character" w:customStyle="1" w:styleId="Ttulo3Char">
+    <w:name w:val="Título 3 Char"/>
+    <w:basedOn w:val="Fontepargpadro"/>
+    <w:link w:val="Ttulo3"/>
+    <w:uiPriority w:val="9"/>
+    <w:rsid w:val="00B06E0F"/>
+    <w:rPr>
+      <w:rFonts w:asciiTheme="majorHAnsi" w:eastAsiaTheme="majorEastAsia" w:hAnsiTheme="majorHAnsi" w:cstheme="majorBidi"/>
+      <w:color w:val="1F4D78" w:themeColor="accent1" w:themeShade="7F"/>
+      <w:sz w:val="24"/>
+      <w:szCs w:val="24"/>
+      <w:lang w:eastAsia="pt-BR"/>
+    </w:rPr>
+  </w:style>
+  <w:style w:type="character" w:customStyle="1" w:styleId="Ttulo4Char">
+    <w:name w:val="Título 4 Char"/>
+    <w:basedOn w:val="Fontepargpadro"/>
+    <w:link w:val="Ttulo4"/>
+    <w:uiPriority w:val="9"/>
+    <w:rsid w:val="00B06E0F"/>
+    <w:rPr>
+      <w:rFonts w:asciiTheme="majorHAnsi" w:eastAsiaTheme="majorEastAsia" w:hAnsiTheme="majorHAnsi" w:cstheme="majorBidi"/>
+      <w:i/>
+      <w:iCs/>
+      <w:color w:val="2E74B5" w:themeColor="accent1" w:themeShade="BF"/>
+      <w:sz w:val="18"/>
+      <w:szCs w:val="20"/>
+      <w:lang w:eastAsia="pt-BR"/>
+    </w:rPr>
+  </w:style>
+  <w:style w:type="character" w:styleId="Forte">
+    <w:name w:val="Strong"/>
+    <w:basedOn w:val="Fontepargpadro"/>
+    <w:uiPriority w:val="22"/>
+    <w:qFormat/>
+    <w:rsid w:val="003B5EB7"/>
+    <w:rPr>
+      <w:b/>
+      <w:bCs/>
+    </w:rPr>
+  </w:style>
+</w:styles>
+</file>
+
+<file path=word/stylesWithEffects.xml><?xml version="1.0" encoding="utf-8"?>
+<w:styles xmlns:wpc="http://schemas.microsoft.com/office/word/2010/wordprocessingCanvas" xmlns:mc="http://schemas.openxmlformats.org/markup-compatibility/2006" xmlns:o="urn:schemas-microsoft-com:office:office" xmlns:r="http://schemas.openxmlformats.org/officeDocument/2006/relationships" xmlns:m="http://schemas.openxmlformats.org/officeDocument/2006/math" xmlns:v="urn:schemas-microsoft-com:vml" xmlns:wp14="http://schemas.microsoft.com/office/word/2010/wordprocessingDrawing" xmlns:wp="http://schemas.openxmlformats.org/drawingml/2006/wordprocessingDrawing" xmlns:w10="urn:schemas-microsoft-com:office:word" xmlns:w="http://schemas.openxmlformats.org/wordprocessingml/2006/main" xmlns:w14="http://schemas.microsoft.com/office/word/2010/wordml" xmlns:wpg="http://schemas.microsoft.com/office/word/2010/wordprocessingGroup" xmlns:wpi="http://schemas.microsoft.com/office/word/2010/wordprocessingInk" xmlns:wne="http://schemas.microsoft.com/office/word/2006/wordml" xmlns:wps="http://schemas.microsoft.com/office/word/2010/wordprocessingShape" mc:Ignorable="w14 wp14">
+  <w:docDefaults>
+    <w:rPrDefault>
+      <w:rPr>
+        <w:rFonts w:asciiTheme="minorHAnsi" w:eastAsiaTheme="minorHAnsi" w:hAnsiTheme="minorHAnsi" w:cstheme="minorBidi"/>
+        <w:sz w:val="22"/>
+        <w:szCs w:val="22"/>
+        <w:lang w:val="pt-BR" w:eastAsia="en-US" w:bidi="ar-SA"/>
+      </w:rPr>
+    </w:rPrDefault>
+    <w:pPrDefault>
+      <w:pPr>
+        <w:spacing w:after="160" w:line="259" w:lineRule="auto"/>
+      </w:pPr>
+    </w:pPrDefault>
+  </w:docDefaults>
+  <w:latentStyles w:defLockedState="0" w:defUIPriority="99" w:defSemiHidden="1" w:defUnhideWhenUsed="1" w:defQFormat="0" w:count="267">
+    <w:lsdException w:name="Normal" w:semiHidden="0" w:uiPriority="0" w:unhideWhenUsed="0" w:qFormat="1"/>
+    <w:lsdException w:name="heading 1" w:semiHidden="0" w:uiPriority="9" w:unhideWhenUsed="0" w:qFormat="1"/>
+    <w:lsdException w:name="heading 2" w:uiPriority="9" w:qFormat="1"/>
+    <w:lsdException w:name="heading 3" w:uiPriority="9" w:qFormat="1"/>
+    <w:lsdException w:name="heading 4" w:uiPriority="9" w:qFormat="1"/>
+    <w:lsdException w:name="heading 5" w:uiPriority="9" w:qFormat="1"/>
+    <w:lsdException w:name="heading 6" w:uiPriority="9" w:qFormat="1"/>
+    <w:lsdException w:name="heading 7" w:uiPriority="9" w:qFormat="1"/>
+    <w:lsdException w:name="heading 8" w:uiPriority="9" w:qFormat="1"/>
+    <w:lsdException w:name="heading 9" w:uiPriority="9" w:qFormat="1"/>
+    <w:lsdException w:name="toc 1" w:uiPriority="39"/>
+    <w:lsdException w:name="toc 2" w:uiPriority="39"/>
+    <w:lsdException w:name="toc 3" w:uiPriority="39"/>
+    <w:lsdException w:name="toc 4" w:uiPriority="39"/>
+    <w:lsdException w:name="toc 5" w:uiPriority="39"/>
+    <w:lsdException w:name="toc 6" w:uiPriority="39"/>
+    <w:lsdException w:name="toc 7" w:uiPriority="39"/>
+    <w:lsdException w:name="toc 8" w:uiPriority="39"/>
+    <w:lsdException w:name="toc 9" w:uiPriority="39"/>
+    <w:lsdException w:name="caption" w:uiPriority="35" w:qFormat="1"/>
+    <w:lsdException w:name="Title" w:semiHidden="0" w:uiPriority="10" w:unhideWhenUsed="0" w:qFormat="1"/>
+    <w:lsdException w:name="Default Paragraph Font" w:uiPriority="1"/>
+    <w:lsdException w:name="Subtitle" w:semiHidden="0" w:uiPriority="11" w:unhideWhenUsed="0" w:qFormat="1"/>
+    <w:lsdException w:name="Strong" w:semiHidden="0" w:uiPriority="22" w:unhideWhenUsed="0" w:qFormat="1"/>
+    <w:lsdException w:name="Emphasis" w:semiHidden="0" w:uiPriority="20" w:unhideWhenUsed="0" w:qFormat="1"/>
+    <w:lsdException w:name="Table Grid" w:semiHidden="0" w:uiPriority="39" w:unhideWhenUsed="0"/>
+    <w:lsdException w:name="Placeholder Text" w:unhideWhenUsed="0"/>
+    <w:lsdException w:name="No Spacing" w:semiHidden="0" w:uiPriority="1" w:unhideWhenUsed="0" w:qFormat="1"/>
+    <w:lsdException w:name="Light Shading" w:semiHidden="0" w:uiPriority="60" w:unhideWhenUsed="0"/>
+    <w:lsdException w:name="Light List" w:semiHidden="0" w:uiPriority="61" w:unhideWhenUsed="0"/>
+    <w:lsdException w:name="Light Grid" w:semiHidden="0" w:uiPriority="62" w:unhideWhenUsed="0"/>
+    <w:lsdException w:name="Medium Shading 1" w:semiHidden="0" w:uiPriority="63" w:unhideWhenUsed="0"/>
+    <w:lsdException w:name="Medium Shading 2" w:semiHidden="0" w:uiPriority="64" w:unhideWhenUsed="0"/>
+    <w:lsdException w:name="Medium List 1" w:semiHidden="0" w:uiPriority="65" w:unhideWhenUsed="0"/>
+    <w:lsdException w:name="Medium List 2" w:semiHidden="0" w:uiPriority="66" w:unhideWhenUsed="0"/>
+    <w:lsdException w:name="Medium Grid 1" w:semiHidden="0" w:uiPriority="67" w:unhideWhenUsed="0"/>
+    <w:lsdException w:name="Medium Grid 2" w:semiHidden="0" w:uiPriority="68" w:unhideWhenUsed="0"/>
+    <w:lsdException w:name="Medium Grid 3" w:semiHidden="0" w:uiPriority="69" w:unhideWhenUsed="0"/>
+    <w:lsdException w:name="Dark List" w:semiHidden="0" w:uiPriority="70" w:unhideWhenUsed="0"/>
+    <w:lsdException w:name="Colorful Shading" w:semiHidden="0" w:uiPriority="71" w:unhideWhenUsed="0"/>
+    <w:lsdException w:name="Colorful List" w:semiHidden="0" w:uiPriority="72" w:unhideWhenUsed="0"/>
+    <w:lsdException w:name="Colorful Grid" w:semiHidden="0" w:uiPriority="73" w:unhideWhenUsed="0"/>
+    <w:lsdException w:name="Light Shading Accent 1" w:semiHidden="0" w:uiPriority="60" w:unhideWhenUsed="0"/>
+    <w:lsdException w:name="Light List Accent 1" w:semiHidden="0" w:uiPriority="61" w:unhideWhenUsed="0"/>
+    <w:lsdException w:name="Light Grid Accent 1" w:semiHidden="0" w:uiPriority="62" w:unhideWhenUsed="0"/>
+    <w:lsdException w:name="Medium Shading 1 Accent 1" w:semiHidden="0" w:uiPriority="63" w:unhideWhenUsed="0"/>
+    <w:lsdException w:name="Medium Shading 2 Accent 1" w:semiHidden="0" w:uiPriority="64" w:unhideWhenUsed="0"/>
+    <w:lsdException w:name="Medium List 1 Accent 1" w:semiHidden="0" w:uiPriority="65" w:unhideWhenUsed="0"/>
+    <w:lsdException w:name="Revision" w:unhideWhenUsed="0"/>
+    <w:lsdException w:name="List Paragraph" w:semiHidden="0" w:uiPriority="34" w:unhideWhenUsed="0" w:qFormat="1"/>
+    <w:lsdException w:name="Quote" w:semiHidden="0" w:uiPriority="29" w:unhideWhenUsed="0" w:qFormat="1"/>
+    <w:lsdException w:name="Intense Quote" w:semiHidden="0" w:uiPriority="30" w:unhideWhenUsed="0" w:qFormat="1"/>
+    <w:lsdException w:name="Medium List 2 Accent 1" w:semiHidden="0" w:uiPriority="66" w:unhideWhenUsed="0"/>
+    <w:lsdException w:name="Medium Grid 1 Accent 1" w:semiHidden="0" w:uiPriority="67" w:unhideWhenUsed="0"/>
+    <w:lsdException w:name="Medium Grid 2 Accent 1" w:semiHidden="0" w:uiPriority="68" w:unhideWhenUsed="0"/>
+    <w:lsdException w:name="Medium Grid 3 Accent 1" w:semiHidden="0" w:uiPriority="69" w:unhideWhenUsed="0"/>
+    <w:lsdException w:name="Dark List Accent 1" w:semiHidden="0" w:uiPriority="70" w:unhideWhenUsed="0"/>
+    <w:lsdException w:name="Colorful Shading Accent 1" w:semiHidden="0" w:uiPriority="71" w:unhideWhenUsed="0"/>
+    <w:lsdException w:name="Colorful List Accent 1" w:semiHidden="0" w:uiPriority="72" w:unhideWhenUsed="0"/>
+    <w:lsdException w:name="Colorful Grid Accent 1" w:semiHidden="0" w:uiPriority="73" w:unhideWhenUsed="0"/>
+    <w:lsdException w:name="Light Shading Accent 2" w:semiHidden="0" w:uiPriority="60" w:unhideWhenUsed="0"/>
+    <w:lsdException w:name="Light List Accent 2" w:semiHidden="0" w:uiPriority="61" w:unhideWhenUsed="0"/>
+    <w:lsdException w:name="Light Grid Accent 2" w:semiHidden="0" w:uiPriority="62" w:unhideWhenUsed="0"/>
+    <w:lsdException w:name="Medium Shading 1 Accent 2" w:semiHidden="0" w:uiPriority="63" w:unhideWhenUsed="0"/>
+    <w:lsdException w:name="Medium Shading 2 Accent 2" w:semiHidden="0" w:uiPriority="64" w:unhideWhenUsed="0"/>
+    <w:lsdException w:name="Medium List 1 Accent 2" w:semiHidden="0" w:uiPriority="65" w:unhideWhenUsed="0"/>
+    <w:lsdException w:name="Medium List 2 Accent 2" w:semiHidden="0" w:uiPriority="66" w:unhideWhenUsed="0"/>
+    <w:lsdException w:name="Medium Grid 1 Accent 2" w:semiHidden="0" w:uiPriority="67" w:unhideWhenUsed="0"/>
+    <w:lsdException w:name="Medium Grid 2 Accent 2" w:semiHidden="0" w:uiPriority="68" w:unhideWhenUsed="0"/>
+    <w:lsdException w:name="Medium Grid 3 Accent 2" w:semiHidden="0" w:uiPriority="69" w:unhideWhenUsed="0"/>
+    <w:lsdException w:name="Dark List Accent 2" w:semiHidden="0" w:uiPriority="70" w:unhideWhenUsed="0"/>
+    <w:lsdException w:name="Colorful Shading Accent 2" w:semiHidden="0" w:uiPriority="71" w:unhideWhenUsed="0"/>
+    <w:lsdException w:name="Colorful List Accent 2" w:semiHidden="0" w:uiPriority="72" w:unhideWhenUsed="0"/>
+    <w:lsdException w:name="Colorful Grid Accent 2" w:semiHidden="0" w:uiPriority="73" w:unhideWhenUsed="0"/>
+    <w:lsdException w:name="Light Shading Accent 3" w:semiHidden="0" w:uiPriority="60" w:unhideWhenUsed="0"/>
+    <w:lsdException w:name="Light List Accent 3" w:semiHidden="0" w:uiPriority="61" w:unhideWhenUsed="0"/>
+    <w:lsdException w:name="Light Grid Accent 3" w:semiHidden="0" w:uiPriority="62" w:unhideWhenUsed="0"/>
+    <w:lsdException w:name="Medium Shading 1 Accent 3" w:semiHidden="0" w:uiPriority="63" w:unhideWhenUsed="0"/>
+    <w:lsdException w:name="Medium Shading 2 Accent 3" w:semiHidden="0" w:uiPriority="64" w:unhideWhenUsed="0"/>
+    <w:lsdException w:name="Medium List 1 Accent 3" w:semiHidden="0" w:uiPriority="65" w:unhideWhenUsed="0"/>
+    <w:lsdException w:name="Medium List 2 Accent 3" w:semiHidden="0" w:uiPriority="66" w:unhideWhenUsed="0"/>
+    <w:lsdException w:name="Medium Grid 1 Accent 3" w:semiHidden="0" w:uiPriority="67" w:unhideWhenUsed="0"/>
+    <w:lsdException w:name="Medium Grid 2 Accent 3" w:semiHidden="0" w:uiPriority="68" w:unhideWhenUsed="0"/>
+    <w:lsdException w:name="Medium Grid 3 Accent 3" w:semiHidden="0" w:uiPriority="69" w:unhideWhenUsed="0"/>
+    <w:lsdException w:name="Dark List Accent 3" w:semiHidden="0" w:uiPriority="70" w:unhideWhenUsed="0"/>
+    <w:lsdException w:name="Colorful Shading Accent 3" w:semiHidden="0" w:uiPriority="71" w:unhideWhenUsed="0"/>
+    <w:lsdException w:name="Colorful List Accent 3" w:semiHidden="0" w:uiPriority="72" w:unhideWhenUsed="0"/>
+    <w:lsdException w:name="Colorful Grid Accent 3" w:semiHidden="0" w:uiPriority="73" w:unhideWhenUsed="0"/>
+    <w:lsdException w:name="Light Shading Accent 4" w:semiHidden="0" w:uiPriority="60" w:unhideWhenUsed="0"/>
+    <w:lsdException w:name="Light List Accent 4" w:semiHidden="0" w:uiPriority="61" w:unhideWhenUsed="0"/>
+    <w:lsdException w:name="Light Grid Accent 4" w:semiHidden="0" w:uiPriority="62" w:unhideWhenUsed="0"/>
+    <w:lsdException w:name="Medium Shading 1 Accent 4" w:semiHidden="0" w:uiPriority="63" w:unhideWhenUsed="0"/>
+    <w:lsdException w:name="Medium Shading 2 Accent 4" w:semiHidden="0" w:uiPriority="64" w:unhideWhenUsed="0"/>
+    <w:lsdException w:name="Medium List 1 Accent 4" w:semiHidden="0" w:uiPriority="65" w:unhideWhenUsed="0"/>
+    <w:lsdException w:name="Medium List 2 Accent 4" w:semiHidden="0" w:uiPriority="66" w:unhideWhenUsed="0"/>
+    <w:lsdException w:name="Medium Grid 1 Accent 4" w:semiHidden="0" w:uiPriority="67" w:unhideWhenUsed="0"/>
+    <w:lsdException w:name="Medium Grid 2 Accent 4" w:semiHidden="0" w:uiPriority="68" w:unhideWhenUsed="0"/>
+    <w:lsdException w:name="Medium Grid 3 Accent 4" w:semiHidden="0" w:uiPriority="69" w:unhideWhenUsed="0"/>
+    <w:lsdException w:name="Dark List Accent 4" w:semiHidden="0" w:uiPriority="70" w:unhideWhenUsed="0"/>
+    <w:lsdException w:name="Colorful Shading Accent 4" w:semiHidden="0" w:uiPriority="71" w:unhideWhenUsed="0"/>
+    <w:lsdException w:name="Colorful List Accent 4" w:semiHidden="0" w:uiPriority="72" w:unhideWhenUsed="0"/>
+    <w:lsdException w:name="Colorful Grid Accent 4" w:semiHidden="0" w:uiPriority="73" w:unhideWhenUsed="0"/>
+    <w:lsdException w:name="Light Shading Accent 5" w:semiHidden="0" w:uiPriority="60" w:unhideWhenUsed="0"/>
+    <w:lsdException w:name="Light List Accent 5" w:semiHidden="0" w:uiPriority="61" w:unhideWhenUsed="0"/>
+    <w:lsdException w:name="Light Grid Accent 5" w:semiHidden="0" w:uiPriority="62" w:unhideWhenUsed="0"/>
+    <w:lsdException w:name="Medium Shading 1 Accent 5" w:semiHidden="0" w:uiPriority="63" w:unhideWhenUsed="0"/>
+    <w:lsdException w:name="Medium Shading 2 Accent 5" w:semiHidden="0" w:uiPriority="64" w:unhideWhenUsed="0"/>
+    <w:lsdException w:name="Medium List 1 Accent 5" w:semiHidden="0" w:uiPriority="65" w:unhideWhenUsed="0"/>
+    <w:lsdException w:name="Medium List 2 Accent 5" w:semiHidden="0" w:uiPriority="66" w:unhideWhenUsed="0"/>
+    <w:lsdException w:name="Medium Grid 1 Accent 5" w:semiHidden="0" w:uiPriority="67" w:unhideWhenUsed="0"/>
+    <w:lsdException w:name="Medium Grid 2 Accent 5" w:semiHidden="0" w:uiPriority="68" w:unhideWhenUsed="0"/>
+    <w:lsdException w:name="Medium Grid 3 Accent 5" w:semiHidden="0" w:uiPriority="69" w:unhideWhenUsed="0"/>
+    <w:lsdException w:name="Dark List Accent 5" w:semiHidden="0" w:uiPriority="70" w:unhideWhenUsed="0"/>
+    <w:lsdException w:name="Colorful Shading Accent 5" w:semiHidden="0" w:uiPriority="71" w:unhideWhenUsed="0"/>
+    <w:lsdException w:name="Colorful List Accent 5" w:semiHidden="0" w:uiPriority="72" w:unhideWhenUsed="0"/>
+    <w:lsdException w:name="Colorful Grid Accent 5" w:semiHidden="0" w:uiPriority="73" w:unhideWhenUsed="0"/>
+    <w:lsdException w:name="Light Shading Accent 6" w:semiHidden="0" w:uiPriority="60" w:unhideWhenUsed="0"/>
+    <w:lsdException w:name="Light List Accent 6" w:semiHidden="0" w:uiPriority="61" w:unhideWhenUsed="0"/>
+    <w:lsdException w:name="Light Grid Accent 6" w:semiHidden="0" w:uiPriority="62" w:unhideWhenUsed="0"/>
+    <w:lsdException w:name="Medium Shading 1 Accent 6" w:semiHidden="0" w:uiPriority="63" w:unhideWhenUsed="0"/>
+    <w:lsdException w:name="Medium Shading 2 Accent 6" w:semiHidden="0" w:uiPriority="64" w:unhideWhenUsed="0"/>
+    <w:lsdException w:name="Medium List 1 Accent 6" w:semiHidden="0" w:uiPriority="65" w:unhideWhenUsed="0"/>
+    <w:lsdException w:name="Medium List 2 Accent 6" w:semiHidden="0" w:uiPriority="66" w:unhideWhenUsed="0"/>
+    <w:lsdException w:name="Medium Grid 1 Accent 6" w:semiHidden="0" w:uiPriority="67" w:unhideWhenUsed="0"/>
+    <w:lsdException w:name="Medium Grid 2 Accent 6" w:semiHidden="0" w:uiPriority="68" w:unhideWhenUsed="0"/>
+    <w:lsdException w:name="Medium Grid 3 Accent 6" w:semiHidden="0" w:uiPriority="69" w:unhideWhenUsed="0"/>
+    <w:lsdException w:name="Dark List Accent 6" w:semiHidden="0" w:uiPriority="70" w:unhideWhenUsed="0"/>
+    <w:lsdException w:name="Colorful Shading Accent 6" w:semiHidden="0" w:uiPriority="71" w:unhideWhenUsed="0"/>
+    <w:lsdException w:name="Colorful List Accent 6" w:semiHidden="0" w:uiPriority="72" w:unhideWhenUsed="0"/>
+    <w:lsdException w:name="Colorful Grid Accent 6" w:semiHidden="0" w:uiPriority="73" w:unhideWhenUsed="0"/>
+    <w:lsdException w:name="Subtle Emphasis" w:semiHidden="0" w:uiPriority="19" w:unhideWhenUsed="0" w:qFormat="1"/>
+    <w:lsdException w:name="Intense Emphasis" w:semiHidden="0" w:uiPriority="21" w:unhideWhenUsed="0" w:qFormat="1"/>
+    <w:lsdException w:name="Subtle Reference" w:semiHidden="0" w:uiPriority="31" w:unhideWhenUsed="0" w:qFormat="1"/>
+    <w:lsdException w:name="Intense Reference" w:semiHidden="0" w:uiPriority="32" w:unhideWhenUsed="0" w:qFormat="1"/>
+    <w:lsdException w:name="Book Title" w:semiHidden="0" w:uiPriority="33" w:unhideWhenUsed="0" w:qFormat="1"/>
+    <w:lsdException w:name="Bibliography" w:uiPriority="37"/>
+    <w:lsdException w:name="TOC Heading" w:uiPriority="39" w:qFormat="1"/>
   </w:latentStyles>
   <w:style w:type="paragraph" w:default="1" w:styleId="Normal">
     <w:name w:val="Normal"/>
@@ -2129,7 +2321,7 @@
     </a:clrScheme>
     <a:fontScheme name="Escritório">
       <a:majorFont>
-        <a:latin typeface="Calibri Light" panose="020F0302020204030204"/>
+        <a:latin typeface="Calibri Light"/>
         <a:ea typeface=""/>
         <a:cs typeface=""/>
         <a:font script="Jpan" typeface="ＭＳ ゴシック"/>
@@ -2164,7 +2356,7 @@
         <a:font script="Geor" typeface="Sylfaen"/>
       </a:majorFont>
       <a:minorFont>
-        <a:latin typeface="Calibri" panose="020F0502020204030204"/>
+        <a:latin typeface="Calibri"/>
         <a:ea typeface=""/>
         <a:cs typeface=""/>
         <a:font script="Jpan" typeface="ＭＳ 明朝"/>
@@ -2341,7 +2533,7 @@
   <a:extraClrSchemeLst/>
   <a:extLst>
     <a:ext uri="{05A4C25C-085E-4340-85A3-A5531E510DB2}">
-      <thm15:themeFamily xmlns:thm15="http://schemas.microsoft.com/office/thememl/2012/main" name="Office Theme" id="{62F939B6-93AF-4DB8-9C6B-D6C7DFDC589F}" vid="{4A3C46E8-61CC-4603-A589-7422A47A8E4A}"/>
+      <thm15:themeFamily xmlns:thm15="http://schemas.microsoft.com/office/thememl/2012/main" xmlns="" name="Office Theme" id="{62F939B6-93AF-4DB8-9C6B-D6C7DFDC589F}" vid="{4A3C46E8-61CC-4603-A589-7422A47A8E4A}"/>
     </a:ext>
   </a:extLst>
 </a:theme>

</xml_diff>

<commit_message>
docs: Atualizacao de rquisitos nao funcionais
</commit_message>
<xml_diff>
--- a/ApêndiceB-Requisitos/PID_RequisitosNãoFuncionais.docx
+++ b/ApêndiceB-Requisitos/PID_RequisitosNãoFuncionais.docx
@@ -546,7 +546,7 @@
           <w:sz w:val="24"/>
           <w:szCs w:val="24"/>
         </w:rPr>
-        <w:t xml:space="preserve"> O sistema deve possuir boa legibilidade, com fontes adequadas e navegação simples.</w:t>
+        <w:t xml:space="preserve"> O sistema deve possuir boa legibilidade, com uso adequado de cores, contraste e tamanhos de fonte, facilitando o uso por pessoas idosas.</w:t>
       </w:r>
     </w:p>
     <w:p>
@@ -620,7 +620,7 @@
           <w:sz w:val="24"/>
           <w:szCs w:val="24"/>
         </w:rPr>
-        <w:t>Acessibilidade</w:t>
+        <w:t>Eficiência</w:t>
       </w:r>
     </w:p>
     <w:p>
@@ -752,7 +752,14 @@
           <w:color w:val="auto"/>
         </w:rPr>
         <w:lastRenderedPageBreak/>
-        <w:t>1.4 Portabilidade</w:t>
+        <w:t>1.5</w:t>
+      </w:r>
+      <w:r>
+        <w:rPr>
+          <w:rFonts w:ascii="Times New Roman" w:hAnsi="Times New Roman" w:cs="Times New Roman"/>
+          <w:color w:val="auto"/>
+        </w:rPr>
+        <w:t xml:space="preserve"> Portabilidade</w:t>
       </w:r>
       <w:bookmarkEnd w:id="4"/>
     </w:p>
@@ -861,7 +868,6 @@
         </w:rPr>
       </w:pPr>
       <w:bookmarkStart w:id="5" w:name="_Toc98916005"/>
-      <w:bookmarkStart w:id="6" w:name="_GoBack"/>
       <w:r>
         <w:rPr>
           <w:rFonts w:ascii="Times New Roman" w:hAnsi="Times New Roman" w:cs="Times New Roman"/>
@@ -903,7 +909,7 @@
           <w:color w:val="auto"/>
         </w:rPr>
       </w:pPr>
-      <w:bookmarkStart w:id="7" w:name="_Toc98916006"/>
+      <w:bookmarkStart w:id="6" w:name="_Toc98916006"/>
       <w:r>
         <w:rPr>
           <w:rFonts w:ascii="Times New Roman" w:hAnsi="Times New Roman" w:cs="Times New Roman"/>
@@ -911,16 +917,150 @@
         </w:rPr>
         <w:t>2.1 Entrega</w:t>
       </w:r>
+      <w:bookmarkEnd w:id="6"/>
+      <w:proofErr w:type="gramStart"/>
+      <w:r>
+        <w:rPr>
+          <w:rFonts w:ascii="Times New Roman" w:hAnsi="Times New Roman" w:cs="Times New Roman"/>
+          <w:color w:val="auto"/>
+        </w:rPr>
+        <w:t xml:space="preserve">  </w:t>
+      </w:r>
+    </w:p>
+    <w:p>
+      <w:pPr>
+        <w:rPr>
+          <w:lang w:eastAsia="pt-BR"/>
+        </w:rPr>
+      </w:pPr>
+      <w:proofErr w:type="gramEnd"/>
+    </w:p>
+    <w:p>
+      <w:pPr>
+        <w:rPr>
+          <w:rFonts w:ascii="Times New Roman" w:hAnsi="Times New Roman" w:cs="Times New Roman"/>
+          <w:sz w:val="24"/>
+          <w:szCs w:val="24"/>
+        </w:rPr>
+      </w:pPr>
+      <w:r>
+        <w:rPr>
+          <w:rFonts w:ascii="Times New Roman" w:hAnsi="Times New Roman" w:cs="Times New Roman"/>
+          <w:sz w:val="24"/>
+          <w:szCs w:val="24"/>
+        </w:rPr>
+        <w:t>O sistema deverá ser entregue em versão web funcional até o final do semestre.</w:t>
+      </w:r>
+    </w:p>
+    <w:p>
+      <w:pPr>
+        <w:pStyle w:val="Ttulo3"/>
+        <w:rPr>
+          <w:rFonts w:ascii="Times New Roman" w:hAnsi="Times New Roman" w:cs="Times New Roman"/>
+          <w:color w:val="auto"/>
+        </w:rPr>
+      </w:pPr>
+      <w:bookmarkStart w:id="7" w:name="_Toc98916007"/>
+      <w:r>
+        <w:rPr>
+          <w:rFonts w:ascii="Times New Roman" w:hAnsi="Times New Roman" w:cs="Times New Roman"/>
+          <w:color w:val="auto"/>
+        </w:rPr>
+        <w:t xml:space="preserve">2.2 </w:t>
+      </w:r>
+      <w:proofErr w:type="gramStart"/>
+      <w:r>
+        <w:rPr>
+          <w:rFonts w:ascii="Times New Roman" w:hAnsi="Times New Roman" w:cs="Times New Roman"/>
+          <w:color w:val="auto"/>
+        </w:rPr>
+        <w:t>Implementação</w:t>
+      </w:r>
       <w:bookmarkEnd w:id="7"/>
-    </w:p>
-    <w:p>
-      <w:pPr>
-        <w:rPr>
-          <w:rFonts w:ascii="Times New Roman" w:hAnsi="Times New Roman" w:cs="Times New Roman"/>
-          <w:sz w:val="24"/>
-          <w:szCs w:val="24"/>
-        </w:rPr>
-      </w:pPr>
+      <w:proofErr w:type="gramEnd"/>
+    </w:p>
+    <w:p>
+      <w:pPr>
+        <w:rPr>
+          <w:lang w:eastAsia="pt-BR"/>
+        </w:rPr>
+      </w:pPr>
+    </w:p>
+    <w:p>
+      <w:pPr>
+        <w:rPr>
+          <w:rFonts w:ascii="Times New Roman" w:hAnsi="Times New Roman" w:cs="Times New Roman"/>
+          <w:sz w:val="24"/>
+          <w:szCs w:val="24"/>
+        </w:rPr>
+      </w:pPr>
+      <w:r>
+        <w:rPr>
+          <w:rFonts w:ascii="Times New Roman" w:hAnsi="Times New Roman" w:cs="Times New Roman"/>
+          <w:sz w:val="24"/>
+          <w:szCs w:val="24"/>
+        </w:rPr>
+        <w:t>O sistema será desenvolvido utilizando</w:t>
+      </w:r>
+      <w:r>
+        <w:t xml:space="preserve"> </w:t>
+      </w:r>
+      <w:r>
+        <w:rPr>
+          <w:rFonts w:ascii="Times New Roman" w:hAnsi="Times New Roman" w:cs="Times New Roman"/>
+          <w:sz w:val="24"/>
+          <w:szCs w:val="24"/>
+        </w:rPr>
+        <w:t>Java (</w:t>
+      </w:r>
+      <w:proofErr w:type="spellStart"/>
+      <w:r>
+        <w:rPr>
+          <w:rFonts w:ascii="Times New Roman" w:hAnsi="Times New Roman" w:cs="Times New Roman"/>
+          <w:sz w:val="24"/>
+          <w:szCs w:val="24"/>
+        </w:rPr>
+        <w:t>backend</w:t>
+      </w:r>
+      <w:proofErr w:type="spellEnd"/>
+      <w:r>
+        <w:rPr>
+          <w:rFonts w:ascii="Times New Roman" w:hAnsi="Times New Roman" w:cs="Times New Roman"/>
+          <w:sz w:val="24"/>
+          <w:szCs w:val="24"/>
+        </w:rPr>
+        <w:t xml:space="preserve">) e </w:t>
+      </w:r>
+      <w:proofErr w:type="spellStart"/>
+      <w:proofErr w:type="gramStart"/>
+      <w:r>
+        <w:rPr>
+          <w:rFonts w:ascii="Times New Roman" w:hAnsi="Times New Roman" w:cs="Times New Roman"/>
+          <w:sz w:val="24"/>
+          <w:szCs w:val="24"/>
+        </w:rPr>
+        <w:t>PostgreSQL</w:t>
+      </w:r>
+      <w:proofErr w:type="spellEnd"/>
+      <w:proofErr w:type="gramEnd"/>
+      <w:r>
+        <w:rPr>
+          <w:rFonts w:ascii="Times New Roman" w:hAnsi="Times New Roman" w:cs="Times New Roman"/>
+          <w:sz w:val="24"/>
+          <w:szCs w:val="24"/>
+        </w:rPr>
+        <w:t xml:space="preserve"> (banco de dados)</w:t>
+      </w:r>
+      <w:bookmarkStart w:id="8" w:name="_GoBack"/>
+      <w:bookmarkEnd w:id="8"/>
+      <w:r>
+        <w:rPr>
+          <w:rFonts w:ascii="Times New Roman" w:hAnsi="Times New Roman" w:cs="Times New Roman"/>
+          <w:sz w:val="24"/>
+          <w:szCs w:val="24"/>
+        </w:rPr>
+        <w:t>.</w:t>
+      </w:r>
     </w:p>
     <w:p>
       <w:pPr>
@@ -930,15 +1070,75 @@
           <w:color w:val="auto"/>
         </w:rPr>
       </w:pPr>
-      <w:bookmarkStart w:id="8" w:name="_Toc98916007"/>
-      <w:r>
-        <w:rPr>
-          <w:rFonts w:ascii="Times New Roman" w:hAnsi="Times New Roman" w:cs="Times New Roman"/>
-          <w:color w:val="auto"/>
-        </w:rPr>
-        <w:t>2.2 Implementação</w:t>
-      </w:r>
-      <w:bookmarkEnd w:id="8"/>
+      <w:bookmarkStart w:id="9" w:name="_Toc98916008"/>
+      <w:r>
+        <w:rPr>
+          <w:rFonts w:ascii="Times New Roman" w:hAnsi="Times New Roman" w:cs="Times New Roman"/>
+          <w:color w:val="auto"/>
+        </w:rPr>
+        <w:t>2.3 Padrão</w:t>
+      </w:r>
+      <w:bookmarkEnd w:id="9"/>
+    </w:p>
+    <w:p>
+      <w:pPr>
+        <w:rPr>
+          <w:lang w:eastAsia="pt-BR"/>
+        </w:rPr>
+      </w:pPr>
+    </w:p>
+    <w:p>
+      <w:pPr>
+        <w:pStyle w:val="Ttulo3"/>
+        <w:rPr>
+          <w:rFonts w:ascii="Times New Roman" w:eastAsia="Calibri" w:hAnsi="Times New Roman" w:cs="Times New Roman"/>
+          <w:color w:val="auto"/>
+          <w:lang w:eastAsia="en-US"/>
+        </w:rPr>
+      </w:pPr>
+      <w:r>
+        <w:rPr>
+          <w:rFonts w:ascii="Times New Roman" w:eastAsia="Calibri" w:hAnsi="Times New Roman" w:cs="Times New Roman"/>
+          <w:color w:val="auto"/>
+          <w:lang w:eastAsia="en-US"/>
+        </w:rPr>
+        <w:t>O sistema deverá seguir padrões de desenvolvimento orientado a objetos e boas práticas de código.</w:t>
+      </w:r>
+    </w:p>
+    <w:p/>
+    <w:p>
+      <w:pPr>
+        <w:pStyle w:val="Ttulo2"/>
+        <w:rPr>
+          <w:rFonts w:ascii="Times New Roman" w:hAnsi="Times New Roman" w:cs="Times New Roman"/>
+          <w:b/>
+          <w:color w:val="auto"/>
+          <w:sz w:val="24"/>
+          <w:szCs w:val="24"/>
+        </w:rPr>
+      </w:pPr>
+      <w:bookmarkStart w:id="10" w:name="_Toc98916009"/>
+      <w:r>
+        <w:rPr>
+          <w:rFonts w:ascii="Times New Roman" w:hAnsi="Times New Roman" w:cs="Times New Roman"/>
+          <w:b/>
+          <w:color w:val="auto"/>
+          <w:sz w:val="24"/>
+          <w:szCs w:val="24"/>
+        </w:rPr>
+        <w:t xml:space="preserve">3. </w:t>
+      </w:r>
+      <w:r>
+        <w:rPr>
+          <w:rFonts w:ascii="Times New Roman" w:hAnsi="Times New Roman" w:cs="Times New Roman"/>
+          <w:b/>
+          <w:color w:val="auto"/>
+          <w:sz w:val="24"/>
+          <w:szCs w:val="24"/>
+        </w:rPr>
+        <w:t>Externo</w:t>
+      </w:r>
+      <w:bookmarkEnd w:id="10"/>
     </w:p>
     <w:p>
       <w:pPr>
@@ -959,15 +1159,39 @@
           <w:color w:val="auto"/>
         </w:rPr>
       </w:pPr>
-      <w:bookmarkStart w:id="9" w:name="_Toc98916008"/>
-      <w:r>
-        <w:rPr>
-          <w:rFonts w:ascii="Times New Roman" w:hAnsi="Times New Roman" w:cs="Times New Roman"/>
-          <w:color w:val="auto"/>
-        </w:rPr>
-        <w:t>2.3 Padrão</w:t>
-      </w:r>
-      <w:bookmarkEnd w:id="9"/>
+      <w:bookmarkStart w:id="11" w:name="_Toc98916010"/>
+      <w:r>
+        <w:rPr>
+          <w:rFonts w:ascii="Times New Roman" w:hAnsi="Times New Roman" w:cs="Times New Roman"/>
+          <w:color w:val="auto"/>
+        </w:rPr>
+        <w:t>3.1 Interoperabilidade</w:t>
+      </w:r>
+      <w:bookmarkEnd w:id="11"/>
+    </w:p>
+    <w:p>
+      <w:pPr>
+        <w:rPr>
+          <w:lang w:eastAsia="pt-BR"/>
+        </w:rPr>
+      </w:pPr>
+    </w:p>
+    <w:p>
+      <w:pPr>
+        <w:rPr>
+          <w:rFonts w:ascii="Times New Roman" w:hAnsi="Times New Roman" w:cs="Times New Roman"/>
+          <w:sz w:val="24"/>
+          <w:szCs w:val="24"/>
+        </w:rPr>
+      </w:pPr>
+      <w:r>
+        <w:rPr>
+          <w:rFonts w:ascii="Times New Roman" w:hAnsi="Times New Roman" w:cs="Times New Roman"/>
+          <w:sz w:val="24"/>
+          <w:szCs w:val="24"/>
+        </w:rPr>
+        <w:t>O sistema deve ser acessível via navegadores web modernos.</w:t>
+      </w:r>
     </w:p>
     <w:p>
       <w:pPr>
@@ -977,49 +1201,20 @@
           <w:color w:val="auto"/>
         </w:rPr>
       </w:pPr>
-    </w:p>
-    <w:p>
-      <w:pPr>
-        <w:pStyle w:val="Ttulo2"/>
-        <w:rPr>
-          <w:rFonts w:ascii="Times New Roman" w:hAnsi="Times New Roman" w:cs="Times New Roman"/>
-          <w:b/>
-          <w:color w:val="auto"/>
-          <w:sz w:val="24"/>
-          <w:szCs w:val="24"/>
-        </w:rPr>
-      </w:pPr>
-      <w:bookmarkStart w:id="10" w:name="_Toc98916009"/>
-      <w:r>
-        <w:rPr>
-          <w:rFonts w:ascii="Times New Roman" w:hAnsi="Times New Roman" w:cs="Times New Roman"/>
-          <w:b/>
-          <w:color w:val="auto"/>
-          <w:sz w:val="24"/>
-          <w:szCs w:val="24"/>
-        </w:rPr>
-        <w:t xml:space="preserve">3. </w:t>
-      </w:r>
-      <w:r>
-        <w:rPr>
-          <w:rFonts w:ascii="Times New Roman" w:hAnsi="Times New Roman" w:cs="Times New Roman"/>
-          <w:b/>
-          <w:color w:val="auto"/>
-          <w:sz w:val="24"/>
-          <w:szCs w:val="24"/>
-        </w:rPr>
-        <w:t>Externo</w:t>
-      </w:r>
-      <w:bookmarkEnd w:id="10"/>
-    </w:p>
-    <w:p>
-      <w:pPr>
-        <w:pStyle w:val="Ttulo4"/>
-        <w:rPr>
-          <w:rFonts w:ascii="Times New Roman" w:hAnsi="Times New Roman" w:cs="Times New Roman"/>
-          <w:color w:val="auto"/>
-          <w:sz w:val="24"/>
-          <w:szCs w:val="24"/>
+      <w:bookmarkStart w:id="12" w:name="_Toc98916011"/>
+      <w:r>
+        <w:rPr>
+          <w:rFonts w:ascii="Times New Roman" w:hAnsi="Times New Roman" w:cs="Times New Roman"/>
+          <w:color w:val="auto"/>
+        </w:rPr>
+        <w:t>3.2 Legal</w:t>
+      </w:r>
+      <w:bookmarkEnd w:id="12"/>
+    </w:p>
+    <w:p>
+      <w:pPr>
+        <w:rPr>
+          <w:lang w:eastAsia="pt-BR"/>
         </w:rPr>
       </w:pPr>
     </w:p>
@@ -1027,29 +1222,21 @@
       <w:pPr>
         <w:pStyle w:val="Ttulo3"/>
         <w:rPr>
-          <w:rFonts w:ascii="Times New Roman" w:hAnsi="Times New Roman" w:cs="Times New Roman"/>
-          <w:color w:val="auto"/>
-        </w:rPr>
-      </w:pPr>
-      <w:bookmarkStart w:id="11" w:name="_Toc98916010"/>
-      <w:r>
-        <w:rPr>
-          <w:rFonts w:ascii="Times New Roman" w:hAnsi="Times New Roman" w:cs="Times New Roman"/>
-          <w:color w:val="auto"/>
-        </w:rPr>
-        <w:t>3.1 Interoperabilidade</w:t>
-      </w:r>
-      <w:bookmarkEnd w:id="11"/>
-    </w:p>
-    <w:p>
-      <w:pPr>
-        <w:rPr>
-          <w:rFonts w:ascii="Times New Roman" w:hAnsi="Times New Roman" w:cs="Times New Roman"/>
-          <w:sz w:val="24"/>
-          <w:szCs w:val="24"/>
-        </w:rPr>
-      </w:pPr>
-    </w:p>
+          <w:rFonts w:ascii="Times New Roman" w:eastAsia="Calibri" w:hAnsi="Times New Roman" w:cs="Times New Roman"/>
+          <w:color w:val="auto"/>
+          <w:lang w:eastAsia="en-US"/>
+        </w:rPr>
+      </w:pPr>
+      <w:r>
+        <w:rPr>
+          <w:rFonts w:ascii="Times New Roman" w:eastAsia="Calibri" w:hAnsi="Times New Roman" w:cs="Times New Roman"/>
+          <w:color w:val="auto"/>
+          <w:lang w:eastAsia="en-US"/>
+        </w:rPr>
+        <w:t>O sistema deve respeitar a LGPD no armazenamento de dados pessoais.</w:t>
+      </w:r>
+    </w:p>
+    <w:p/>
     <w:p>
       <w:pPr>
         <w:pStyle w:val="Ttulo3"/>
@@ -1058,54 +1245,47 @@
           <w:color w:val="auto"/>
         </w:rPr>
       </w:pPr>
-      <w:bookmarkStart w:id="12" w:name="_Toc98916011"/>
-      <w:r>
-        <w:rPr>
-          <w:rFonts w:ascii="Times New Roman" w:hAnsi="Times New Roman" w:cs="Times New Roman"/>
-          <w:color w:val="auto"/>
-        </w:rPr>
-        <w:t>3.2 Legal</w:t>
-      </w:r>
-      <w:bookmarkEnd w:id="12"/>
-    </w:p>
-    <w:p>
-      <w:pPr>
-        <w:rPr>
-          <w:rFonts w:ascii="Times New Roman" w:hAnsi="Times New Roman" w:cs="Times New Roman"/>
-          <w:sz w:val="24"/>
-          <w:szCs w:val="24"/>
+      <w:bookmarkStart w:id="13" w:name="_Toc98916012"/>
+      <w:r>
+        <w:rPr>
+          <w:rFonts w:ascii="Times New Roman" w:hAnsi="Times New Roman" w:cs="Times New Roman"/>
+          <w:color w:val="auto"/>
+        </w:rPr>
+        <w:t>3.3 Ético</w:t>
+      </w:r>
+      <w:bookmarkEnd w:id="13"/>
+    </w:p>
+    <w:p>
+      <w:pPr>
+        <w:rPr>
           <w:lang w:eastAsia="pt-BR"/>
         </w:rPr>
       </w:pPr>
     </w:p>
     <w:p>
       <w:pPr>
-        <w:pStyle w:val="Ttulo3"/>
-        <w:rPr>
-          <w:rFonts w:ascii="Times New Roman" w:hAnsi="Times New Roman" w:cs="Times New Roman"/>
-          <w:color w:val="auto"/>
-        </w:rPr>
-      </w:pPr>
-    </w:p>
-    <w:p>
-      <w:pPr>
-        <w:pStyle w:val="Ttulo3"/>
-        <w:rPr>
-          <w:rFonts w:ascii="Times New Roman" w:hAnsi="Times New Roman" w:cs="Times New Roman"/>
-          <w:color w:val="auto"/>
-        </w:rPr>
-      </w:pPr>
-      <w:bookmarkStart w:id="13" w:name="_Toc98916012"/>
-      <w:r>
-        <w:rPr>
-          <w:rFonts w:ascii="Times New Roman" w:hAnsi="Times New Roman" w:cs="Times New Roman"/>
-          <w:color w:val="auto"/>
-        </w:rPr>
-        <w:t>3.3 Ético</w:t>
-      </w:r>
-      <w:bookmarkEnd w:id="13"/>
-    </w:p>
-    <w:bookmarkEnd w:id="6"/>
+        <w:rPr>
+          <w:rFonts w:ascii="Times New Roman" w:hAnsi="Times New Roman" w:cs="Times New Roman"/>
+          <w:sz w:val="24"/>
+          <w:szCs w:val="24"/>
+        </w:rPr>
+      </w:pPr>
+      <w:r>
+        <w:rPr>
+          <w:rFonts w:ascii="Times New Roman" w:hAnsi="Times New Roman" w:cs="Times New Roman"/>
+          <w:sz w:val="24"/>
+          <w:szCs w:val="24"/>
+        </w:rPr>
+        <w:t>O sistema deve garantir privacidade e uso responsável das informações dos usuários.</w:t>
+      </w:r>
+    </w:p>
+    <w:p>
+      <w:pPr>
+        <w:rPr>
+          <w:lang w:eastAsia="pt-BR"/>
+        </w:rPr>
+      </w:pPr>
+    </w:p>
     <w:p>
       <w:pPr>
         <w:rPr>
@@ -2533,7 +2713,7 @@
   <a:extraClrSchemeLst/>
   <a:extLst>
     <a:ext uri="{05A4C25C-085E-4340-85A3-A5531E510DB2}">
-      <thm15:themeFamily xmlns:thm15="http://schemas.microsoft.com/office/thememl/2012/main" xmlns="" name="Office Theme" id="{62F939B6-93AF-4DB8-9C6B-D6C7DFDC589F}" vid="{4A3C46E8-61CC-4603-A589-7422A47A8E4A}"/>
+      <thm15:themeFamily xmlns="" xmlns:thm15="http://schemas.microsoft.com/office/thememl/2012/main" name="Office Theme" id="{62F939B6-93AF-4DB8-9C6B-D6C7DFDC589F}" vid="{4A3C46E8-61CC-4603-A589-7422A47A8E4A}"/>
     </a:ext>
   </a:extLst>
 </a:theme>

</xml_diff>

<commit_message>
feat: correcao requisitos nao funcionais
</commit_message>
<xml_diff>
--- a/ApêndiceB-Requisitos/PID_RequisitosNãoFuncionais.docx
+++ b/ApêndiceB-Requisitos/PID_RequisitosNãoFuncionais.docx
@@ -422,38 +422,51 @@
     </w:p>
     <w:p>
       <w:pPr>
+        <w:pStyle w:val="NormalWeb"/>
+        <w:spacing w:line="360" w:lineRule="auto"/>
         <w:jc w:val="both"/>
         <w:rPr>
-          <w:rFonts w:ascii="Times New Roman" w:hAnsi="Times New Roman" w:cs="Times New Roman"/>
-          <w:sz w:val="24"/>
-          <w:szCs w:val="24"/>
-        </w:rPr>
-      </w:pPr>
-      <w:r>
-        <w:rPr>
-          <w:rFonts w:ascii="Times New Roman" w:hAnsi="Times New Roman" w:cs="Times New Roman"/>
-          <w:sz w:val="24"/>
-          <w:szCs w:val="24"/>
-        </w:rPr>
-        <w:t xml:space="preserve">Descrição: </w:t>
-      </w:r>
-      <w:r>
-        <w:rPr>
-          <w:rFonts w:ascii="Times New Roman" w:hAnsi="Times New Roman" w:cs="Times New Roman"/>
-          <w:sz w:val="24"/>
-          <w:szCs w:val="24"/>
-        </w:rPr>
-        <w:t xml:space="preserve">O sistema deve possuir interface simples e intuitiva, permitindo que usuários realizem tarefas principais </w:t>
-      </w:r>
-      <w:r>
-        <w:rPr>
-          <w:rFonts w:ascii="Times New Roman" w:hAnsi="Times New Roman" w:cs="Times New Roman"/>
-          <w:sz w:val="24"/>
-          <w:szCs w:val="24"/>
-        </w:rPr>
-        <w:t>com facilidade</w:t>
-      </w:r>
-      <w:r>
+          <w:rFonts w:eastAsia="Calibri"/>
+          <w:lang w:eastAsia="en-US"/>
+        </w:rPr>
+      </w:pPr>
+      <w:r>
+        <w:rPr>
+          <w:rFonts w:eastAsia="Calibri"/>
+          <w:lang w:eastAsia="en-US"/>
+        </w:rPr>
+        <w:t>Descrição: O sistema deve ser projetado com base nas diretrizes de IHC (Interação Humano-Computador), considerando que o público-alvo (familiares/cuidadores) pode possuir baixa familiaridade com tecnologia</w:t>
+      </w:r>
+      <w:r>
+        <w:rPr>
+          <w:rFonts w:eastAsia="Calibri"/>
+          <w:lang w:eastAsia="en-US"/>
+        </w:rPr>
+        <w:t xml:space="preserve">. A interface deve utilizar componentes visuais limpos, botões autoexplicativos com textos claros (evitando ícones abstratos sem legenda) e fluxos de navegação lineares que não confundam o usuário. </w:t>
+      </w:r>
+    </w:p>
+    <w:p>
+      <w:pPr>
+        <w:pStyle w:val="NormalWeb"/>
+        <w:spacing w:line="360" w:lineRule="auto"/>
+        <w:jc w:val="both"/>
+        <w:rPr>
+          <w:rFonts w:eastAsia="Calibri"/>
+          <w:lang w:eastAsia="en-US"/>
+        </w:rPr>
+      </w:pPr>
+      <w:r>
+        <w:rPr>
+          <w:rFonts w:eastAsia="Calibri"/>
+          <w:lang w:eastAsia="en-US"/>
+        </w:rPr>
+        <w:t>Critério de Aceitação/Métrica: Um usuário leigo deve ser capaz de realizar o cadastro e a primeira busca por cuidadores em menos de 3 minutos, sem auxílio externo</w:t>
+      </w:r>
+      <w:r>
+        <w:rPr>
+          <w:rFonts w:eastAsia="Calibri"/>
+          <w:lang w:eastAsia="en-US"/>
+        </w:rPr>
         <w:t>.</w:t>
       </w:r>
     </w:p>
@@ -526,533 +539,901 @@
     </w:p>
     <w:p>
       <w:pPr>
-        <w:rPr>
-          <w:rFonts w:ascii="Times New Roman" w:hAnsi="Times New Roman" w:cs="Times New Roman"/>
-          <w:sz w:val="24"/>
-          <w:szCs w:val="24"/>
-        </w:rPr>
-      </w:pPr>
-      <w:r>
-        <w:rPr>
-          <w:rFonts w:ascii="Times New Roman" w:hAnsi="Times New Roman" w:cs="Times New Roman"/>
-          <w:sz w:val="24"/>
-          <w:szCs w:val="24"/>
-        </w:rPr>
-        <w:t>Descrição:</w:t>
-      </w:r>
-      <w:r>
-        <w:rPr>
-          <w:rFonts w:ascii="Times New Roman" w:hAnsi="Times New Roman" w:cs="Times New Roman"/>
-          <w:sz w:val="24"/>
-          <w:szCs w:val="24"/>
-        </w:rPr>
-        <w:t xml:space="preserve"> O sistema deve possuir boa legibilidade, com uso adequado de cores, contraste e tamanhos de fonte, facilitando o uso por pessoas idosas.</w:t>
-      </w:r>
-    </w:p>
-    <w:p>
-      <w:pPr>
-        <w:rPr>
-          <w:rFonts w:ascii="Times New Roman" w:hAnsi="Times New Roman" w:cs="Times New Roman"/>
-          <w:sz w:val="24"/>
-          <w:szCs w:val="24"/>
-        </w:rPr>
-      </w:pPr>
-    </w:p>
-    <w:p>
-      <w:pPr>
-        <w:pStyle w:val="Ttulo3"/>
-        <w:rPr>
-          <w:rFonts w:ascii="Times New Roman" w:hAnsi="Times New Roman" w:cs="Times New Roman"/>
-          <w:color w:val="auto"/>
-        </w:rPr>
-      </w:pPr>
-      <w:bookmarkStart w:id="2" w:name="_Toc98916002"/>
-      <w:r>
-        <w:rPr>
-          <w:rFonts w:ascii="Times New Roman" w:hAnsi="Times New Roman" w:cs="Times New Roman"/>
-          <w:color w:val="auto"/>
-        </w:rPr>
-        <w:t>1.3</w:t>
-      </w:r>
-      <w:r>
-        <w:rPr>
-          <w:rFonts w:ascii="Times New Roman" w:hAnsi="Times New Roman" w:cs="Times New Roman"/>
-          <w:color w:val="auto"/>
-        </w:rPr>
-        <w:t xml:space="preserve"> Eficiência</w:t>
-      </w:r>
-      <w:bookmarkEnd w:id="2"/>
-    </w:p>
-    <w:p>
-      <w:pPr>
-        <w:rPr>
-          <w:lang w:eastAsia="pt-BR"/>
-        </w:rPr>
-      </w:pPr>
-    </w:p>
-    <w:p>
-      <w:pPr>
-        <w:rPr>
-          <w:rFonts w:ascii="Times New Roman" w:hAnsi="Times New Roman" w:cs="Times New Roman"/>
-          <w:sz w:val="24"/>
-          <w:szCs w:val="24"/>
-        </w:rPr>
-      </w:pPr>
-      <w:r>
-        <w:rPr>
-          <w:rFonts w:ascii="Times New Roman" w:hAnsi="Times New Roman" w:cs="Times New Roman"/>
-          <w:sz w:val="24"/>
-          <w:szCs w:val="24"/>
-        </w:rPr>
-        <w:t>RNF 3</w:t>
-      </w:r>
-      <w:r>
-        <w:rPr>
-          <w:rFonts w:ascii="Times New Roman" w:hAnsi="Times New Roman" w:cs="Times New Roman"/>
-          <w:sz w:val="24"/>
-          <w:szCs w:val="24"/>
-        </w:rPr>
-        <w:t xml:space="preserve"> – </w:t>
-      </w:r>
-      <w:r>
-        <w:rPr>
-          <w:rFonts w:ascii="Times New Roman" w:hAnsi="Times New Roman" w:cs="Times New Roman"/>
-          <w:sz w:val="24"/>
-          <w:szCs w:val="24"/>
-        </w:rPr>
-        <w:t>Eficiência</w:t>
-      </w:r>
-    </w:p>
-    <w:p>
-      <w:pPr>
-        <w:rPr>
-          <w:rFonts w:ascii="Times New Roman" w:hAnsi="Times New Roman" w:cs="Times New Roman"/>
-          <w:sz w:val="24"/>
-          <w:szCs w:val="24"/>
-        </w:rPr>
-      </w:pPr>
-      <w:r>
-        <w:rPr>
-          <w:rFonts w:ascii="Times New Roman" w:hAnsi="Times New Roman" w:cs="Times New Roman"/>
-          <w:sz w:val="24"/>
-          <w:szCs w:val="24"/>
-        </w:rPr>
-        <w:t>Descrição:</w:t>
-      </w:r>
-      <w:r>
-        <w:rPr>
-          <w:rFonts w:ascii="Times New Roman" w:hAnsi="Times New Roman" w:cs="Times New Roman"/>
-          <w:sz w:val="24"/>
-          <w:szCs w:val="24"/>
-        </w:rPr>
-        <w:t xml:space="preserve"> sistema deve responder às requisições em até 5 segundos.</w:t>
-      </w:r>
-    </w:p>
-    <w:p>
-      <w:pPr>
-        <w:pStyle w:val="Ttulo4"/>
-        <w:rPr>
-          <w:rFonts w:ascii="Times New Roman" w:hAnsi="Times New Roman" w:cs="Times New Roman"/>
-          <w:color w:val="auto"/>
-          <w:sz w:val="24"/>
-          <w:szCs w:val="24"/>
-        </w:rPr>
-      </w:pPr>
-    </w:p>
-    <w:p>
-      <w:pPr>
-        <w:pStyle w:val="Ttulo3"/>
-        <w:rPr>
-          <w:rFonts w:ascii="Times New Roman" w:hAnsi="Times New Roman" w:cs="Times New Roman"/>
-          <w:color w:val="auto"/>
-        </w:rPr>
-      </w:pPr>
-      <w:bookmarkStart w:id="3" w:name="_Toc98916003"/>
-      <w:r>
-        <w:rPr>
-          <w:rFonts w:ascii="Times New Roman" w:hAnsi="Times New Roman" w:cs="Times New Roman"/>
-          <w:color w:val="auto"/>
-        </w:rPr>
-        <w:t>1.4</w:t>
-      </w:r>
-      <w:r>
-        <w:rPr>
-          <w:rFonts w:ascii="Times New Roman" w:hAnsi="Times New Roman" w:cs="Times New Roman"/>
-          <w:color w:val="auto"/>
-        </w:rPr>
-        <w:t xml:space="preserve"> Confiabilidade</w:t>
-      </w:r>
-      <w:bookmarkEnd w:id="3"/>
-    </w:p>
-    <w:p>
-      <w:pPr>
-        <w:rPr>
-          <w:lang w:eastAsia="pt-BR"/>
-        </w:rPr>
-      </w:pPr>
-    </w:p>
-    <w:p>
-      <w:pPr>
-        <w:rPr>
-          <w:rFonts w:ascii="Times New Roman" w:hAnsi="Times New Roman" w:cs="Times New Roman"/>
-          <w:sz w:val="24"/>
-          <w:szCs w:val="24"/>
-        </w:rPr>
-      </w:pPr>
-      <w:r>
-        <w:rPr>
-          <w:rFonts w:ascii="Times New Roman" w:hAnsi="Times New Roman" w:cs="Times New Roman"/>
-          <w:sz w:val="24"/>
-          <w:szCs w:val="24"/>
-        </w:rPr>
-        <w:t>RNF 4</w:t>
-      </w:r>
-      <w:r>
-        <w:rPr>
-          <w:rFonts w:ascii="Times New Roman" w:hAnsi="Times New Roman" w:cs="Times New Roman"/>
-          <w:sz w:val="24"/>
-          <w:szCs w:val="24"/>
-        </w:rPr>
-        <w:t xml:space="preserve"> – </w:t>
-      </w:r>
-      <w:r>
-        <w:t>Confiabilidade</w:t>
-      </w:r>
-    </w:p>
-    <w:p>
-      <w:pPr>
-        <w:rPr>
-          <w:rFonts w:ascii="Times New Roman" w:hAnsi="Times New Roman" w:cs="Times New Roman"/>
-          <w:sz w:val="24"/>
-          <w:szCs w:val="24"/>
-          <w:lang w:eastAsia="pt-BR"/>
-        </w:rPr>
-      </w:pPr>
-      <w:r>
-        <w:rPr>
-          <w:rFonts w:ascii="Times New Roman" w:hAnsi="Times New Roman" w:cs="Times New Roman"/>
-          <w:sz w:val="24"/>
-          <w:szCs w:val="24"/>
-        </w:rPr>
-        <w:t>O sistema deve garantir que as operações sejam realizadas corretamente, sem perda de dados.</w:t>
-      </w:r>
-    </w:p>
-    <w:p>
-      <w:pPr>
-        <w:pStyle w:val="Ttulo3"/>
-        <w:rPr>
-          <w:rFonts w:ascii="Times New Roman" w:hAnsi="Times New Roman" w:cs="Times New Roman"/>
-          <w:color w:val="auto"/>
-        </w:rPr>
-      </w:pPr>
-      <w:bookmarkStart w:id="4" w:name="_Toc98916004"/>
-      <w:r>
-        <w:rPr>
-          <w:rFonts w:ascii="Times New Roman" w:hAnsi="Times New Roman" w:cs="Times New Roman"/>
-          <w:color w:val="auto"/>
-        </w:rPr>
-        <w:lastRenderedPageBreak/>
-        <w:t>1.5</w:t>
-      </w:r>
-      <w:r>
-        <w:rPr>
-          <w:rFonts w:ascii="Times New Roman" w:hAnsi="Times New Roman" w:cs="Times New Roman"/>
-          <w:color w:val="auto"/>
-        </w:rPr>
-        <w:t xml:space="preserve"> Portabilidade</w:t>
-      </w:r>
-      <w:bookmarkEnd w:id="4"/>
-    </w:p>
-    <w:p>
-      <w:pPr>
-        <w:rPr>
-          <w:lang w:eastAsia="pt-BR"/>
-        </w:rPr>
-      </w:pPr>
-    </w:p>
-    <w:p>
-      <w:pPr>
-        <w:rPr>
-          <w:rFonts w:ascii="Times New Roman" w:hAnsi="Times New Roman" w:cs="Times New Roman"/>
-          <w:sz w:val="24"/>
-          <w:szCs w:val="24"/>
-        </w:rPr>
-      </w:pPr>
-      <w:r>
-        <w:rPr>
-          <w:rFonts w:ascii="Times New Roman" w:hAnsi="Times New Roman" w:cs="Times New Roman"/>
-          <w:sz w:val="24"/>
-          <w:szCs w:val="24"/>
-        </w:rPr>
-        <w:t>RNF 5</w:t>
-      </w:r>
-      <w:r>
-        <w:rPr>
-          <w:rFonts w:ascii="Times New Roman" w:hAnsi="Times New Roman" w:cs="Times New Roman"/>
-          <w:sz w:val="24"/>
-          <w:szCs w:val="24"/>
-        </w:rPr>
-        <w:t xml:space="preserve"> – Compatibilidade</w:t>
-      </w:r>
-    </w:p>
-    <w:p>
-      <w:pPr>
-        <w:rPr>
-          <w:rFonts w:ascii="Times New Roman" w:hAnsi="Times New Roman" w:cs="Times New Roman"/>
-          <w:sz w:val="24"/>
-          <w:szCs w:val="24"/>
-        </w:rPr>
-      </w:pPr>
-      <w:r>
-        <w:rPr>
-          <w:rFonts w:ascii="Times New Roman" w:hAnsi="Times New Roman" w:cs="Times New Roman"/>
-          <w:sz w:val="24"/>
-          <w:szCs w:val="24"/>
-        </w:rPr>
-        <w:br/>
-        <w:t>Descrição: O sistema deve funcionar em navegadores modernos (</w:t>
-      </w:r>
-      <w:proofErr w:type="spellStart"/>
-      <w:r>
-        <w:rPr>
-          <w:rFonts w:ascii="Times New Roman" w:hAnsi="Times New Roman" w:cs="Times New Roman"/>
-          <w:sz w:val="24"/>
-          <w:szCs w:val="24"/>
-        </w:rPr>
-        <w:t>Chrome</w:t>
-      </w:r>
-      <w:proofErr w:type="spellEnd"/>
-      <w:r>
-        <w:rPr>
-          <w:rFonts w:ascii="Times New Roman" w:hAnsi="Times New Roman" w:cs="Times New Roman"/>
-          <w:sz w:val="24"/>
-          <w:szCs w:val="24"/>
-        </w:rPr>
-        <w:t xml:space="preserve">, </w:t>
-      </w:r>
-      <w:r>
-        <w:rPr>
-          <w:rFonts w:ascii="Times New Roman" w:hAnsi="Times New Roman" w:cs="Times New Roman"/>
-          <w:sz w:val="24"/>
-          <w:szCs w:val="24"/>
-        </w:rPr>
-        <w:t>Firefox</w:t>
-      </w:r>
-      <w:r>
-        <w:rPr>
-          <w:rFonts w:ascii="Times New Roman" w:hAnsi="Times New Roman" w:cs="Times New Roman"/>
-          <w:sz w:val="24"/>
-          <w:szCs w:val="24"/>
-        </w:rPr>
-        <w:t>.).</w:t>
-      </w:r>
-    </w:p>
-    <w:p>
-      <w:pPr>
-        <w:rPr>
-          <w:rFonts w:ascii="Times New Roman" w:hAnsi="Times New Roman" w:cs="Times New Roman"/>
-          <w:sz w:val="24"/>
-          <w:szCs w:val="24"/>
-        </w:rPr>
-      </w:pPr>
-    </w:p>
-    <w:p>
-      <w:pPr>
-        <w:pStyle w:val="Ttulo2"/>
-        <w:rPr>
-          <w:rFonts w:ascii="Times New Roman" w:hAnsi="Times New Roman" w:cs="Times New Roman"/>
-          <w:b/>
-          <w:color w:val="auto"/>
-          <w:sz w:val="24"/>
-          <w:szCs w:val="24"/>
-        </w:rPr>
-      </w:pPr>
-      <w:bookmarkStart w:id="5" w:name="_Toc98916005"/>
-      <w:r>
-        <w:rPr>
-          <w:rFonts w:ascii="Times New Roman" w:hAnsi="Times New Roman" w:cs="Times New Roman"/>
-          <w:b/>
-          <w:color w:val="auto"/>
-          <w:sz w:val="24"/>
-          <w:szCs w:val="24"/>
-        </w:rPr>
-        <w:t xml:space="preserve">2. </w:t>
-      </w:r>
-      <w:r>
-        <w:rPr>
-          <w:rFonts w:ascii="Times New Roman" w:hAnsi="Times New Roman" w:cs="Times New Roman"/>
-          <w:b/>
-          <w:color w:val="auto"/>
-          <w:sz w:val="24"/>
-          <w:szCs w:val="24"/>
-        </w:rPr>
-        <w:t>Organizacional</w:t>
-      </w:r>
-      <w:bookmarkEnd w:id="5"/>
-    </w:p>
-    <w:p>
-      <w:pPr>
-        <w:pStyle w:val="Ttulo4"/>
-        <w:rPr>
-          <w:rFonts w:ascii="Times New Roman" w:hAnsi="Times New Roman" w:cs="Times New Roman"/>
-          <w:color w:val="auto"/>
-          <w:sz w:val="24"/>
-          <w:szCs w:val="24"/>
-        </w:rPr>
-      </w:pPr>
-    </w:p>
-    <w:p>
-      <w:pPr>
-        <w:pStyle w:val="Ttulo3"/>
-        <w:rPr>
-          <w:rFonts w:ascii="Times New Roman" w:hAnsi="Times New Roman" w:cs="Times New Roman"/>
-          <w:color w:val="auto"/>
-        </w:rPr>
-      </w:pPr>
-      <w:bookmarkStart w:id="6" w:name="_Toc98916006"/>
-      <w:r>
-        <w:rPr>
-          <w:rFonts w:ascii="Times New Roman" w:hAnsi="Times New Roman" w:cs="Times New Roman"/>
-          <w:color w:val="auto"/>
-        </w:rPr>
-        <w:t>2.1 Entrega</w:t>
-      </w:r>
-      <w:bookmarkEnd w:id="6"/>
-      <w:proofErr w:type="gramStart"/>
-      <w:r>
-        <w:rPr>
-          <w:rFonts w:ascii="Times New Roman" w:hAnsi="Times New Roman" w:cs="Times New Roman"/>
-          <w:color w:val="auto"/>
-        </w:rPr>
-        <w:t xml:space="preserve">  </w:t>
-      </w:r>
-    </w:p>
-    <w:p>
-      <w:pPr>
-        <w:rPr>
-          <w:lang w:eastAsia="pt-BR"/>
-        </w:rPr>
-      </w:pPr>
-      <w:proofErr w:type="gramEnd"/>
-    </w:p>
-    <w:p>
-      <w:pPr>
-        <w:rPr>
-          <w:rFonts w:ascii="Times New Roman" w:hAnsi="Times New Roman" w:cs="Times New Roman"/>
-          <w:sz w:val="24"/>
-          <w:szCs w:val="24"/>
-        </w:rPr>
-      </w:pPr>
-      <w:r>
-        <w:rPr>
-          <w:rFonts w:ascii="Times New Roman" w:hAnsi="Times New Roman" w:cs="Times New Roman"/>
-          <w:sz w:val="24"/>
-          <w:szCs w:val="24"/>
-        </w:rPr>
-        <w:t>O sistema deverá ser entregue em versão web funcional até o final do semestre.</w:t>
-      </w:r>
-    </w:p>
-    <w:p>
-      <w:pPr>
-        <w:pStyle w:val="Ttulo3"/>
-        <w:rPr>
-          <w:rFonts w:ascii="Times New Roman" w:hAnsi="Times New Roman" w:cs="Times New Roman"/>
-          <w:color w:val="auto"/>
-        </w:rPr>
-      </w:pPr>
-      <w:bookmarkStart w:id="7" w:name="_Toc98916007"/>
-      <w:r>
-        <w:rPr>
-          <w:rFonts w:ascii="Times New Roman" w:hAnsi="Times New Roman" w:cs="Times New Roman"/>
-          <w:color w:val="auto"/>
-        </w:rPr>
-        <w:t xml:space="preserve">2.2 </w:t>
-      </w:r>
-      <w:proofErr w:type="gramStart"/>
-      <w:r>
-        <w:rPr>
-          <w:rFonts w:ascii="Times New Roman" w:hAnsi="Times New Roman" w:cs="Times New Roman"/>
-          <w:color w:val="auto"/>
-        </w:rPr>
-        <w:t>Implementação</w:t>
-      </w:r>
-      <w:bookmarkEnd w:id="7"/>
-      <w:proofErr w:type="gramEnd"/>
-    </w:p>
-    <w:p>
-      <w:pPr>
-        <w:rPr>
-          <w:lang w:eastAsia="pt-BR"/>
-        </w:rPr>
-      </w:pPr>
-    </w:p>
-    <w:p>
-      <w:pPr>
-        <w:rPr>
-          <w:rFonts w:ascii="Times New Roman" w:hAnsi="Times New Roman" w:cs="Times New Roman"/>
-          <w:sz w:val="24"/>
-          <w:szCs w:val="24"/>
-        </w:rPr>
-      </w:pPr>
-      <w:r>
-        <w:rPr>
-          <w:rFonts w:ascii="Times New Roman" w:hAnsi="Times New Roman" w:cs="Times New Roman"/>
-          <w:sz w:val="24"/>
-          <w:szCs w:val="24"/>
-        </w:rPr>
-        <w:t>O sistema será desenvolvido utilizando</w:t>
-      </w:r>
-      <w:r>
-        <w:t xml:space="preserve"> </w:t>
-      </w:r>
-      <w:r>
-        <w:rPr>
-          <w:rFonts w:ascii="Times New Roman" w:hAnsi="Times New Roman" w:cs="Times New Roman"/>
-          <w:sz w:val="24"/>
-          <w:szCs w:val="24"/>
-        </w:rPr>
-        <w:t>Java (</w:t>
-      </w:r>
-      <w:proofErr w:type="spellStart"/>
-      <w:r>
-        <w:rPr>
-          <w:rFonts w:ascii="Times New Roman" w:hAnsi="Times New Roman" w:cs="Times New Roman"/>
-          <w:sz w:val="24"/>
-          <w:szCs w:val="24"/>
-        </w:rPr>
-        <w:t>backend</w:t>
-      </w:r>
-      <w:proofErr w:type="spellEnd"/>
-      <w:r>
-        <w:rPr>
-          <w:rFonts w:ascii="Times New Roman" w:hAnsi="Times New Roman" w:cs="Times New Roman"/>
-          <w:sz w:val="24"/>
-          <w:szCs w:val="24"/>
-        </w:rPr>
-        <w:t xml:space="preserve">) e </w:t>
+        <w:pStyle w:val="NormalWeb"/>
+        <w:spacing w:line="360" w:lineRule="auto"/>
+        <w:jc w:val="both"/>
+        <w:rPr>
+          <w:rFonts w:eastAsia="Calibri"/>
+          <w:lang w:eastAsia="en-US"/>
+        </w:rPr>
+      </w:pPr>
+      <w:r>
+        <w:rPr>
+          <w:rFonts w:eastAsia="Calibri"/>
+          <w:lang w:eastAsia="en-US"/>
+        </w:rPr>
+        <w:t xml:space="preserve">Descrição: O portal deve seguir as recomendações do </w:t>
       </w:r>
       <w:proofErr w:type="spellStart"/>
       <w:proofErr w:type="gramStart"/>
       <w:r>
         <w:rPr>
-          <w:rFonts w:ascii="Times New Roman" w:hAnsi="Times New Roman" w:cs="Times New Roman"/>
-          <w:sz w:val="24"/>
-          <w:szCs w:val="24"/>
-        </w:rPr>
-        <w:t>PostgreSQL</w:t>
+          <w:rFonts w:eastAsia="Calibri"/>
+          <w:lang w:eastAsia="en-US"/>
+        </w:rPr>
+        <w:t>eMAG</w:t>
       </w:r>
       <w:proofErr w:type="spellEnd"/>
       <w:proofErr w:type="gramEnd"/>
       <w:r>
         <w:rPr>
+          <w:rFonts w:eastAsia="Calibri"/>
+          <w:lang w:eastAsia="en-US"/>
+        </w:rPr>
+        <w:t xml:space="preserve"> (Modelo de Acessibilidade em Governo Eletrônico) e WCAG 2.1 nível AA. Deve fornecer recursos essenciais como: alto contraste para leitura, dimensionamento dinâmico de fontes (aumento de texto sem quebrar o layout), espaçamento adequado para clique em dispositivos móveis (mínimo de 44x44 pixels) e compatibilidade com leitores de tela (uso correto de </w:t>
+      </w:r>
+      <w:proofErr w:type="spellStart"/>
+      <w:r>
+        <w:rPr>
+          <w:rFonts w:eastAsia="Calibri"/>
+          <w:lang w:eastAsia="en-US"/>
+        </w:rPr>
+        <w:t>tags</w:t>
+      </w:r>
+      <w:proofErr w:type="spellEnd"/>
+      <w:r>
+        <w:rPr>
+          <w:rFonts w:eastAsia="Calibri"/>
+          <w:lang w:eastAsia="en-US"/>
+        </w:rPr>
+        <w:t xml:space="preserve"> </w:t>
+      </w:r>
+      <w:proofErr w:type="spellStart"/>
+      <w:r>
+        <w:rPr>
+          <w:rFonts w:eastAsia="Calibri"/>
+          <w:lang w:eastAsia="en-US"/>
+        </w:rPr>
+        <w:t>alt</w:t>
+      </w:r>
+      <w:proofErr w:type="spellEnd"/>
+      <w:r>
+        <w:rPr>
+          <w:rFonts w:eastAsia="Calibri"/>
+          <w:lang w:eastAsia="en-US"/>
+        </w:rPr>
+        <w:t xml:space="preserve"> em imagens e atributos </w:t>
+      </w:r>
+      <w:r>
+        <w:rPr>
+          <w:rFonts w:eastAsia="Calibri"/>
+          <w:lang w:eastAsia="en-US"/>
+        </w:rPr>
+        <w:t>aria-</w:t>
+      </w:r>
+      <w:proofErr w:type="spellStart"/>
+      <w:r>
+        <w:rPr>
+          <w:rFonts w:eastAsia="Calibri"/>
+          <w:lang w:eastAsia="en-US"/>
+        </w:rPr>
+        <w:t>label</w:t>
+      </w:r>
+      <w:proofErr w:type="spellEnd"/>
+      <w:r>
+        <w:rPr>
+          <w:rFonts w:eastAsia="Calibri"/>
+          <w:lang w:eastAsia="en-US"/>
+        </w:rPr>
+        <w:t>).</w:t>
+      </w:r>
+      <w:r>
+        <w:rPr>
+          <w:rFonts w:eastAsia="Calibri"/>
+          <w:lang w:eastAsia="en-US"/>
+        </w:rPr>
+        <w:t>Critério de Aceitação/Métrica: O tamanho padrão das fontes do painel do idoso/responsável não deve ser menor que 16px, garantindo legibilidade imediata</w:t>
+      </w:r>
+      <w:r>
+        <w:rPr>
+          <w:rFonts w:eastAsia="Calibri"/>
+          <w:lang w:eastAsia="en-US"/>
+        </w:rPr>
+        <w:t xml:space="preserve">. </w:t>
+      </w:r>
+    </w:p>
+    <w:p>
+      <w:pPr>
+        <w:rPr>
+          <w:rFonts w:ascii="Times New Roman" w:hAnsi="Times New Roman" w:cs="Times New Roman"/>
+          <w:sz w:val="24"/>
+          <w:szCs w:val="24"/>
+        </w:rPr>
+      </w:pPr>
+    </w:p>
+    <w:p>
+      <w:pPr>
+        <w:pStyle w:val="Ttulo3"/>
+        <w:rPr>
+          <w:rFonts w:ascii="Times New Roman" w:hAnsi="Times New Roman" w:cs="Times New Roman"/>
+          <w:color w:val="auto"/>
+        </w:rPr>
+      </w:pPr>
+      <w:bookmarkStart w:id="2" w:name="_Toc98916002"/>
+      <w:r>
+        <w:rPr>
+          <w:rFonts w:ascii="Times New Roman" w:hAnsi="Times New Roman" w:cs="Times New Roman"/>
+          <w:color w:val="auto"/>
+        </w:rPr>
+        <w:t>1.3</w:t>
+      </w:r>
+      <w:r>
+        <w:rPr>
+          <w:rFonts w:ascii="Times New Roman" w:hAnsi="Times New Roman" w:cs="Times New Roman"/>
+          <w:color w:val="auto"/>
+        </w:rPr>
+        <w:t xml:space="preserve"> Eficiência</w:t>
+      </w:r>
+      <w:bookmarkEnd w:id="2"/>
+    </w:p>
+    <w:p>
+      <w:pPr>
+        <w:rPr>
+          <w:lang w:eastAsia="pt-BR"/>
+        </w:rPr>
+      </w:pPr>
+    </w:p>
+    <w:p>
+      <w:pPr>
+        <w:rPr>
+          <w:rFonts w:ascii="Times New Roman" w:hAnsi="Times New Roman" w:cs="Times New Roman"/>
+          <w:sz w:val="24"/>
+          <w:szCs w:val="24"/>
+        </w:rPr>
+      </w:pPr>
+      <w:r>
+        <w:rPr>
+          <w:rFonts w:ascii="Times New Roman" w:hAnsi="Times New Roman" w:cs="Times New Roman"/>
+          <w:sz w:val="24"/>
+          <w:szCs w:val="24"/>
+        </w:rPr>
+        <w:t>RNF 3</w:t>
+      </w:r>
+      <w:r>
+        <w:rPr>
+          <w:rFonts w:ascii="Times New Roman" w:hAnsi="Times New Roman" w:cs="Times New Roman"/>
+          <w:sz w:val="24"/>
+          <w:szCs w:val="24"/>
+        </w:rPr>
+        <w:t xml:space="preserve"> – </w:t>
+      </w:r>
+      <w:r>
+        <w:rPr>
+          <w:rFonts w:ascii="Times New Roman" w:hAnsi="Times New Roman" w:cs="Times New Roman"/>
+          <w:sz w:val="24"/>
+          <w:szCs w:val="24"/>
+        </w:rPr>
+        <w:t>Eficiência</w:t>
+      </w:r>
+    </w:p>
+    <w:p>
+      <w:pPr>
+        <w:pStyle w:val="NormalWeb"/>
+        <w:spacing w:line="360" w:lineRule="auto"/>
+        <w:jc w:val="both"/>
+        <w:rPr>
+          <w:rFonts w:eastAsia="Calibri"/>
+          <w:lang w:eastAsia="en-US"/>
+        </w:rPr>
+      </w:pPr>
+      <w:r>
+        <w:rPr>
+          <w:rFonts w:eastAsia="Calibri"/>
+          <w:lang w:eastAsia="en-US"/>
+        </w:rPr>
+        <w:t xml:space="preserve">Descrição: As requisições críticas do </w:t>
+      </w:r>
+      <w:proofErr w:type="spellStart"/>
+      <w:r>
+        <w:rPr>
+          <w:rFonts w:eastAsia="Calibri"/>
+          <w:lang w:eastAsia="en-US"/>
+        </w:rPr>
+        <w:t>backend</w:t>
+      </w:r>
+      <w:proofErr w:type="spellEnd"/>
+      <w:r>
+        <w:rPr>
+          <w:rFonts w:eastAsia="Calibri"/>
+          <w:lang w:eastAsia="en-US"/>
+        </w:rPr>
+        <w:t xml:space="preserve"> processadas na linguagem Java devem ser otimizadas para balancear as consultas no banco de dados </w:t>
+      </w:r>
+      <w:proofErr w:type="spellStart"/>
+      <w:proofErr w:type="gramStart"/>
+      <w:r>
+        <w:rPr>
+          <w:rFonts w:eastAsia="Calibri"/>
+          <w:lang w:eastAsia="en-US"/>
+        </w:rPr>
+        <w:t>PostgreSQL</w:t>
+      </w:r>
+      <w:proofErr w:type="spellEnd"/>
+      <w:proofErr w:type="gramEnd"/>
+      <w:r>
+        <w:rPr>
+          <w:rFonts w:eastAsia="Calibri"/>
+          <w:lang w:eastAsia="en-US"/>
+        </w:rPr>
+        <w:t xml:space="preserve">. </w:t>
+      </w:r>
+      <w:r>
+        <w:rPr>
+          <w:rFonts w:eastAsia="Calibri"/>
+          <w:lang w:eastAsia="en-US"/>
+        </w:rPr>
+        <w:t>A listagem de profissionais após uma filtragem e a busca por localização geográfica precisam carregar de forma eficiente, evitando abandono da página</w:t>
+      </w:r>
+      <w:r>
+        <w:rPr>
+          <w:rFonts w:eastAsia="Calibri"/>
+          <w:lang w:eastAsia="en-US"/>
+        </w:rPr>
+        <w:t xml:space="preserve">. </w:t>
+      </w:r>
+    </w:p>
+    <w:p>
+      <w:pPr>
+        <w:pStyle w:val="NormalWeb"/>
+        <w:spacing w:line="360" w:lineRule="auto"/>
+        <w:jc w:val="both"/>
+        <w:rPr>
+          <w:rFonts w:eastAsia="Calibri"/>
+          <w:lang w:eastAsia="en-US"/>
+        </w:rPr>
+      </w:pPr>
+      <w:r>
+        <w:rPr>
+          <w:rFonts w:eastAsia="Calibri"/>
+          <w:lang w:eastAsia="en-US"/>
+        </w:rPr>
+        <w:t xml:space="preserve">Critério de Aceitação/Métrica: O tempo de resposta para a </w:t>
+      </w:r>
+      <w:proofErr w:type="spellStart"/>
+      <w:r>
+        <w:rPr>
+          <w:rFonts w:eastAsia="Calibri"/>
+          <w:lang w:eastAsia="en-US"/>
+        </w:rPr>
+        <w:t>renderização</w:t>
+      </w:r>
+      <w:proofErr w:type="spellEnd"/>
+      <w:r>
+        <w:rPr>
+          <w:rFonts w:eastAsia="Calibri"/>
+          <w:lang w:eastAsia="en-US"/>
+        </w:rPr>
+        <w:t xml:space="preserve"> do perfil detalhado do cuidador e resultados da busca não deve ultrapassar 2,5 segundos sob condições normais de rede (corrigindo a métrica anterior de 5 segundos, que é </w:t>
+      </w:r>
+      <w:proofErr w:type="gramStart"/>
+      <w:r>
+        <w:rPr>
+          <w:rFonts w:eastAsia="Calibri"/>
+          <w:lang w:eastAsia="en-US"/>
+        </w:rPr>
+        <w:t>muito</w:t>
+      </w:r>
+      <w:proofErr w:type="gramEnd"/>
+      <w:r>
+        <w:rPr>
+          <w:rFonts w:eastAsia="Calibri"/>
+          <w:lang w:eastAsia="en-US"/>
+        </w:rPr>
+        <w:t xml:space="preserve"> </w:t>
+      </w:r>
+      <w:proofErr w:type="gramStart"/>
+      <w:r>
+        <w:rPr>
+          <w:rFonts w:eastAsia="Calibri"/>
+          <w:lang w:eastAsia="en-US"/>
+        </w:rPr>
+        <w:t>alta</w:t>
+      </w:r>
+      <w:proofErr w:type="gramEnd"/>
+      <w:r>
+        <w:rPr>
+          <w:rFonts w:eastAsia="Calibri"/>
+          <w:lang w:eastAsia="en-US"/>
+        </w:rPr>
+        <w:t xml:space="preserve"> para a web moderna)</w:t>
+      </w:r>
+    </w:p>
+    <w:p>
+      <w:pPr>
+        <w:pStyle w:val="Ttulo4"/>
+        <w:rPr>
+          <w:rFonts w:ascii="Times New Roman" w:hAnsi="Times New Roman" w:cs="Times New Roman"/>
+          <w:color w:val="auto"/>
+          <w:sz w:val="24"/>
+          <w:szCs w:val="24"/>
+        </w:rPr>
+      </w:pPr>
+    </w:p>
+    <w:p>
+      <w:pPr>
+        <w:pStyle w:val="Ttulo3"/>
+        <w:rPr>
+          <w:rFonts w:ascii="Times New Roman" w:hAnsi="Times New Roman" w:cs="Times New Roman"/>
+          <w:color w:val="auto"/>
+        </w:rPr>
+      </w:pPr>
+      <w:bookmarkStart w:id="3" w:name="_Toc98916003"/>
+      <w:r>
+        <w:rPr>
+          <w:rFonts w:ascii="Times New Roman" w:hAnsi="Times New Roman" w:cs="Times New Roman"/>
+          <w:color w:val="auto"/>
+        </w:rPr>
+        <w:t>1.4</w:t>
+      </w:r>
+      <w:r>
+        <w:rPr>
+          <w:rFonts w:ascii="Times New Roman" w:hAnsi="Times New Roman" w:cs="Times New Roman"/>
+          <w:color w:val="auto"/>
+        </w:rPr>
+        <w:t xml:space="preserve"> Confiabilidade</w:t>
+      </w:r>
+      <w:bookmarkEnd w:id="3"/>
+    </w:p>
+    <w:p>
+      <w:pPr>
+        <w:rPr>
+          <w:lang w:eastAsia="pt-BR"/>
+        </w:rPr>
+      </w:pPr>
+    </w:p>
+    <w:p>
+      <w:pPr>
+        <w:rPr>
+          <w:rFonts w:ascii="Times New Roman" w:hAnsi="Times New Roman" w:cs="Times New Roman"/>
+          <w:sz w:val="24"/>
+          <w:szCs w:val="24"/>
+        </w:rPr>
+      </w:pPr>
+      <w:r>
+        <w:rPr>
+          <w:rFonts w:ascii="Times New Roman" w:hAnsi="Times New Roman" w:cs="Times New Roman"/>
+          <w:sz w:val="24"/>
+          <w:szCs w:val="24"/>
+        </w:rPr>
+        <w:t>RNF 4</w:t>
+      </w:r>
+      <w:r>
+        <w:rPr>
+          <w:rFonts w:ascii="Times New Roman" w:hAnsi="Times New Roman" w:cs="Times New Roman"/>
+          <w:sz w:val="24"/>
+          <w:szCs w:val="24"/>
+        </w:rPr>
+        <w:t xml:space="preserve"> – </w:t>
+      </w:r>
+      <w:r>
+        <w:t>Confiabilidade</w:t>
+      </w:r>
+    </w:p>
+    <w:p>
+      <w:pPr>
+        <w:pStyle w:val="NormalWeb"/>
+        <w:spacing w:line="360" w:lineRule="auto"/>
+        <w:jc w:val="both"/>
+        <w:rPr>
+          <w:rFonts w:eastAsia="Calibri"/>
+          <w:lang w:eastAsia="en-US"/>
+        </w:rPr>
+      </w:pPr>
+      <w:bookmarkStart w:id="4" w:name="_Toc98916004"/>
+      <w:r>
+        <w:rPr>
+          <w:rFonts w:eastAsia="Calibri"/>
+          <w:lang w:eastAsia="en-US"/>
+        </w:rPr>
+        <w:t xml:space="preserve">Descrição: O sistema deve operar com criptografia ponta a ponta (HTTPS) com certificado SSL válido. </w:t>
+      </w:r>
+      <w:r>
+        <w:rPr>
+          <w:rFonts w:eastAsia="Calibri"/>
+          <w:lang w:eastAsia="en-US"/>
+        </w:rPr>
+        <w:t xml:space="preserve">As senhas de acesso dos usuários de perfil cuidador e responsável devem ser mascaradas e salvas no </w:t>
+      </w:r>
+      <w:proofErr w:type="spellStart"/>
+      <w:proofErr w:type="gramStart"/>
+      <w:r>
+        <w:rPr>
+          <w:rFonts w:eastAsia="Calibri"/>
+          <w:lang w:eastAsia="en-US"/>
+        </w:rPr>
+        <w:t>PostgreSQL</w:t>
+      </w:r>
+      <w:proofErr w:type="spellEnd"/>
+      <w:proofErr w:type="gramEnd"/>
+      <w:r>
+        <w:rPr>
+          <w:rFonts w:eastAsia="Calibri"/>
+          <w:lang w:eastAsia="en-US"/>
+        </w:rPr>
+        <w:t xml:space="preserve"> obrigatoriamente utilizando funções de </w:t>
+      </w:r>
+      <w:proofErr w:type="spellStart"/>
+      <w:r>
+        <w:rPr>
+          <w:rFonts w:eastAsia="Calibri"/>
+          <w:lang w:eastAsia="en-US"/>
+        </w:rPr>
+        <w:t>hash</w:t>
+      </w:r>
+      <w:proofErr w:type="spellEnd"/>
+      <w:r>
+        <w:rPr>
+          <w:rFonts w:eastAsia="Calibri"/>
+          <w:lang w:eastAsia="en-US"/>
+        </w:rPr>
+        <w:t xml:space="preserve"> fortes (como </w:t>
+      </w:r>
+      <w:proofErr w:type="spellStart"/>
+      <w:r>
+        <w:rPr>
+          <w:rFonts w:eastAsia="Calibri"/>
+          <w:lang w:eastAsia="en-US"/>
+        </w:rPr>
+        <w:t>BCrypt</w:t>
+      </w:r>
+      <w:proofErr w:type="spellEnd"/>
+      <w:r>
+        <w:rPr>
+          <w:rFonts w:eastAsia="Calibri"/>
+          <w:lang w:eastAsia="en-US"/>
+        </w:rPr>
+        <w:t>)</w:t>
+      </w:r>
+      <w:r>
+        <w:rPr>
+          <w:rFonts w:eastAsia="Calibri"/>
+          <w:lang w:eastAsia="en-US"/>
+        </w:rPr>
+        <w:t xml:space="preserve">. </w:t>
+      </w:r>
+      <w:r>
+        <w:rPr>
+          <w:rFonts w:eastAsia="Calibri"/>
+          <w:lang w:eastAsia="en-US"/>
+        </w:rPr>
+        <w:t>Mecanismos de timeout devem invalidar a sessão após 30 minutos de inatividade</w:t>
+      </w:r>
+    </w:p>
+    <w:p>
+      <w:pPr>
+        <w:pStyle w:val="NormalWeb"/>
+        <w:spacing w:line="360" w:lineRule="auto"/>
+        <w:jc w:val="both"/>
+        <w:rPr>
+          <w:rFonts w:eastAsia="Calibri"/>
+          <w:lang w:eastAsia="en-US"/>
+        </w:rPr>
+      </w:pPr>
+      <w:r>
+        <w:rPr>
+          <w:rFonts w:eastAsia="Calibri"/>
+          <w:lang w:eastAsia="en-US"/>
+        </w:rPr>
+        <w:t>1.5</w:t>
+      </w:r>
+      <w:r>
+        <w:rPr>
+          <w:rFonts w:eastAsia="Calibri"/>
+          <w:lang w:eastAsia="en-US"/>
+        </w:rPr>
+        <w:t xml:space="preserve"> Portabilidade</w:t>
+      </w:r>
+      <w:bookmarkEnd w:id="4"/>
+    </w:p>
+    <w:p>
+      <w:pPr>
+        <w:rPr>
+          <w:lang w:eastAsia="pt-BR"/>
+        </w:rPr>
+      </w:pPr>
+    </w:p>
+    <w:p>
+      <w:pPr>
+        <w:rPr>
+          <w:rFonts w:ascii="Times New Roman" w:hAnsi="Times New Roman" w:cs="Times New Roman"/>
+          <w:sz w:val="24"/>
+          <w:szCs w:val="24"/>
+        </w:rPr>
+      </w:pPr>
+      <w:r>
+        <w:rPr>
+          <w:rFonts w:ascii="Times New Roman" w:hAnsi="Times New Roman" w:cs="Times New Roman"/>
+          <w:sz w:val="24"/>
+          <w:szCs w:val="24"/>
+        </w:rPr>
+        <w:t>RNF 5</w:t>
+      </w:r>
+      <w:r>
+        <w:rPr>
+          <w:rFonts w:ascii="Times New Roman" w:hAnsi="Times New Roman" w:cs="Times New Roman"/>
+          <w:sz w:val="24"/>
+          <w:szCs w:val="24"/>
+        </w:rPr>
+        <w:t xml:space="preserve"> – Compatibilidade</w:t>
+      </w:r>
+    </w:p>
+    <w:p>
+      <w:pPr>
+        <w:pStyle w:val="NormalWeb"/>
+        <w:spacing w:line="360" w:lineRule="auto"/>
+        <w:jc w:val="both"/>
+        <w:rPr>
+          <w:rFonts w:eastAsia="Calibri"/>
+          <w:lang w:eastAsia="en-US"/>
+        </w:rPr>
+      </w:pPr>
+      <w:r>
+        <w:br/>
+      </w:r>
+      <w:bookmarkStart w:id="5" w:name="_GoBack"/>
+      <w:bookmarkEnd w:id="5"/>
+      <w:r>
+        <w:rPr>
+          <w:rFonts w:eastAsia="Calibri"/>
+          <w:lang w:eastAsia="en-US"/>
+        </w:rPr>
+        <w:t>Descrição: O front-</w:t>
+      </w:r>
+      <w:proofErr w:type="spellStart"/>
+      <w:r>
+        <w:rPr>
+          <w:rFonts w:eastAsia="Calibri"/>
+          <w:lang w:eastAsia="en-US"/>
+        </w:rPr>
+        <w:t>end</w:t>
+      </w:r>
+      <w:proofErr w:type="spellEnd"/>
+      <w:r>
+        <w:rPr>
+          <w:rFonts w:eastAsia="Calibri"/>
+          <w:lang w:eastAsia="en-US"/>
+        </w:rPr>
+        <w:t xml:space="preserve"> da aplicação deve ser desenvolvido utilizando práticas de web design responsivo. </w:t>
+      </w:r>
+      <w:r>
+        <w:rPr>
+          <w:rFonts w:eastAsia="Calibri"/>
+          <w:lang w:eastAsia="en-US"/>
+        </w:rPr>
+        <w:t>O sistema precisa se adaptar fluidamente entre monitores desktop convencionais e telas de smartphones (</w:t>
+      </w:r>
+      <w:proofErr w:type="spellStart"/>
+      <w:r>
+        <w:rPr>
+          <w:rFonts w:eastAsia="Calibri"/>
+          <w:lang w:eastAsia="en-US"/>
+        </w:rPr>
+        <w:t>Android</w:t>
+      </w:r>
+      <w:proofErr w:type="spellEnd"/>
+      <w:r>
+        <w:rPr>
+          <w:rFonts w:eastAsia="Calibri"/>
+          <w:lang w:eastAsia="en-US"/>
+        </w:rPr>
+        <w:t xml:space="preserve"> e </w:t>
+      </w:r>
+      <w:proofErr w:type="spellStart"/>
+      <w:proofErr w:type="gramStart"/>
+      <w:r>
+        <w:rPr>
+          <w:rFonts w:eastAsia="Calibri"/>
+          <w:lang w:eastAsia="en-US"/>
+        </w:rPr>
+        <w:t>iOS</w:t>
+      </w:r>
+      <w:proofErr w:type="spellEnd"/>
+      <w:proofErr w:type="gramEnd"/>
+      <w:r>
+        <w:rPr>
+          <w:rFonts w:eastAsia="Calibri"/>
+          <w:lang w:eastAsia="en-US"/>
+        </w:rPr>
+        <w:t>), uma vez que a análise situacional apontou o uso massivo de celulares pelo público-alvo</w:t>
+      </w:r>
+      <w:r>
+        <w:rPr>
+          <w:rFonts w:eastAsia="Calibri"/>
+          <w:lang w:eastAsia="en-US"/>
+        </w:rPr>
+        <w:t xml:space="preserve">. </w:t>
+      </w:r>
+    </w:p>
+    <w:p>
+      <w:pPr>
+        <w:pStyle w:val="NormalWeb"/>
+        <w:spacing w:line="360" w:lineRule="auto"/>
+        <w:jc w:val="both"/>
+        <w:rPr>
+          <w:rFonts w:eastAsia="Calibri"/>
+          <w:lang w:eastAsia="en-US"/>
+        </w:rPr>
+      </w:pPr>
+      <w:r>
+        <w:rPr>
+          <w:rFonts w:eastAsia="Calibri"/>
+          <w:lang w:eastAsia="en-US"/>
+        </w:rPr>
+        <w:lastRenderedPageBreak/>
+        <w:t xml:space="preserve">Critério de Aceitação/Métrica: Compatibilidade validada e </w:t>
+      </w:r>
+      <w:proofErr w:type="spellStart"/>
+      <w:r>
+        <w:rPr>
+          <w:rFonts w:eastAsia="Calibri"/>
+          <w:lang w:eastAsia="en-US"/>
+        </w:rPr>
+        <w:t>renderização</w:t>
+      </w:r>
+      <w:proofErr w:type="spellEnd"/>
+      <w:r>
+        <w:rPr>
+          <w:rFonts w:eastAsia="Calibri"/>
+          <w:lang w:eastAsia="en-US"/>
+        </w:rPr>
+        <w:t xml:space="preserve"> sem quebras estruturais nas últimas </w:t>
+      </w:r>
+      <w:proofErr w:type="gramStart"/>
+      <w:r>
+        <w:rPr>
+          <w:rFonts w:eastAsia="Calibri"/>
+          <w:lang w:eastAsia="en-US"/>
+        </w:rPr>
+        <w:t>3</w:t>
+      </w:r>
+      <w:proofErr w:type="gramEnd"/>
+      <w:r>
+        <w:rPr>
+          <w:rFonts w:eastAsia="Calibri"/>
+          <w:lang w:eastAsia="en-US"/>
+        </w:rPr>
+        <w:t xml:space="preserve"> versões estáveis dos navegadores Google </w:t>
+      </w:r>
+      <w:proofErr w:type="spellStart"/>
+      <w:r>
+        <w:rPr>
+          <w:rFonts w:eastAsia="Calibri"/>
+          <w:lang w:eastAsia="en-US"/>
+        </w:rPr>
+        <w:t>Chrome</w:t>
+      </w:r>
+      <w:proofErr w:type="spellEnd"/>
+      <w:r>
+        <w:rPr>
+          <w:rFonts w:eastAsia="Calibri"/>
+          <w:lang w:eastAsia="en-US"/>
+        </w:rPr>
+        <w:t>, Mozilla Firefox, Microsoft Edge e Safari.</w:t>
+      </w:r>
+    </w:p>
+    <w:p>
+      <w:pPr>
+        <w:rPr>
+          <w:rFonts w:ascii="Times New Roman" w:hAnsi="Times New Roman" w:cs="Times New Roman"/>
+          <w:sz w:val="24"/>
+          <w:szCs w:val="24"/>
+        </w:rPr>
+      </w:pPr>
+    </w:p>
+    <w:p>
+      <w:pPr>
+        <w:rPr>
+          <w:rFonts w:ascii="Times New Roman" w:hAnsi="Times New Roman" w:cs="Times New Roman"/>
+          <w:sz w:val="24"/>
+          <w:szCs w:val="24"/>
+        </w:rPr>
+      </w:pPr>
+    </w:p>
+    <w:p>
+      <w:pPr>
+        <w:pStyle w:val="Ttulo2"/>
+        <w:rPr>
+          <w:rFonts w:ascii="Times New Roman" w:hAnsi="Times New Roman" w:cs="Times New Roman"/>
+          <w:b/>
+          <w:color w:val="auto"/>
+          <w:sz w:val="24"/>
+          <w:szCs w:val="24"/>
+        </w:rPr>
+      </w:pPr>
+      <w:bookmarkStart w:id="6" w:name="_Toc98916005"/>
+      <w:r>
+        <w:rPr>
+          <w:rFonts w:ascii="Times New Roman" w:hAnsi="Times New Roman" w:cs="Times New Roman"/>
+          <w:b/>
+          <w:color w:val="auto"/>
+          <w:sz w:val="24"/>
+          <w:szCs w:val="24"/>
+        </w:rPr>
+        <w:t xml:space="preserve">2. </w:t>
+      </w:r>
+      <w:r>
+        <w:rPr>
+          <w:rFonts w:ascii="Times New Roman" w:hAnsi="Times New Roman" w:cs="Times New Roman"/>
+          <w:b/>
+          <w:color w:val="auto"/>
+          <w:sz w:val="24"/>
+          <w:szCs w:val="24"/>
+        </w:rPr>
+        <w:t>Organizacional</w:t>
+      </w:r>
+      <w:bookmarkEnd w:id="6"/>
+    </w:p>
+    <w:p>
+      <w:pPr>
+        <w:pStyle w:val="Ttulo4"/>
+        <w:rPr>
+          <w:rFonts w:ascii="Times New Roman" w:hAnsi="Times New Roman" w:cs="Times New Roman"/>
+          <w:color w:val="auto"/>
+          <w:sz w:val="24"/>
+          <w:szCs w:val="24"/>
+        </w:rPr>
+      </w:pPr>
+    </w:p>
+    <w:p>
+      <w:pPr>
+        <w:pStyle w:val="Ttulo3"/>
+        <w:rPr>
+          <w:rFonts w:ascii="Times New Roman" w:hAnsi="Times New Roman" w:cs="Times New Roman"/>
+          <w:color w:val="auto"/>
+        </w:rPr>
+      </w:pPr>
+      <w:bookmarkStart w:id="7" w:name="_Toc98916006"/>
+      <w:r>
+        <w:rPr>
+          <w:rFonts w:ascii="Times New Roman" w:hAnsi="Times New Roman" w:cs="Times New Roman"/>
+          <w:color w:val="auto"/>
+        </w:rPr>
+        <w:t>2.1 Entrega</w:t>
+      </w:r>
+      <w:bookmarkEnd w:id="7"/>
+      <w:proofErr w:type="gramStart"/>
+      <w:r>
+        <w:rPr>
+          <w:rFonts w:ascii="Times New Roman" w:hAnsi="Times New Roman" w:cs="Times New Roman"/>
+          <w:color w:val="auto"/>
+        </w:rPr>
+        <w:t xml:space="preserve">  </w:t>
+      </w:r>
+    </w:p>
+    <w:p>
+      <w:pPr>
+        <w:rPr>
+          <w:lang w:eastAsia="pt-BR"/>
+        </w:rPr>
+      </w:pPr>
+      <w:proofErr w:type="gramEnd"/>
+    </w:p>
+    <w:p>
+      <w:pPr>
+        <w:rPr>
+          <w:rFonts w:ascii="Times New Roman" w:hAnsi="Times New Roman" w:cs="Times New Roman"/>
+          <w:sz w:val="24"/>
+          <w:szCs w:val="24"/>
+        </w:rPr>
+      </w:pPr>
+      <w:r>
+        <w:rPr>
+          <w:rFonts w:ascii="Times New Roman" w:hAnsi="Times New Roman" w:cs="Times New Roman"/>
+          <w:sz w:val="24"/>
+          <w:szCs w:val="24"/>
+        </w:rPr>
+        <w:t>O sistema deverá ser entregue em versão web funcional até o final do semestre.</w:t>
+      </w:r>
+    </w:p>
+    <w:p>
+      <w:pPr>
+        <w:pStyle w:val="Ttulo3"/>
+        <w:rPr>
+          <w:rFonts w:ascii="Times New Roman" w:hAnsi="Times New Roman" w:cs="Times New Roman"/>
+          <w:color w:val="auto"/>
+        </w:rPr>
+      </w:pPr>
+      <w:bookmarkStart w:id="8" w:name="_Toc98916007"/>
+      <w:r>
+        <w:rPr>
+          <w:rFonts w:ascii="Times New Roman" w:hAnsi="Times New Roman" w:cs="Times New Roman"/>
+          <w:color w:val="auto"/>
+        </w:rPr>
+        <w:t xml:space="preserve">2.2 </w:t>
+      </w:r>
+      <w:proofErr w:type="gramStart"/>
+      <w:r>
+        <w:rPr>
+          <w:rFonts w:ascii="Times New Roman" w:hAnsi="Times New Roman" w:cs="Times New Roman"/>
+          <w:color w:val="auto"/>
+        </w:rPr>
+        <w:t>Implementação</w:t>
+      </w:r>
+      <w:bookmarkEnd w:id="8"/>
+      <w:proofErr w:type="gramEnd"/>
+    </w:p>
+    <w:p>
+      <w:pPr>
+        <w:rPr>
+          <w:lang w:eastAsia="pt-BR"/>
+        </w:rPr>
+      </w:pPr>
+    </w:p>
+    <w:p>
+      <w:pPr>
+        <w:rPr>
+          <w:rFonts w:ascii="Times New Roman" w:hAnsi="Times New Roman" w:cs="Times New Roman"/>
+          <w:sz w:val="24"/>
+          <w:szCs w:val="24"/>
+        </w:rPr>
+      </w:pPr>
+      <w:r>
+        <w:rPr>
+          <w:rFonts w:ascii="Times New Roman" w:hAnsi="Times New Roman" w:cs="Times New Roman"/>
+          <w:sz w:val="24"/>
+          <w:szCs w:val="24"/>
+        </w:rPr>
+        <w:t>O sistema será desenvolvido utilizando</w:t>
+      </w:r>
+      <w:r>
+        <w:t xml:space="preserve"> </w:t>
+      </w:r>
+      <w:r>
+        <w:rPr>
+          <w:rFonts w:ascii="Times New Roman" w:hAnsi="Times New Roman" w:cs="Times New Roman"/>
+          <w:sz w:val="24"/>
+          <w:szCs w:val="24"/>
+        </w:rPr>
+        <w:t>Java (</w:t>
+      </w:r>
+      <w:proofErr w:type="spellStart"/>
+      <w:r>
+        <w:rPr>
+          <w:rFonts w:ascii="Times New Roman" w:hAnsi="Times New Roman" w:cs="Times New Roman"/>
+          <w:sz w:val="24"/>
+          <w:szCs w:val="24"/>
+        </w:rPr>
+        <w:t>backend</w:t>
+      </w:r>
+      <w:proofErr w:type="spellEnd"/>
+      <w:r>
+        <w:rPr>
+          <w:rFonts w:ascii="Times New Roman" w:hAnsi="Times New Roman" w:cs="Times New Roman"/>
+          <w:sz w:val="24"/>
+          <w:szCs w:val="24"/>
+        </w:rPr>
+        <w:t xml:space="preserve">) e </w:t>
+      </w:r>
+      <w:proofErr w:type="spellStart"/>
+      <w:proofErr w:type="gramStart"/>
+      <w:r>
+        <w:rPr>
+          <w:rFonts w:ascii="Times New Roman" w:hAnsi="Times New Roman" w:cs="Times New Roman"/>
+          <w:sz w:val="24"/>
+          <w:szCs w:val="24"/>
+        </w:rPr>
+        <w:t>PostgreSQL</w:t>
+      </w:r>
+      <w:proofErr w:type="spellEnd"/>
+      <w:proofErr w:type="gramEnd"/>
+      <w:r>
+        <w:rPr>
           <w:rFonts w:ascii="Times New Roman" w:hAnsi="Times New Roman" w:cs="Times New Roman"/>
           <w:sz w:val="24"/>
           <w:szCs w:val="24"/>
         </w:rPr>
         <w:t xml:space="preserve"> (banco de dados)</w:t>
       </w:r>
-      <w:bookmarkStart w:id="8" w:name="_GoBack"/>
-      <w:bookmarkEnd w:id="8"/>
       <w:r>
         <w:rPr>
           <w:rFonts w:ascii="Times New Roman" w:hAnsi="Times New Roman" w:cs="Times New Roman"/>
@@ -1529,7 +1910,7 @@
         <w:sz w:val="20"/>
         <w:szCs w:val="20"/>
       </w:rPr>
-      <w:t>3</w:t>
+      <w:t>4</w:t>
     </w:r>
     <w:r>
       <w:rPr>
@@ -2033,6 +2414,81 @@
       <w:bCs/>
     </w:rPr>
   </w:style>
+  <w:style w:type="paragraph" w:styleId="NormalWeb">
+    <w:name w:val="Normal (Web)"/>
+    <w:basedOn w:val="Normal"/>
+    <w:uiPriority w:val="99"/>
+    <w:semiHidden/>
+    <w:unhideWhenUsed/>
+    <w:rsid w:val="00C10343"/>
+    <w:pPr>
+      <w:spacing w:before="100" w:beforeAutospacing="1" w:after="100" w:afterAutospacing="1" w:line="240" w:lineRule="auto"/>
+    </w:pPr>
+    <w:rPr>
+      <w:rFonts w:ascii="Times New Roman" w:eastAsia="Times New Roman" w:hAnsi="Times New Roman" w:cs="Times New Roman"/>
+      <w:sz w:val="24"/>
+      <w:szCs w:val="24"/>
+      <w:lang w:eastAsia="pt-BR"/>
+    </w:rPr>
+  </w:style>
+  <w:style w:type="character" w:customStyle="1" w:styleId="citation-160">
+    <w:name w:val="citation-160"/>
+    <w:basedOn w:val="Fontepargpadro"/>
+    <w:rsid w:val="00C10343"/>
+  </w:style>
+  <w:style w:type="character" w:customStyle="1" w:styleId="citation-159">
+    <w:name w:val="citation-159"/>
+    <w:basedOn w:val="Fontepargpadro"/>
+    <w:rsid w:val="00C10343"/>
+  </w:style>
+  <w:style w:type="character" w:styleId="CdigoHTML">
+    <w:name w:val="HTML Code"/>
+    <w:basedOn w:val="Fontepargpadro"/>
+    <w:uiPriority w:val="99"/>
+    <w:semiHidden/>
+    <w:unhideWhenUsed/>
+    <w:rsid w:val="00C10343"/>
+    <w:rPr>
+      <w:rFonts w:ascii="Courier New" w:eastAsia="Times New Roman" w:hAnsi="Courier New" w:cs="Courier New"/>
+      <w:sz w:val="20"/>
+      <w:szCs w:val="20"/>
+    </w:rPr>
+  </w:style>
+  <w:style w:type="character" w:customStyle="1" w:styleId="citation-158">
+    <w:name w:val="citation-158"/>
+    <w:basedOn w:val="Fontepargpadro"/>
+    <w:rsid w:val="00C10343"/>
+  </w:style>
+  <w:style w:type="character" w:customStyle="1" w:styleId="citation-157">
+    <w:name w:val="citation-157"/>
+    <w:basedOn w:val="Fontepargpadro"/>
+    <w:rsid w:val="00C10343"/>
+  </w:style>
+  <w:style w:type="character" w:customStyle="1" w:styleId="citation-156">
+    <w:name w:val="citation-156"/>
+    <w:basedOn w:val="Fontepargpadro"/>
+    <w:rsid w:val="00C10343"/>
+  </w:style>
+  <w:style w:type="character" w:customStyle="1" w:styleId="citation-155">
+    <w:name w:val="citation-155"/>
+    <w:basedOn w:val="Fontepargpadro"/>
+    <w:rsid w:val="00C10343"/>
+  </w:style>
+  <w:style w:type="character" w:customStyle="1" w:styleId="citation-154">
+    <w:name w:val="citation-154"/>
+    <w:basedOn w:val="Fontepargpadro"/>
+    <w:rsid w:val="00C10343"/>
+  </w:style>
+  <w:style w:type="character" w:customStyle="1" w:styleId="citation-153">
+    <w:name w:val="citation-153"/>
+    <w:basedOn w:val="Fontepargpadro"/>
+    <w:rsid w:val="00C10343"/>
+  </w:style>
+  <w:style w:type="character" w:customStyle="1" w:styleId="citation-151">
+    <w:name w:val="citation-151"/>
+    <w:basedOn w:val="Fontepargpadro"/>
+    <w:rsid w:val="00C10343"/>
+  </w:style>
 </w:styles>
 </file>
 
@@ -2454,6 +2910,81 @@
       <w:b/>
       <w:bCs/>
     </w:rPr>
+  </w:style>
+  <w:style w:type="paragraph" w:styleId="NormalWeb">
+    <w:name w:val="Normal (Web)"/>
+    <w:basedOn w:val="Normal"/>
+    <w:uiPriority w:val="99"/>
+    <w:semiHidden/>
+    <w:unhideWhenUsed/>
+    <w:rsid w:val="00C10343"/>
+    <w:pPr>
+      <w:spacing w:before="100" w:beforeAutospacing="1" w:after="100" w:afterAutospacing="1" w:line="240" w:lineRule="auto"/>
+    </w:pPr>
+    <w:rPr>
+      <w:rFonts w:ascii="Times New Roman" w:eastAsia="Times New Roman" w:hAnsi="Times New Roman" w:cs="Times New Roman"/>
+      <w:sz w:val="24"/>
+      <w:szCs w:val="24"/>
+      <w:lang w:eastAsia="pt-BR"/>
+    </w:rPr>
+  </w:style>
+  <w:style w:type="character" w:customStyle="1" w:styleId="citation-160">
+    <w:name w:val="citation-160"/>
+    <w:basedOn w:val="Fontepargpadro"/>
+    <w:rsid w:val="00C10343"/>
+  </w:style>
+  <w:style w:type="character" w:customStyle="1" w:styleId="citation-159">
+    <w:name w:val="citation-159"/>
+    <w:basedOn w:val="Fontepargpadro"/>
+    <w:rsid w:val="00C10343"/>
+  </w:style>
+  <w:style w:type="character" w:styleId="CdigoHTML">
+    <w:name w:val="HTML Code"/>
+    <w:basedOn w:val="Fontepargpadro"/>
+    <w:uiPriority w:val="99"/>
+    <w:semiHidden/>
+    <w:unhideWhenUsed/>
+    <w:rsid w:val="00C10343"/>
+    <w:rPr>
+      <w:rFonts w:ascii="Courier New" w:eastAsia="Times New Roman" w:hAnsi="Courier New" w:cs="Courier New"/>
+      <w:sz w:val="20"/>
+      <w:szCs w:val="20"/>
+    </w:rPr>
+  </w:style>
+  <w:style w:type="character" w:customStyle="1" w:styleId="citation-158">
+    <w:name w:val="citation-158"/>
+    <w:basedOn w:val="Fontepargpadro"/>
+    <w:rsid w:val="00C10343"/>
+  </w:style>
+  <w:style w:type="character" w:customStyle="1" w:styleId="citation-157">
+    <w:name w:val="citation-157"/>
+    <w:basedOn w:val="Fontepargpadro"/>
+    <w:rsid w:val="00C10343"/>
+  </w:style>
+  <w:style w:type="character" w:customStyle="1" w:styleId="citation-156">
+    <w:name w:val="citation-156"/>
+    <w:basedOn w:val="Fontepargpadro"/>
+    <w:rsid w:val="00C10343"/>
+  </w:style>
+  <w:style w:type="character" w:customStyle="1" w:styleId="citation-155">
+    <w:name w:val="citation-155"/>
+    <w:basedOn w:val="Fontepargpadro"/>
+    <w:rsid w:val="00C10343"/>
+  </w:style>
+  <w:style w:type="character" w:customStyle="1" w:styleId="citation-154">
+    <w:name w:val="citation-154"/>
+    <w:basedOn w:val="Fontepargpadro"/>
+    <w:rsid w:val="00C10343"/>
+  </w:style>
+  <w:style w:type="character" w:customStyle="1" w:styleId="citation-153">
+    <w:name w:val="citation-153"/>
+    <w:basedOn w:val="Fontepargpadro"/>
+    <w:rsid w:val="00C10343"/>
+  </w:style>
+  <w:style w:type="character" w:customStyle="1" w:styleId="citation-151">
+    <w:name w:val="citation-151"/>
+    <w:basedOn w:val="Fontepargpadro"/>
+    <w:rsid w:val="00C10343"/>
   </w:style>
 </w:styles>
 </file>
@@ -2713,7 +3244,7 @@
   <a:extraClrSchemeLst/>
   <a:extLst>
     <a:ext uri="{05A4C25C-085E-4340-85A3-A5531E510DB2}">
-      <thm15:themeFamily xmlns="" xmlns:thm15="http://schemas.microsoft.com/office/thememl/2012/main" name="Office Theme" id="{62F939B6-93AF-4DB8-9C6B-D6C7DFDC589F}" vid="{4A3C46E8-61CC-4603-A589-7422A47A8E4A}"/>
+      <thm15:themeFamily xmlns:thm15="http://schemas.microsoft.com/office/thememl/2012/main" xmlns="" name="Office Theme" id="{62F939B6-93AF-4DB8-9C6B-D6C7DFDC589F}" vid="{4A3C46E8-61CC-4603-A589-7422A47A8E4A}"/>
     </a:ext>
   </a:extLst>
 </a:theme>

</xml_diff>